<commit_message>
20251204 Bisection method revised
</commit_message>
<xml_diff>
--- a/Analysis/alternative stable state (已自動回復).docx
+++ b/Analysis/alternative stable state (已自動回復).docx
@@ -1543,474 +1543,16 @@
           </wp:inline>
         </w:drawing>
       </w:r>
-    </w:p>
-    <w:p>
-      <w:pPr>
-        <w:rPr>
-          <w:color w:val="5B9BD5" w:themeColor="accent5"/>
-        </w:rPr>
-      </w:pPr>
-    </w:p>
-    <w:p>
-      <w:r>
-        <w:t>Simulation outcomes prove that</w:t>
-      </w:r>
-      <w:r>
-        <w:t xml:space="preserve"> </w:t>
-      </w:r>
-      <m:oMath>
-        <m:sSub>
-          <m:sSubPr>
-            <m:ctrlPr>
-              <w:rPr>
-                <w:rFonts w:ascii="Cambria Math" w:hAnsi="Cambria Math"/>
-              </w:rPr>
-            </m:ctrlPr>
-          </m:sSubPr>
-          <m:e>
-            <m:r>
-              <w:rPr>
-                <w:rFonts w:ascii="Cambria Math" w:hAnsi="Cambria Math"/>
-              </w:rPr>
-              <m:t>P</m:t>
-            </m:r>
-          </m:e>
-          <m:sub>
-            <m:r>
-              <m:rPr>
-                <m:sty m:val="p"/>
-              </m:rPr>
-              <w:rPr>
-                <w:rFonts w:ascii="Cambria Math" w:hAnsi="Cambria Math"/>
-              </w:rPr>
-              <m:t>1</m:t>
-            </m:r>
-          </m:sub>
-        </m:sSub>
-        <m:r>
-          <m:rPr>
-            <m:sty m:val="p"/>
-          </m:rPr>
-          <w:rPr>
-            <w:rFonts w:ascii="Cambria Math" w:hAnsi="Cambria Math"/>
-          </w:rPr>
-          <m:t>+</m:t>
-        </m:r>
-        <m:sSub>
-          <m:sSubPr>
-            <m:ctrlPr>
-              <w:rPr>
-                <w:rFonts w:ascii="Cambria Math" w:hAnsi="Cambria Math"/>
-              </w:rPr>
-            </m:ctrlPr>
-          </m:sSubPr>
-          <m:e>
-            <m:r>
-              <w:rPr>
-                <w:rFonts w:ascii="Cambria Math" w:hAnsi="Cambria Math"/>
-              </w:rPr>
-              <m:t>P</m:t>
-            </m:r>
-          </m:e>
-          <m:sub>
-            <m:r>
-              <m:rPr>
-                <m:sty m:val="p"/>
-              </m:rPr>
-              <w:rPr>
-                <w:rFonts w:ascii="Cambria Math" w:hAnsi="Cambria Math"/>
-              </w:rPr>
-              <m:t>1</m:t>
-            </m:r>
-            <m:r>
-              <m:rPr>
-                <m:lit/>
-                <m:sty m:val="p"/>
-              </m:rPr>
-              <w:rPr>
-                <w:rFonts w:ascii="Cambria Math" w:hAnsi="Cambria Math"/>
-              </w:rPr>
-              <m:t>/</m:t>
-            </m:r>
-            <m:r>
-              <w:rPr>
-                <w:rFonts w:ascii="Cambria Math" w:hAnsi="Cambria Math"/>
-              </w:rPr>
-              <m:t>H</m:t>
-            </m:r>
-          </m:sub>
-        </m:sSub>
-      </m:oMath>
-      <w:r>
-        <w:rPr>
-          <w:rFonts w:hint="eastAsia"/>
-        </w:rPr>
-        <w:t xml:space="preserve"> </w:t>
-      </w:r>
-      <w:r>
-        <w:t>win</w:t>
-      </w:r>
-      <w:r>
-        <w:t xml:space="preserve"> equilibrium</w:t>
-      </w:r>
-      <w:r>
-        <w:t xml:space="preserve"> (H = 0.7258128, P1H = 0.3909225, P1 = 2.2271095, S = 0.8368879) is stable.</w:t>
-      </w:r>
-      <w:r>
-        <w:t xml:space="preserve"> When increasing in initial abundance of </w:t>
-      </w:r>
-      <m:oMath>
-        <m:sSub>
-          <m:sSubPr>
-            <m:ctrlPr>
-              <w:rPr>
-                <w:rFonts w:ascii="Cambria Math" w:hAnsi="Cambria Math"/>
-              </w:rPr>
-            </m:ctrlPr>
-          </m:sSubPr>
-          <m:e>
-            <m:r>
-              <w:rPr>
-                <w:rFonts w:ascii="Cambria Math" w:hAnsi="Cambria Math"/>
-              </w:rPr>
-              <m:t>P</m:t>
-            </m:r>
-          </m:e>
-          <m:sub>
-            <m:r>
-              <m:rPr>
-                <m:sty m:val="p"/>
-              </m:rPr>
-              <w:rPr>
-                <w:rFonts w:ascii="Cambria Math" w:hAnsi="Cambria Math"/>
-              </w:rPr>
-              <m:t>2</m:t>
-            </m:r>
-          </m:sub>
-        </m:sSub>
-      </m:oMath>
-      <w:r>
-        <w:t xml:space="preserve">, the equilibrium will shift to the </w:t>
-      </w:r>
-      <m:oMath>
-        <m:sSub>
-          <m:sSubPr>
-            <m:ctrlPr>
-              <w:rPr>
-                <w:rFonts w:ascii="Cambria Math" w:hAnsi="Cambria Math"/>
-              </w:rPr>
-            </m:ctrlPr>
-          </m:sSubPr>
-          <m:e>
-            <m:r>
-              <w:rPr>
-                <w:rFonts w:ascii="Cambria Math" w:hAnsi="Cambria Math"/>
-              </w:rPr>
-              <m:t>P</m:t>
-            </m:r>
-          </m:e>
-          <m:sub>
-            <m:r>
-              <m:rPr>
-                <m:sty m:val="p"/>
-              </m:rPr>
-              <w:rPr>
-                <w:rFonts w:ascii="Cambria Math" w:hAnsi="Cambria Math"/>
-              </w:rPr>
-              <m:t>2</m:t>
-            </m:r>
-          </m:sub>
-        </m:sSub>
-        <m:r>
-          <m:rPr>
-            <m:sty m:val="p"/>
-          </m:rPr>
-          <w:rPr>
-            <w:rFonts w:ascii="Cambria Math" w:hAnsi="Cambria Math"/>
-          </w:rPr>
-          <m:t>+</m:t>
-        </m:r>
-        <m:sSub>
-          <m:sSubPr>
-            <m:ctrlPr>
-              <w:rPr>
-                <w:rFonts w:ascii="Cambria Math" w:hAnsi="Cambria Math"/>
-              </w:rPr>
-            </m:ctrlPr>
-          </m:sSubPr>
-          <m:e>
-            <m:r>
-              <w:rPr>
-                <w:rFonts w:ascii="Cambria Math" w:hAnsi="Cambria Math"/>
-              </w:rPr>
-              <m:t>P</m:t>
-            </m:r>
-          </m:e>
-          <m:sub>
-            <m:r>
-              <m:rPr>
-                <m:sty m:val="p"/>
-              </m:rPr>
-              <w:rPr>
-                <w:rFonts w:ascii="Cambria Math" w:hAnsi="Cambria Math"/>
-              </w:rPr>
-              <m:t>2</m:t>
-            </m:r>
-            <m:r>
-              <m:rPr>
-                <m:lit/>
-                <m:sty m:val="p"/>
-              </m:rPr>
-              <w:rPr>
-                <w:rFonts w:ascii="Cambria Math" w:hAnsi="Cambria Math"/>
-              </w:rPr>
-              <m:t>/</m:t>
-            </m:r>
-            <m:r>
-              <w:rPr>
-                <w:rFonts w:ascii="Cambria Math" w:hAnsi="Cambria Math"/>
-              </w:rPr>
-              <m:t>H</m:t>
-            </m:r>
-          </m:sub>
-        </m:sSub>
-      </m:oMath>
-      <w:r>
-        <w:rPr>
-          <w:rFonts w:hint="eastAsia"/>
-        </w:rPr>
-        <w:t xml:space="preserve"> </w:t>
-      </w:r>
-      <w:r>
-        <w:t>win</w:t>
-      </w:r>
-      <w:r>
-        <w:t xml:space="preserve"> equilibrium (</w:t>
-      </w:r>
-      <w:r>
-        <w:t>H = 2.5047725, P2H = 0.9499769, P2 = 0.6750948, S = 1.8746412</w:t>
-      </w:r>
-      <w:r>
-        <w:t>).</w:t>
-      </w:r>
-    </w:p>
-    <w:p>
-      <w:pPr>
-        <w:rPr>
-          <w:color w:val="5B9BD5" w:themeColor="accent5"/>
-        </w:rPr>
-      </w:pPr>
-    </w:p>
-    <w:p>
-      <w:pPr>
-        <w:rPr>
-          <w:color w:val="5B9BD5" w:themeColor="accent5"/>
-        </w:rPr>
-      </w:pPr>
-      <w:r>
-        <w:rPr>
-          <w:rFonts w:hint="eastAsia"/>
-          <w:color w:val="5B9BD5" w:themeColor="accent5"/>
-        </w:rPr>
-        <w:t>W</w:t>
-      </w:r>
-      <w:r>
-        <w:rPr>
-          <w:color w:val="5B9BD5" w:themeColor="accent5"/>
-        </w:rPr>
-        <w:t xml:space="preserve">hen </w:t>
-      </w:r>
-      <m:oMath>
-        <m:sSub>
-          <m:sSubPr>
-            <m:ctrlPr>
-              <w:rPr>
-                <w:rFonts w:ascii="Cambria Math" w:hAnsi="Cambria Math"/>
-                <w:color w:val="5B9BD5" w:themeColor="accent5"/>
-              </w:rPr>
-            </m:ctrlPr>
-          </m:sSubPr>
-          <m:e>
-            <m:r>
-              <w:rPr>
-                <w:rFonts w:ascii="Cambria Math" w:hAnsi="Cambria Math"/>
-                <w:color w:val="5B9BD5" w:themeColor="accent5"/>
-              </w:rPr>
-              <m:t>P</m:t>
-            </m:r>
-          </m:e>
-          <m:sub>
-            <m:r>
-              <m:rPr>
-                <m:sty m:val="p"/>
-              </m:rPr>
-              <w:rPr>
-                <w:rFonts w:ascii="Cambria Math" w:hAnsi="Cambria Math"/>
-                <w:color w:val="5B9BD5" w:themeColor="accent5"/>
-              </w:rPr>
-              <m:t>2</m:t>
-            </m:r>
-          </m:sub>
-        </m:sSub>
-        <m:r>
-          <m:rPr>
-            <m:sty m:val="p"/>
-          </m:rPr>
-          <w:rPr>
-            <w:rFonts w:ascii="Cambria Math" w:hAnsi="Cambria Math"/>
-            <w:color w:val="5B9BD5" w:themeColor="accent5"/>
-          </w:rPr>
-          <m:t>+</m:t>
-        </m:r>
-        <m:sSub>
-          <m:sSubPr>
-            <m:ctrlPr>
-              <w:rPr>
-                <w:rFonts w:ascii="Cambria Math" w:hAnsi="Cambria Math"/>
-                <w:color w:val="5B9BD5" w:themeColor="accent5"/>
-              </w:rPr>
-            </m:ctrlPr>
-          </m:sSubPr>
-          <m:e>
-            <m:r>
-              <w:rPr>
-                <w:rFonts w:ascii="Cambria Math" w:hAnsi="Cambria Math"/>
-                <w:color w:val="5B9BD5" w:themeColor="accent5"/>
-              </w:rPr>
-              <m:t>P</m:t>
-            </m:r>
-          </m:e>
-          <m:sub>
-            <m:r>
-              <m:rPr>
-                <m:sty m:val="p"/>
-              </m:rPr>
-              <w:rPr>
-                <w:rFonts w:ascii="Cambria Math" w:hAnsi="Cambria Math"/>
-                <w:color w:val="5B9BD5" w:themeColor="accent5"/>
-              </w:rPr>
-              <m:t>2</m:t>
-            </m:r>
-            <m:r>
-              <m:rPr>
-                <m:lit/>
-                <m:sty m:val="p"/>
-              </m:rPr>
-              <w:rPr>
-                <w:rFonts w:ascii="Cambria Math" w:hAnsi="Cambria Math"/>
-                <w:color w:val="5B9BD5" w:themeColor="accent5"/>
-              </w:rPr>
-              <m:t>/</m:t>
-            </m:r>
-            <m:r>
-              <w:rPr>
-                <w:rFonts w:ascii="Cambria Math" w:hAnsi="Cambria Math"/>
-                <w:color w:val="5B9BD5" w:themeColor="accent5"/>
-              </w:rPr>
-              <m:t>H</m:t>
-            </m:r>
-          </m:sub>
-        </m:sSub>
-      </m:oMath>
-      <w:r>
-        <w:rPr>
-          <w:rFonts w:hint="eastAsia"/>
-          <w:color w:val="5B9BD5" w:themeColor="accent5"/>
-        </w:rPr>
-        <w:t xml:space="preserve"> </w:t>
-      </w:r>
-      <w:r>
-        <w:rPr>
-          <w:color w:val="5B9BD5" w:themeColor="accent5"/>
-        </w:rPr>
-        <w:t>win,</w:t>
-      </w:r>
-    </w:p>
-    <w:p>
-      <w:pPr>
-        <w:rPr>
-          <w:color w:val="5B9BD5" w:themeColor="accent5"/>
-        </w:rPr>
-      </w:pPr>
-      <w:r>
-        <w:rPr>
-          <w:color w:val="5B9BD5" w:themeColor="accent5"/>
-        </w:rPr>
-        <w:t>H =</w:t>
-      </w:r>
-      <w:r>
-        <w:rPr>
-          <w:color w:val="5B9BD5" w:themeColor="accent5"/>
-        </w:rPr>
-        <w:t xml:space="preserve"> </w:t>
-      </w:r>
-      <w:r>
-        <w:rPr>
-          <w:color w:val="5B9BD5" w:themeColor="accent5"/>
-        </w:rPr>
-        <w:t>2.5047725</w:t>
-      </w:r>
-      <w:r>
-        <w:rPr>
-          <w:color w:val="5B9BD5" w:themeColor="accent5"/>
-        </w:rPr>
-        <w:t>, P2H =</w:t>
-      </w:r>
-      <w:r>
-        <w:rPr>
-          <w:color w:val="5B9BD5" w:themeColor="accent5"/>
-        </w:rPr>
-        <w:t xml:space="preserve"> </w:t>
-      </w:r>
-      <w:r>
-        <w:rPr>
-          <w:color w:val="5B9BD5" w:themeColor="accent5"/>
-        </w:rPr>
-        <w:t>0.9499769</w:t>
-      </w:r>
-      <w:r>
-        <w:rPr>
-          <w:color w:val="5B9BD5" w:themeColor="accent5"/>
-        </w:rPr>
-        <w:t xml:space="preserve">, P2 = </w:t>
-      </w:r>
-      <w:r>
-        <w:rPr>
-          <w:color w:val="5B9BD5" w:themeColor="accent5"/>
-        </w:rPr>
-        <w:t>0.6750948</w:t>
-      </w:r>
-      <w:r>
-        <w:rPr>
-          <w:color w:val="5B9BD5" w:themeColor="accent5"/>
-        </w:rPr>
-        <w:t xml:space="preserve">, S = </w:t>
-      </w:r>
-      <w:r>
-        <w:rPr>
-          <w:color w:val="5B9BD5" w:themeColor="accent5"/>
-        </w:rPr>
-        <w:t>1.8746412</w:t>
-      </w:r>
-      <w:r>
-        <w:rPr>
-          <w:color w:val="5B9BD5" w:themeColor="accent5"/>
-        </w:rPr>
-        <w:t>.</w:t>
-      </w:r>
-    </w:p>
-    <w:p>
       <w:r>
         <w:rPr>
           <w:noProof/>
           <w:color w:val="5B9BD5" w:themeColor="accent5"/>
         </w:rPr>
-        <w:lastRenderedPageBreak/>
         <w:drawing>
-          <wp:inline distT="0" distB="0" distL="0" distR="0" wp14:anchorId="6C0FAAC7" wp14:editId="30178BCE">
-            <wp:extent cx="3076744" cy="2520000"/>
-            <wp:effectExtent l="0" t="0" r="0" b="0"/>
-            <wp:docPr id="21" name="圖片 21"/>
+          <wp:inline distT="0" distB="0" distL="0" distR="0" wp14:anchorId="619C93CF">
+            <wp:extent cx="3018049" cy="2431655"/>
+            <wp:effectExtent l="0" t="0" r="0" b="6985"/>
+            <wp:docPr id="47" name="圖片 47"/>
             <wp:cNvGraphicFramePr>
               <a:graphicFrameLocks xmlns:a="http://schemas.openxmlformats.org/drawingml/2006/main" noChangeAspect="1"/>
             </wp:cNvGraphicFramePr>
@@ -2018,7 +1560,7 @@
               <a:graphicData uri="http://schemas.openxmlformats.org/drawingml/2006/picture">
                 <pic:pic xmlns:pic="http://schemas.openxmlformats.org/drawingml/2006/picture">
                   <pic:nvPicPr>
-                    <pic:cNvPr id="0" name="Picture 2"/>
+                    <pic:cNvPr id="0" name="Picture 6"/>
                     <pic:cNvPicPr>
                       <a:picLocks noChangeAspect="1" noChangeArrowheads="1"/>
                     </pic:cNvPicPr>
@@ -2039,7 +1581,7 @@
                   <pic:spPr bwMode="auto">
                     <a:xfrm>
                       <a:off x="0" y="0"/>
-                      <a:ext cx="3076744" cy="2520000"/>
+                      <a:ext cx="3058341" cy="2464118"/>
                     </a:xfrm>
                     <a:prstGeom prst="rect">
                       <a:avLst/>
@@ -2052,16 +1594,473 @@
           </wp:inline>
         </w:drawing>
       </w:r>
+    </w:p>
+    <w:p>
+      <w:pPr>
+        <w:rPr>
+          <w:color w:val="5B9BD5" w:themeColor="accent5"/>
+        </w:rPr>
+      </w:pPr>
+    </w:p>
+    <w:p>
+      <w:r>
+        <w:t>Simulation outcomes prove that</w:t>
+      </w:r>
+      <w:r>
+        <w:t xml:space="preserve"> </w:t>
+      </w:r>
+      <m:oMath>
+        <m:sSub>
+          <m:sSubPr>
+            <m:ctrlPr>
+              <w:rPr>
+                <w:rFonts w:ascii="Cambria Math" w:hAnsi="Cambria Math"/>
+              </w:rPr>
+            </m:ctrlPr>
+          </m:sSubPr>
+          <m:e>
+            <m:r>
+              <w:rPr>
+                <w:rFonts w:ascii="Cambria Math" w:hAnsi="Cambria Math"/>
+              </w:rPr>
+              <m:t>P</m:t>
+            </m:r>
+          </m:e>
+          <m:sub>
+            <m:r>
+              <m:rPr>
+                <m:sty m:val="p"/>
+              </m:rPr>
+              <w:rPr>
+                <w:rFonts w:ascii="Cambria Math" w:hAnsi="Cambria Math"/>
+              </w:rPr>
+              <m:t>1</m:t>
+            </m:r>
+          </m:sub>
+        </m:sSub>
+        <m:r>
+          <m:rPr>
+            <m:sty m:val="p"/>
+          </m:rPr>
+          <w:rPr>
+            <w:rFonts w:ascii="Cambria Math" w:hAnsi="Cambria Math"/>
+          </w:rPr>
+          <m:t>+</m:t>
+        </m:r>
+        <m:sSub>
+          <m:sSubPr>
+            <m:ctrlPr>
+              <w:rPr>
+                <w:rFonts w:ascii="Cambria Math" w:hAnsi="Cambria Math"/>
+              </w:rPr>
+            </m:ctrlPr>
+          </m:sSubPr>
+          <m:e>
+            <m:r>
+              <w:rPr>
+                <w:rFonts w:ascii="Cambria Math" w:hAnsi="Cambria Math"/>
+              </w:rPr>
+              <m:t>P</m:t>
+            </m:r>
+          </m:e>
+          <m:sub>
+            <m:r>
+              <m:rPr>
+                <m:sty m:val="p"/>
+              </m:rPr>
+              <w:rPr>
+                <w:rFonts w:ascii="Cambria Math" w:hAnsi="Cambria Math"/>
+              </w:rPr>
+              <m:t>1</m:t>
+            </m:r>
+            <m:r>
+              <m:rPr>
+                <m:lit/>
+                <m:sty m:val="p"/>
+              </m:rPr>
+              <w:rPr>
+                <w:rFonts w:ascii="Cambria Math" w:hAnsi="Cambria Math"/>
+              </w:rPr>
+              <m:t>/</m:t>
+            </m:r>
+            <m:r>
+              <w:rPr>
+                <w:rFonts w:ascii="Cambria Math" w:hAnsi="Cambria Math"/>
+              </w:rPr>
+              <m:t>H</m:t>
+            </m:r>
+          </m:sub>
+        </m:sSub>
+      </m:oMath>
+      <w:r>
+        <w:rPr>
+          <w:rFonts w:hint="eastAsia"/>
+        </w:rPr>
+        <w:t xml:space="preserve"> </w:t>
+      </w:r>
+      <w:r>
+        <w:t>win</w:t>
+      </w:r>
+      <w:r>
+        <w:t xml:space="preserve"> equilibrium</w:t>
+      </w:r>
+      <w:r>
+        <w:t xml:space="preserve"> (H = 0.7258128, P1H = 0.3909225, P1 = 2.2271095, S = 0.8368879) is stable.</w:t>
+      </w:r>
+      <w:r>
+        <w:t xml:space="preserve"> When increasing in initial abundance of </w:t>
+      </w:r>
+      <m:oMath>
+        <m:sSub>
+          <m:sSubPr>
+            <m:ctrlPr>
+              <w:rPr>
+                <w:rFonts w:ascii="Cambria Math" w:hAnsi="Cambria Math"/>
+              </w:rPr>
+            </m:ctrlPr>
+          </m:sSubPr>
+          <m:e>
+            <m:r>
+              <w:rPr>
+                <w:rFonts w:ascii="Cambria Math" w:hAnsi="Cambria Math"/>
+              </w:rPr>
+              <m:t>P</m:t>
+            </m:r>
+          </m:e>
+          <m:sub>
+            <m:r>
+              <m:rPr>
+                <m:sty m:val="p"/>
+              </m:rPr>
+              <w:rPr>
+                <w:rFonts w:ascii="Cambria Math" w:hAnsi="Cambria Math"/>
+              </w:rPr>
+              <m:t>2</m:t>
+            </m:r>
+          </m:sub>
+        </m:sSub>
+      </m:oMath>
+      <w:r>
+        <w:t xml:space="preserve">, the equilibrium will shift to the </w:t>
+      </w:r>
+      <m:oMath>
+        <m:sSub>
+          <m:sSubPr>
+            <m:ctrlPr>
+              <w:rPr>
+                <w:rFonts w:ascii="Cambria Math" w:hAnsi="Cambria Math"/>
+              </w:rPr>
+            </m:ctrlPr>
+          </m:sSubPr>
+          <m:e>
+            <m:r>
+              <w:rPr>
+                <w:rFonts w:ascii="Cambria Math" w:hAnsi="Cambria Math"/>
+              </w:rPr>
+              <m:t>P</m:t>
+            </m:r>
+          </m:e>
+          <m:sub>
+            <m:r>
+              <m:rPr>
+                <m:sty m:val="p"/>
+              </m:rPr>
+              <w:rPr>
+                <w:rFonts w:ascii="Cambria Math" w:hAnsi="Cambria Math"/>
+              </w:rPr>
+              <m:t>2</m:t>
+            </m:r>
+          </m:sub>
+        </m:sSub>
+        <m:r>
+          <m:rPr>
+            <m:sty m:val="p"/>
+          </m:rPr>
+          <w:rPr>
+            <w:rFonts w:ascii="Cambria Math" w:hAnsi="Cambria Math"/>
+          </w:rPr>
+          <m:t>+</m:t>
+        </m:r>
+        <m:sSub>
+          <m:sSubPr>
+            <m:ctrlPr>
+              <w:rPr>
+                <w:rFonts w:ascii="Cambria Math" w:hAnsi="Cambria Math"/>
+              </w:rPr>
+            </m:ctrlPr>
+          </m:sSubPr>
+          <m:e>
+            <m:r>
+              <w:rPr>
+                <w:rFonts w:ascii="Cambria Math" w:hAnsi="Cambria Math"/>
+              </w:rPr>
+              <m:t>P</m:t>
+            </m:r>
+          </m:e>
+          <m:sub>
+            <m:r>
+              <m:rPr>
+                <m:sty m:val="p"/>
+              </m:rPr>
+              <w:rPr>
+                <w:rFonts w:ascii="Cambria Math" w:hAnsi="Cambria Math"/>
+              </w:rPr>
+              <m:t>2</m:t>
+            </m:r>
+            <m:r>
+              <m:rPr>
+                <m:lit/>
+                <m:sty m:val="p"/>
+              </m:rPr>
+              <w:rPr>
+                <w:rFonts w:ascii="Cambria Math" w:hAnsi="Cambria Math"/>
+              </w:rPr>
+              <m:t>/</m:t>
+            </m:r>
+            <m:r>
+              <w:rPr>
+                <w:rFonts w:ascii="Cambria Math" w:hAnsi="Cambria Math"/>
+              </w:rPr>
+              <m:t>H</m:t>
+            </m:r>
+          </m:sub>
+        </m:sSub>
+      </m:oMath>
+      <w:r>
+        <w:rPr>
+          <w:rFonts w:hint="eastAsia"/>
+        </w:rPr>
+        <w:t xml:space="preserve"> </w:t>
+      </w:r>
+      <w:r>
+        <w:t>win</w:t>
+      </w:r>
+      <w:r>
+        <w:t xml:space="preserve"> equilibrium (</w:t>
+      </w:r>
+      <w:r>
+        <w:t>H = 2.5047725, P2H = 0.9499769, P2 = 0.6750948, S = 1.8746412</w:t>
+      </w:r>
+      <w:r>
+        <w:t>).</w:t>
+      </w:r>
+    </w:p>
+    <w:p>
+      <w:pPr>
+        <w:rPr>
+          <w:color w:val="5B9BD5" w:themeColor="accent5"/>
+        </w:rPr>
+      </w:pPr>
+    </w:p>
+    <w:p>
+      <w:pPr>
+        <w:rPr>
+          <w:color w:val="5B9BD5" w:themeColor="accent5"/>
+        </w:rPr>
+      </w:pPr>
+      <w:r>
+        <w:rPr>
+          <w:rFonts w:hint="eastAsia"/>
+          <w:color w:val="5B9BD5" w:themeColor="accent5"/>
+        </w:rPr>
+        <w:t>W</w:t>
+      </w:r>
+      <w:r>
+        <w:rPr>
+          <w:color w:val="5B9BD5" w:themeColor="accent5"/>
+        </w:rPr>
+        <w:t xml:space="preserve">hen </w:t>
+      </w:r>
+      <m:oMath>
+        <m:sSub>
+          <m:sSubPr>
+            <m:ctrlPr>
+              <w:rPr>
+                <w:rFonts w:ascii="Cambria Math" w:hAnsi="Cambria Math"/>
+                <w:color w:val="5B9BD5" w:themeColor="accent5"/>
+              </w:rPr>
+            </m:ctrlPr>
+          </m:sSubPr>
+          <m:e>
+            <m:r>
+              <w:rPr>
+                <w:rFonts w:ascii="Cambria Math" w:hAnsi="Cambria Math"/>
+                <w:color w:val="5B9BD5" w:themeColor="accent5"/>
+              </w:rPr>
+              <m:t>P</m:t>
+            </m:r>
+          </m:e>
+          <m:sub>
+            <m:r>
+              <m:rPr>
+                <m:sty m:val="p"/>
+              </m:rPr>
+              <w:rPr>
+                <w:rFonts w:ascii="Cambria Math" w:hAnsi="Cambria Math"/>
+                <w:color w:val="5B9BD5" w:themeColor="accent5"/>
+              </w:rPr>
+              <m:t>2</m:t>
+            </m:r>
+          </m:sub>
+        </m:sSub>
+        <m:r>
+          <m:rPr>
+            <m:sty m:val="p"/>
+          </m:rPr>
+          <w:rPr>
+            <w:rFonts w:ascii="Cambria Math" w:hAnsi="Cambria Math"/>
+            <w:color w:val="5B9BD5" w:themeColor="accent5"/>
+          </w:rPr>
+          <m:t>+</m:t>
+        </m:r>
+        <m:sSub>
+          <m:sSubPr>
+            <m:ctrlPr>
+              <w:rPr>
+                <w:rFonts w:ascii="Cambria Math" w:hAnsi="Cambria Math"/>
+                <w:color w:val="5B9BD5" w:themeColor="accent5"/>
+              </w:rPr>
+            </m:ctrlPr>
+          </m:sSubPr>
+          <m:e>
+            <m:r>
+              <w:rPr>
+                <w:rFonts w:ascii="Cambria Math" w:hAnsi="Cambria Math"/>
+                <w:color w:val="5B9BD5" w:themeColor="accent5"/>
+              </w:rPr>
+              <m:t>P</m:t>
+            </m:r>
+          </m:e>
+          <m:sub>
+            <m:r>
+              <m:rPr>
+                <m:sty m:val="p"/>
+              </m:rPr>
+              <w:rPr>
+                <w:rFonts w:ascii="Cambria Math" w:hAnsi="Cambria Math"/>
+                <w:color w:val="5B9BD5" w:themeColor="accent5"/>
+              </w:rPr>
+              <m:t>2</m:t>
+            </m:r>
+            <m:r>
+              <m:rPr>
+                <m:lit/>
+                <m:sty m:val="p"/>
+              </m:rPr>
+              <w:rPr>
+                <w:rFonts w:ascii="Cambria Math" w:hAnsi="Cambria Math"/>
+                <w:color w:val="5B9BD5" w:themeColor="accent5"/>
+              </w:rPr>
+              <m:t>/</m:t>
+            </m:r>
+            <m:r>
+              <w:rPr>
+                <w:rFonts w:ascii="Cambria Math" w:hAnsi="Cambria Math"/>
+                <w:color w:val="5B9BD5" w:themeColor="accent5"/>
+              </w:rPr>
+              <m:t>H</m:t>
+            </m:r>
+          </m:sub>
+        </m:sSub>
+      </m:oMath>
+      <w:r>
+        <w:rPr>
+          <w:rFonts w:hint="eastAsia"/>
+          <w:color w:val="5B9BD5" w:themeColor="accent5"/>
+        </w:rPr>
+        <w:t xml:space="preserve"> </w:t>
+      </w:r>
+      <w:r>
+        <w:rPr>
+          <w:color w:val="5B9BD5" w:themeColor="accent5"/>
+        </w:rPr>
+        <w:t>win,</w:t>
+      </w:r>
+    </w:p>
+    <w:p>
+      <w:pPr>
+        <w:rPr>
+          <w:color w:val="5B9BD5" w:themeColor="accent5"/>
+        </w:rPr>
+      </w:pPr>
+      <w:r>
+        <w:rPr>
+          <w:color w:val="5B9BD5" w:themeColor="accent5"/>
+        </w:rPr>
+        <w:t>H =</w:t>
+      </w:r>
+      <w:r>
+        <w:rPr>
+          <w:color w:val="5B9BD5" w:themeColor="accent5"/>
+        </w:rPr>
+        <w:t xml:space="preserve"> </w:t>
+      </w:r>
+      <w:r>
+        <w:rPr>
+          <w:color w:val="5B9BD5" w:themeColor="accent5"/>
+        </w:rPr>
+        <w:t>2.5047725</w:t>
+      </w:r>
+      <w:r>
+        <w:rPr>
+          <w:color w:val="5B9BD5" w:themeColor="accent5"/>
+        </w:rPr>
+        <w:t>, P2H =</w:t>
+      </w:r>
+      <w:r>
+        <w:rPr>
+          <w:color w:val="5B9BD5" w:themeColor="accent5"/>
+        </w:rPr>
+        <w:t xml:space="preserve"> </w:t>
+      </w:r>
+      <w:r>
+        <w:rPr>
+          <w:color w:val="5B9BD5" w:themeColor="accent5"/>
+        </w:rPr>
+        <w:t>0.9499769</w:t>
+      </w:r>
+      <w:r>
+        <w:rPr>
+          <w:color w:val="5B9BD5" w:themeColor="accent5"/>
+        </w:rPr>
+        <w:t xml:space="preserve">, P2 = </w:t>
+      </w:r>
+      <w:r>
+        <w:rPr>
+          <w:color w:val="5B9BD5" w:themeColor="accent5"/>
+        </w:rPr>
+        <w:t>0.6750948</w:t>
+      </w:r>
+      <w:r>
+        <w:rPr>
+          <w:color w:val="5B9BD5" w:themeColor="accent5"/>
+        </w:rPr>
+        <w:t xml:space="preserve">, S = </w:t>
+      </w:r>
+      <w:r>
+        <w:rPr>
+          <w:color w:val="5B9BD5" w:themeColor="accent5"/>
+        </w:rPr>
+        <w:t>1.8746412</w:t>
+      </w:r>
+      <w:r>
+        <w:rPr>
+          <w:color w:val="5B9BD5" w:themeColor="accent5"/>
+        </w:rPr>
+        <w:t>.</w:t>
+      </w:r>
+    </w:p>
+    <w:p>
       <w:r>
         <w:rPr>
           <w:noProof/>
           <w:color w:val="5B9BD5" w:themeColor="accent5"/>
         </w:rPr>
         <w:drawing>
-          <wp:inline distT="0" distB="0" distL="0" distR="0" wp14:anchorId="7B056C72" wp14:editId="1A1E5CC9">
+          <wp:inline distT="0" distB="0" distL="0" distR="0" wp14:anchorId="6C0FAAC7" wp14:editId="30178BCE">
             <wp:extent cx="3076744" cy="2520000"/>
             <wp:effectExtent l="0" t="0" r="0" b="0"/>
-            <wp:docPr id="29" name="圖片 29"/>
+            <wp:docPr id="21" name="圖片 21"/>
             <wp:cNvGraphicFramePr>
               <a:graphicFrameLocks xmlns:a="http://schemas.openxmlformats.org/drawingml/2006/main" noChangeAspect="1"/>
             </wp:cNvGraphicFramePr>
@@ -2069,7 +2068,7 @@
               <a:graphicData uri="http://schemas.openxmlformats.org/drawingml/2006/picture">
                 <pic:pic xmlns:pic="http://schemas.openxmlformats.org/drawingml/2006/picture">
                   <pic:nvPicPr>
-                    <pic:cNvPr id="0" name="Picture 4"/>
+                    <pic:cNvPr id="0" name="Picture 2"/>
                     <pic:cNvPicPr>
                       <a:picLocks noChangeAspect="1" noChangeArrowheads="1"/>
                     </pic:cNvPicPr>
@@ -2109,6 +2108,57 @@
           <w:color w:val="5B9BD5" w:themeColor="accent5"/>
         </w:rPr>
         <w:drawing>
+          <wp:inline distT="0" distB="0" distL="0" distR="0" wp14:anchorId="7B056C72" wp14:editId="1A1E5CC9">
+            <wp:extent cx="3076744" cy="2520000"/>
+            <wp:effectExtent l="0" t="0" r="0" b="0"/>
+            <wp:docPr id="29" name="圖片 29"/>
+            <wp:cNvGraphicFramePr>
+              <a:graphicFrameLocks xmlns:a="http://schemas.openxmlformats.org/drawingml/2006/main" noChangeAspect="1"/>
+            </wp:cNvGraphicFramePr>
+            <a:graphic xmlns:a="http://schemas.openxmlformats.org/drawingml/2006/main">
+              <a:graphicData uri="http://schemas.openxmlformats.org/drawingml/2006/picture">
+                <pic:pic xmlns:pic="http://schemas.openxmlformats.org/drawingml/2006/picture">
+                  <pic:nvPicPr>
+                    <pic:cNvPr id="0" name="Picture 4"/>
+                    <pic:cNvPicPr>
+                      <a:picLocks noChangeAspect="1" noChangeArrowheads="1"/>
+                    </pic:cNvPicPr>
+                  </pic:nvPicPr>
+                  <pic:blipFill>
+                    <a:blip r:embed="rId18">
+                      <a:extLst>
+                        <a:ext uri="{28A0092B-C50C-407E-A947-70E740481C1C}">
+                          <a14:useLocalDpi xmlns:a14="http://schemas.microsoft.com/office/drawing/2010/main" val="0"/>
+                        </a:ext>
+                      </a:extLst>
+                    </a:blip>
+                    <a:srcRect/>
+                    <a:stretch>
+                      <a:fillRect/>
+                    </a:stretch>
+                  </pic:blipFill>
+                  <pic:spPr bwMode="auto">
+                    <a:xfrm>
+                      <a:off x="0" y="0"/>
+                      <a:ext cx="3076744" cy="2520000"/>
+                    </a:xfrm>
+                    <a:prstGeom prst="rect">
+                      <a:avLst/>
+                    </a:prstGeom>
+                    <a:noFill/>
+                  </pic:spPr>
+                </pic:pic>
+              </a:graphicData>
+            </a:graphic>
+          </wp:inline>
+        </w:drawing>
+      </w:r>
+      <w:r>
+        <w:rPr>
+          <w:noProof/>
+          <w:color w:val="5B9BD5" w:themeColor="accent5"/>
+        </w:rPr>
+        <w:drawing>
           <wp:inline distT="0" distB="0" distL="0" distR="0" wp14:anchorId="212CF1E7" wp14:editId="5448DCAB">
             <wp:extent cx="3076744" cy="2520000"/>
             <wp:effectExtent l="0" t="0" r="0" b="0"/>
@@ -2126,7 +2176,7 @@
                     </pic:cNvPicPr>
                   </pic:nvPicPr>
                   <pic:blipFill>
-                    <a:blip r:embed="rId18">
+                    <a:blip r:embed="rId19">
                       <a:extLst>
                         <a:ext uri="{28A0092B-C50C-407E-A947-70E740481C1C}">
                           <a14:useLocalDpi xmlns:a14="http://schemas.microsoft.com/office/drawing/2010/main" val="0"/>
@@ -3325,52 +3375,6 @@
                     <pic:cNvPicPr/>
                   </pic:nvPicPr>
                   <pic:blipFill>
-                    <a:blip r:embed="rId19" cstate="print">
-                      <a:extLst>
-                        <a:ext uri="{28A0092B-C50C-407E-A947-70E740481C1C}">
-                          <a14:useLocalDpi xmlns:a14="http://schemas.microsoft.com/office/drawing/2010/main" val="0"/>
-                        </a:ext>
-                      </a:extLst>
-                    </a:blip>
-                    <a:stretch>
-                      <a:fillRect/>
-                    </a:stretch>
-                  </pic:blipFill>
-                  <pic:spPr>
-                    <a:xfrm>
-                      <a:off x="0" y="0"/>
-                      <a:ext cx="2454734" cy="1800000"/>
-                    </a:xfrm>
-                    <a:prstGeom prst="rect">
-                      <a:avLst/>
-                    </a:prstGeom>
-                  </pic:spPr>
-                </pic:pic>
-              </a:graphicData>
-            </a:graphic>
-          </wp:inline>
-        </w:drawing>
-      </w:r>
-      <w:r>
-        <w:rPr>
-          <w:noProof/>
-        </w:rPr>
-        <w:drawing>
-          <wp:inline distT="0" distB="0" distL="0" distR="0" wp14:anchorId="713B8CBA" wp14:editId="14929FAD">
-            <wp:extent cx="2454734" cy="1800000"/>
-            <wp:effectExtent l="0" t="0" r="3175" b="0"/>
-            <wp:docPr id="27" name="圖片 27"/>
-            <wp:cNvGraphicFramePr>
-              <a:graphicFrameLocks xmlns:a="http://schemas.openxmlformats.org/drawingml/2006/main" noChangeAspect="1"/>
-            </wp:cNvGraphicFramePr>
-            <a:graphic xmlns:a="http://schemas.openxmlformats.org/drawingml/2006/main">
-              <a:graphicData uri="http://schemas.openxmlformats.org/drawingml/2006/picture">
-                <pic:pic xmlns:pic="http://schemas.openxmlformats.org/drawingml/2006/picture">
-                  <pic:nvPicPr>
-                    <pic:cNvPr id="27" name="ASS d 003 m1 005 S.png"/>
-                    <pic:cNvPicPr/>
-                  </pic:nvPicPr>
-                  <pic:blipFill>
                     <a:blip r:embed="rId20" cstate="print">
                       <a:extLst>
                         <a:ext uri="{28A0092B-C50C-407E-A947-70E740481C1C}">
@@ -3402,10 +3406,10 @@
           <w:noProof/>
         </w:rPr>
         <w:drawing>
-          <wp:inline distT="0" distB="0" distL="0" distR="0">
+          <wp:inline distT="0" distB="0" distL="0" distR="0" wp14:anchorId="713B8CBA" wp14:editId="14929FAD">
             <wp:extent cx="2454734" cy="1800000"/>
             <wp:effectExtent l="0" t="0" r="3175" b="0"/>
-            <wp:docPr id="25" name="圖片 25"/>
+            <wp:docPr id="27" name="圖片 27"/>
             <wp:cNvGraphicFramePr>
               <a:graphicFrameLocks xmlns:a="http://schemas.openxmlformats.org/drawingml/2006/main" noChangeAspect="1"/>
             </wp:cNvGraphicFramePr>
@@ -3413,7 +3417,7 @@
               <a:graphicData uri="http://schemas.openxmlformats.org/drawingml/2006/picture">
                 <pic:pic xmlns:pic="http://schemas.openxmlformats.org/drawingml/2006/picture">
                   <pic:nvPicPr>
-                    <pic:cNvPr id="25" name="ASS d 003 m1 005 P1.png"/>
+                    <pic:cNvPr id="27" name="ASS d 003 m1 005 S.png"/>
                     <pic:cNvPicPr/>
                   </pic:nvPicPr>
                   <pic:blipFill>
@@ -3451,7 +3455,7 @@
           <wp:inline distT="0" distB="0" distL="0" distR="0">
             <wp:extent cx="2454734" cy="1800000"/>
             <wp:effectExtent l="0" t="0" r="3175" b="0"/>
-            <wp:docPr id="26" name="圖片 26"/>
+            <wp:docPr id="25" name="圖片 25"/>
             <wp:cNvGraphicFramePr>
               <a:graphicFrameLocks xmlns:a="http://schemas.openxmlformats.org/drawingml/2006/main" noChangeAspect="1"/>
             </wp:cNvGraphicFramePr>
@@ -3459,7 +3463,7 @@
               <a:graphicData uri="http://schemas.openxmlformats.org/drawingml/2006/picture">
                 <pic:pic xmlns:pic="http://schemas.openxmlformats.org/drawingml/2006/picture">
                   <pic:nvPicPr>
-                    <pic:cNvPr id="26" name="ASS d 003 m1 005 P2.png"/>
+                    <pic:cNvPr id="25" name="ASS d 003 m1 005 P1.png"/>
                     <pic:cNvPicPr/>
                   </pic:nvPicPr>
                   <pic:blipFill>
@@ -3489,108 +3493,15 @@
           </wp:inline>
         </w:drawing>
       </w:r>
-    </w:p>
-    <w:p/>
-    <w:p>
-      <w:pPr>
-        <w:rPr>
-          <w:color w:val="5B9BD5" w:themeColor="accent5"/>
-        </w:rPr>
-      </w:pPr>
-      <w:r>
-        <w:rPr>
-          <w:rFonts w:hint="eastAsia"/>
-          <w:color w:val="5B9BD5" w:themeColor="accent5"/>
-        </w:rPr>
-        <w:t>W</w:t>
-      </w:r>
-      <w:r>
-        <w:rPr>
-          <w:color w:val="5B9BD5" w:themeColor="accent5"/>
-        </w:rPr>
-        <w:t xml:space="preserve">hen both strains coexist, </w:t>
-      </w:r>
-    </w:p>
-    <w:p>
-      <w:pPr>
-        <w:rPr>
-          <w:color w:val="5B9BD5" w:themeColor="accent5"/>
-        </w:rPr>
-      </w:pPr>
-      <w:r>
-        <w:rPr>
-          <w:color w:val="5B9BD5" w:themeColor="accent5"/>
-        </w:rPr>
-        <w:t>H = 0.6716297, P1H = 0.2333761, P2H = 0.16874</w:t>
-      </w:r>
-      <w:bookmarkStart w:id="0" w:name="_GoBack"/>
-      <w:bookmarkEnd w:id="0"/>
-      <w:r>
-        <w:rPr>
-          <w:color w:val="5B9BD5" w:themeColor="accent5"/>
-        </w:rPr>
-        <w:t>27, P1 = 1.4767783, P2 = 0.4522385, S = 0.9095539.</w:t>
-      </w:r>
-    </w:p>
-    <w:p>
-      <w:pPr>
-        <w:widowControl/>
-        <w:rPr>
-          <w:rFonts w:hint="eastAsia"/>
-          <w:color w:val="5B9BD5" w:themeColor="accent5"/>
-        </w:rPr>
-      </w:pPr>
-      <m:oMathPara>
-        <m:oMathParaPr>
-          <m:jc m:val="left"/>
-        </m:oMathParaPr>
-        <m:oMath>
-          <m:r>
-            <w:rPr>
-              <w:rFonts w:ascii="Cambria Math" w:hAnsi="Cambria Math"/>
-              <w:color w:val="5B9BD5" w:themeColor="accent5"/>
-            </w:rPr>
-            <m:t>λ</m:t>
-          </m:r>
-          <m:r>
-            <m:rPr>
-              <m:sty m:val="p"/>
-            </m:rPr>
-            <w:rPr>
-              <w:rFonts w:ascii="Cambria Math" w:hAnsi="Cambria Math"/>
-              <w:color w:val="5B9BD5" w:themeColor="accent5"/>
-            </w:rPr>
-            <m:t xml:space="preserve">= </m:t>
-          </m:r>
-          <m:r>
-            <m:rPr>
-              <m:sty m:val="p"/>
-            </m:rPr>
-            <w:rPr>
-              <w:rFonts w:ascii="Cambria Math" w:hAnsi="Cambria Math"/>
-              <w:color w:val="5B9BD5" w:themeColor="accent5"/>
-            </w:rPr>
-            <m:t>-0.00259532</m:t>
-          </m:r>
-        </m:oMath>
-      </m:oMathPara>
-    </w:p>
-    <w:p>
-      <w:pPr>
-        <w:rPr>
-          <w:color w:val="5B9BD5" w:themeColor="accent5"/>
-        </w:rPr>
-      </w:pPr>
       <w:r>
         <w:rPr>
           <w:noProof/>
-          <w:color w:val="5B9BD5" w:themeColor="accent5"/>
         </w:rPr>
         <w:drawing>
-          <wp:inline distT="0" distB="0" distL="0" distR="0" wp14:anchorId="6463C831">
-            <wp:extent cx="3064186" cy="2520000"/>
+          <wp:inline distT="0" distB="0" distL="0" distR="0">
+            <wp:extent cx="2454734" cy="1800000"/>
             <wp:effectExtent l="0" t="0" r="3175" b="0"/>
-            <wp:docPr id="14" name="圖片 14"/>
+            <wp:docPr id="26" name="圖片 26"/>
             <wp:cNvGraphicFramePr>
               <a:graphicFrameLocks xmlns:a="http://schemas.openxmlformats.org/drawingml/2006/main" noChangeAspect="1"/>
             </wp:cNvGraphicFramePr>
@@ -3598,13 +3509,61 @@
               <a:graphicData uri="http://schemas.openxmlformats.org/drawingml/2006/picture">
                 <pic:pic xmlns:pic="http://schemas.openxmlformats.org/drawingml/2006/picture">
                   <pic:nvPicPr>
-                    <pic:cNvPr id="0" name="Picture 3"/>
+                    <pic:cNvPr id="26" name="ASS d 003 m1 005 P2.png"/>
+                    <pic:cNvPicPr/>
+                  </pic:nvPicPr>
+                  <pic:blipFill>
+                    <a:blip r:embed="rId23" cstate="print">
+                      <a:extLst>
+                        <a:ext uri="{28A0092B-C50C-407E-A947-70E740481C1C}">
+                          <a14:useLocalDpi xmlns:a14="http://schemas.microsoft.com/office/drawing/2010/main" val="0"/>
+                        </a:ext>
+                      </a:extLst>
+                    </a:blip>
+                    <a:stretch>
+                      <a:fillRect/>
+                    </a:stretch>
+                  </pic:blipFill>
+                  <pic:spPr>
+                    <a:xfrm>
+                      <a:off x="0" y="0"/>
+                      <a:ext cx="2454734" cy="1800000"/>
+                    </a:xfrm>
+                    <a:prstGeom prst="rect">
+                      <a:avLst/>
+                    </a:prstGeom>
+                  </pic:spPr>
+                </pic:pic>
+              </a:graphicData>
+            </a:graphic>
+          </wp:inline>
+        </w:drawing>
+      </w:r>
+    </w:p>
+    <w:p>
+      <w:r>
+        <w:rPr>
+          <w:noProof/>
+        </w:rPr>
+        <w:drawing>
+          <wp:inline distT="0" distB="0" distL="0" distR="0" wp14:anchorId="15112BAA">
+            <wp:extent cx="4957845" cy="2517680"/>
+            <wp:effectExtent l="0" t="0" r="0" b="0"/>
+            <wp:docPr id="36" name="圖片 36"/>
+            <wp:cNvGraphicFramePr>
+              <a:graphicFrameLocks xmlns:a="http://schemas.openxmlformats.org/drawingml/2006/main" noChangeAspect="1"/>
+            </wp:cNvGraphicFramePr>
+            <a:graphic xmlns:a="http://schemas.openxmlformats.org/drawingml/2006/main">
+              <a:graphicData uri="http://schemas.openxmlformats.org/drawingml/2006/picture">
+                <pic:pic xmlns:pic="http://schemas.openxmlformats.org/drawingml/2006/picture">
+                  <pic:nvPicPr>
+                    <pic:cNvPr id="0" name="Picture 4"/>
                     <pic:cNvPicPr>
                       <a:picLocks noChangeAspect="1" noChangeArrowheads="1"/>
                     </pic:cNvPicPr>
                   </pic:nvPicPr>
                   <pic:blipFill>
-                    <a:blip r:embed="rId23">
+                    <a:blip r:embed="rId24" cstate="print">
                       <a:extLst>
                         <a:ext uri="{28A0092B-C50C-407E-A947-70E740481C1C}">
                           <a14:useLocalDpi xmlns:a14="http://schemas.microsoft.com/office/drawing/2010/main" val="0"/>
@@ -3619,7 +3578,7 @@
                   <pic:spPr bwMode="auto">
                     <a:xfrm>
                       <a:off x="0" y="0"/>
-                      <a:ext cx="3064186" cy="2520000"/>
+                      <a:ext cx="4986267" cy="2532113"/>
                     </a:xfrm>
                     <a:prstGeom prst="rect">
                       <a:avLst/>
@@ -3632,16 +3591,137 @@
           </wp:inline>
         </w:drawing>
       </w:r>
+    </w:p>
+    <w:p/>
+    <w:p>
+      <w:pPr>
+        <w:rPr>
+          <w:color w:val="5B9BD5" w:themeColor="accent5"/>
+        </w:rPr>
+      </w:pPr>
+      <w:r>
+        <w:rPr>
+          <w:rFonts w:hint="eastAsia"/>
+          <w:color w:val="5B9BD5" w:themeColor="accent5"/>
+        </w:rPr>
+        <w:t>W</w:t>
+      </w:r>
+      <w:r>
+        <w:rPr>
+          <w:color w:val="5B9BD5" w:themeColor="accent5"/>
+        </w:rPr>
+        <w:t xml:space="preserve">hen both strains coexist, </w:t>
+      </w:r>
+      <w:r>
+        <w:rPr>
+          <w:rFonts w:hint="eastAsia"/>
+          <w:color w:val="5B9BD5" w:themeColor="accent5"/>
+        </w:rPr>
+        <w:t>(P</w:t>
+      </w:r>
+      <w:r>
+        <w:rPr>
+          <w:color w:val="5B9BD5" w:themeColor="accent5"/>
+        </w:rPr>
+        <w:t xml:space="preserve"> </w:t>
+      </w:r>
+      <w:r>
+        <w:rPr>
+          <w:rFonts w:hint="eastAsia"/>
+          <w:color w:val="5B9BD5" w:themeColor="accent5"/>
+        </w:rPr>
+        <w:t>t</w:t>
+      </w:r>
+      <w:r>
+        <w:rPr>
+          <w:color w:val="5B9BD5" w:themeColor="accent5"/>
+        </w:rPr>
+        <w:t xml:space="preserve">otal = </w:t>
+      </w:r>
+      <w:r>
+        <w:rPr>
+          <w:color w:val="5B9BD5" w:themeColor="accent5"/>
+        </w:rPr>
+        <w:t>2.3311356</w:t>
+      </w:r>
+      <w:r>
+        <w:rPr>
+          <w:rFonts w:hint="eastAsia"/>
+          <w:color w:val="5B9BD5" w:themeColor="accent5"/>
+        </w:rPr>
+        <w:t>)</w:t>
+      </w:r>
+    </w:p>
+    <w:p>
+      <w:pPr>
+        <w:rPr>
+          <w:color w:val="5B9BD5" w:themeColor="accent5"/>
+        </w:rPr>
+      </w:pPr>
+      <w:r>
+        <w:rPr>
+          <w:color w:val="5B9BD5" w:themeColor="accent5"/>
+        </w:rPr>
+        <w:t>H = 0.6716297, P1H = 0.2333761, P2H = 0.1687427, P1</w:t>
+      </w:r>
+      <w:bookmarkStart w:id="0" w:name="_GoBack"/>
+      <w:bookmarkEnd w:id="0"/>
+      <w:r>
+        <w:rPr>
+          <w:color w:val="5B9BD5" w:themeColor="accent5"/>
+        </w:rPr>
+        <w:t xml:space="preserve"> = 1.4767783, P2 = 0.4522385, S = 0.9095539.</w:t>
+      </w:r>
+    </w:p>
+    <w:p>
+      <w:pPr>
+        <w:widowControl/>
+        <w:rPr>
+          <w:color w:val="5B9BD5" w:themeColor="accent5"/>
+        </w:rPr>
+      </w:pPr>
+      <m:oMathPara>
+        <m:oMathParaPr>
+          <m:jc m:val="left"/>
+        </m:oMathParaPr>
+        <m:oMath>
+          <m:r>
+            <w:rPr>
+              <w:rFonts w:ascii="Cambria Math" w:hAnsi="Cambria Math"/>
+              <w:color w:val="5B9BD5" w:themeColor="accent5"/>
+            </w:rPr>
+            <w:lastRenderedPageBreak/>
+            <m:t>λ</m:t>
+          </m:r>
+          <m:r>
+            <m:rPr>
+              <m:sty m:val="p"/>
+            </m:rPr>
+            <w:rPr>
+              <w:rFonts w:ascii="Cambria Math" w:hAnsi="Cambria Math"/>
+              <w:color w:val="5B9BD5" w:themeColor="accent5"/>
+            </w:rPr>
+            <m:t>= -0.00259532</m:t>
+          </m:r>
+        </m:oMath>
+      </m:oMathPara>
+    </w:p>
+    <w:p>
+      <w:pPr>
+        <w:rPr>
+          <w:color w:val="5B9BD5" w:themeColor="accent5"/>
+        </w:rPr>
+      </w:pPr>
       <w:r>
         <w:rPr>
           <w:noProof/>
           <w:color w:val="5B9BD5" w:themeColor="accent5"/>
         </w:rPr>
         <w:drawing>
-          <wp:inline distT="0" distB="0" distL="0" distR="0" wp14:anchorId="2DE45544">
+          <wp:inline distT="0" distB="0" distL="0" distR="0" wp14:anchorId="6463C831">
             <wp:extent cx="3064186" cy="2520000"/>
             <wp:effectExtent l="0" t="0" r="3175" b="0"/>
-            <wp:docPr id="15" name="圖片 15"/>
+            <wp:docPr id="14" name="圖片 14"/>
             <wp:cNvGraphicFramePr>
               <a:graphicFrameLocks xmlns:a="http://schemas.openxmlformats.org/drawingml/2006/main" noChangeAspect="1"/>
             </wp:cNvGraphicFramePr>
@@ -3649,66 +3729,7 @@
               <a:graphicData uri="http://schemas.openxmlformats.org/drawingml/2006/picture">
                 <pic:pic xmlns:pic="http://schemas.openxmlformats.org/drawingml/2006/picture">
                   <pic:nvPicPr>
-                    <pic:cNvPr id="0" name="Picture 4"/>
-                    <pic:cNvPicPr>
-                      <a:picLocks noChangeAspect="1" noChangeArrowheads="1"/>
-                    </pic:cNvPicPr>
-                  </pic:nvPicPr>
-                  <pic:blipFill>
-                    <a:blip r:embed="rId24">
-                      <a:extLst>
-                        <a:ext uri="{28A0092B-C50C-407E-A947-70E740481C1C}">
-                          <a14:useLocalDpi xmlns:a14="http://schemas.microsoft.com/office/drawing/2010/main" val="0"/>
-                        </a:ext>
-                      </a:extLst>
-                    </a:blip>
-                    <a:srcRect/>
-                    <a:stretch>
-                      <a:fillRect/>
-                    </a:stretch>
-                  </pic:blipFill>
-                  <pic:spPr bwMode="auto">
-                    <a:xfrm>
-                      <a:off x="0" y="0"/>
-                      <a:ext cx="3064186" cy="2520000"/>
-                    </a:xfrm>
-                    <a:prstGeom prst="rect">
-                      <a:avLst/>
-                    </a:prstGeom>
-                    <a:noFill/>
-                  </pic:spPr>
-                </pic:pic>
-              </a:graphicData>
-            </a:graphic>
-          </wp:inline>
-        </w:drawing>
-      </w:r>
-    </w:p>
-    <w:p>
-      <w:pPr>
-        <w:rPr>
-          <w:color w:val="5B9BD5" w:themeColor="accent5"/>
-        </w:rPr>
-      </w:pPr>
-      <w:r>
-        <w:rPr>
-          <w:noProof/>
-          <w:color w:val="5B9BD5" w:themeColor="accent5"/>
-        </w:rPr>
-        <w:lastRenderedPageBreak/>
-        <w:drawing>
-          <wp:inline distT="0" distB="0" distL="0" distR="0" wp14:anchorId="4B7E3DFC">
-            <wp:extent cx="3064186" cy="2520000"/>
-            <wp:effectExtent l="0" t="0" r="3175" b="0"/>
-            <wp:docPr id="16" name="圖片 16"/>
-            <wp:cNvGraphicFramePr>
-              <a:graphicFrameLocks xmlns:a="http://schemas.openxmlformats.org/drawingml/2006/main" noChangeAspect="1"/>
-            </wp:cNvGraphicFramePr>
-            <a:graphic xmlns:a="http://schemas.openxmlformats.org/drawingml/2006/main">
-              <a:graphicData uri="http://schemas.openxmlformats.org/drawingml/2006/picture">
-                <pic:pic xmlns:pic="http://schemas.openxmlformats.org/drawingml/2006/picture">
-                  <pic:nvPicPr>
-                    <pic:cNvPr id="0" name="Picture 5"/>
+                    <pic:cNvPr id="0" name="Picture 3"/>
                     <pic:cNvPicPr>
                       <a:picLocks noChangeAspect="1" noChangeArrowheads="1"/>
                     </pic:cNvPicPr>
@@ -3748,10 +3769,10 @@
           <w:color w:val="5B9BD5" w:themeColor="accent5"/>
         </w:rPr>
         <w:drawing>
-          <wp:inline distT="0" distB="0" distL="0" distR="0" wp14:anchorId="3B105CED">
+          <wp:inline distT="0" distB="0" distL="0" distR="0" wp14:anchorId="2DE45544">
             <wp:extent cx="3064186" cy="2520000"/>
             <wp:effectExtent l="0" t="0" r="3175" b="0"/>
-            <wp:docPr id="17" name="圖片 17"/>
+            <wp:docPr id="15" name="圖片 15"/>
             <wp:cNvGraphicFramePr>
               <a:graphicFrameLocks xmlns:a="http://schemas.openxmlformats.org/drawingml/2006/main" noChangeAspect="1"/>
             </wp:cNvGraphicFramePr>
@@ -3759,7 +3780,7 @@
               <a:graphicData uri="http://schemas.openxmlformats.org/drawingml/2006/picture">
                 <pic:pic xmlns:pic="http://schemas.openxmlformats.org/drawingml/2006/picture">
                   <pic:nvPicPr>
-                    <pic:cNvPr id="0" name="Picture 6"/>
+                    <pic:cNvPr id="0" name="Picture 4"/>
                     <pic:cNvPicPr>
                       <a:picLocks noChangeAspect="1" noChangeArrowheads="1"/>
                     </pic:cNvPicPr>
@@ -3797,768 +3818,19 @@
     <w:p>
       <w:pPr>
         <w:rPr>
-          <w:color w:val="FF0000"/>
+          <w:color w:val="5B9BD5" w:themeColor="accent5"/>
         </w:rPr>
       </w:pPr>
       <w:r>
         <w:rPr>
-          <w:rFonts w:hint="eastAsia"/>
-          <w:color w:val="FF0000"/>
-        </w:rPr>
-        <w:t>Wh</w:t>
-      </w:r>
-      <w:r>
-        <w:rPr>
-          <w:color w:val="FF0000"/>
-        </w:rPr>
-        <w:t xml:space="preserve">y adding H can make </w:t>
-      </w:r>
-      <w:r>
-        <w:rPr>
-          <w:color w:val="FF0000"/>
-        </w:rPr>
-        <w:t>virulent strain wins?</w:t>
-      </w:r>
-    </w:p>
-    <w:p>
-      <w:pPr>
-        <w:rPr>
-          <w:color w:val="5B9BD5" w:themeColor="accent5"/>
-        </w:rPr>
-      </w:pPr>
-      <w:r>
-        <w:rPr>
-          <w:rFonts w:hint="eastAsia"/>
-          <w:color w:val="5B9BD5" w:themeColor="accent5"/>
-        </w:rPr>
-        <w:t>B</w:t>
-      </w:r>
-      <w:r>
-        <w:rPr>
-          <w:color w:val="5B9BD5" w:themeColor="accent5"/>
-        </w:rPr>
-        <w:t xml:space="preserve">ecause now </w:t>
-      </w:r>
-      <m:oMath>
-        <m:sSub>
-          <m:sSubPr>
-            <m:ctrlPr>
-              <w:rPr>
-                <w:rFonts w:ascii="Cambria Math" w:hAnsi="Cambria Math"/>
-                <w:color w:val="5B9BD5" w:themeColor="accent5"/>
-              </w:rPr>
-            </m:ctrlPr>
-          </m:sSubPr>
-          <m:e>
-            <m:r>
-              <m:rPr>
-                <m:sty m:val="p"/>
-              </m:rPr>
-              <w:rPr>
-                <w:rFonts w:ascii="Cambria Math" w:hAnsi="Cambria Math"/>
-                <w:color w:val="5B9BD5" w:themeColor="accent5"/>
-              </w:rPr>
-              <m:t>P</m:t>
-            </m:r>
-          </m:e>
-          <m:sub>
-            <m:r>
-              <m:rPr>
-                <m:sty m:val="p"/>
-              </m:rPr>
-              <w:rPr>
-                <w:rFonts w:ascii="Cambria Math" w:hAnsi="Cambria Math"/>
-                <w:color w:val="5B9BD5" w:themeColor="accent5"/>
-              </w:rPr>
-              <m:t>1</m:t>
-            </m:r>
-          </m:sub>
-        </m:sSub>
-      </m:oMath>
-      <w:r>
-        <w:rPr>
-          <w:rFonts w:hint="eastAsia"/>
-          <w:color w:val="5B9BD5" w:themeColor="accent5"/>
-        </w:rPr>
-        <w:t xml:space="preserve"> </w:t>
-      </w:r>
-      <w:r>
-        <w:rPr>
-          <w:color w:val="5B9BD5" w:themeColor="accent5"/>
-        </w:rPr>
-        <w:t xml:space="preserve">has higher mortality rate, and there are many </w:t>
-      </w:r>
-      <m:oMath>
-        <m:r>
-          <m:rPr>
-            <m:sty m:val="p"/>
-          </m:rPr>
-          <w:rPr>
-            <w:rFonts w:ascii="Cambria Math" w:hAnsi="Cambria Math"/>
-            <w:color w:val="5B9BD5" w:themeColor="accent5"/>
-          </w:rPr>
-          <m:t>H</m:t>
-        </m:r>
-      </m:oMath>
-      <w:r>
-        <w:rPr>
-          <w:rFonts w:hint="eastAsia"/>
-          <w:color w:val="5B9BD5" w:themeColor="accent5"/>
-        </w:rPr>
-        <w:t xml:space="preserve"> </w:t>
-      </w:r>
-      <w:r>
-        <w:rPr>
-          <w:color w:val="5B9BD5" w:themeColor="accent5"/>
-        </w:rPr>
-        <w:t xml:space="preserve">in the system, most of the </w:t>
-      </w:r>
-      <m:oMath>
-        <m:sSub>
-          <m:sSubPr>
-            <m:ctrlPr>
-              <w:rPr>
-                <w:rFonts w:ascii="Cambria Math" w:hAnsi="Cambria Math"/>
-                <w:color w:val="5B9BD5" w:themeColor="accent5"/>
-              </w:rPr>
-            </m:ctrlPr>
-          </m:sSubPr>
-          <m:e>
-            <m:r>
-              <m:rPr>
-                <m:sty m:val="p"/>
-              </m:rPr>
-              <w:rPr>
-                <w:rFonts w:ascii="Cambria Math" w:hAnsi="Cambria Math"/>
-                <w:color w:val="5B9BD5" w:themeColor="accent5"/>
-              </w:rPr>
-              <m:t>P</m:t>
-            </m:r>
-          </m:e>
-          <m:sub>
-            <m:r>
-              <m:rPr>
-                <m:sty m:val="p"/>
-              </m:rPr>
-              <w:rPr>
-                <w:rFonts w:ascii="Cambria Math" w:hAnsi="Cambria Math"/>
-                <w:color w:val="5B9BD5" w:themeColor="accent5"/>
-              </w:rPr>
-              <m:t>1</m:t>
-            </m:r>
-          </m:sub>
-        </m:sSub>
-      </m:oMath>
-      <w:r>
-        <w:rPr>
-          <w:rFonts w:hint="eastAsia"/>
-          <w:color w:val="5B9BD5" w:themeColor="accent5"/>
-        </w:rPr>
-        <w:t xml:space="preserve"> </w:t>
-      </w:r>
-      <w:r>
-        <w:rPr>
-          <w:color w:val="5B9BD5" w:themeColor="accent5"/>
-        </w:rPr>
-        <w:t xml:space="preserve">will become </w:t>
-      </w:r>
-      <m:oMath>
-        <m:sSub>
-          <m:sSubPr>
-            <m:ctrlPr>
-              <w:rPr>
-                <w:rFonts w:ascii="Cambria Math" w:hAnsi="Cambria Math"/>
-                <w:color w:val="5B9BD5" w:themeColor="accent5"/>
-              </w:rPr>
-            </m:ctrlPr>
-          </m:sSubPr>
-          <m:e>
-            <m:r>
-              <m:rPr>
-                <m:sty m:val="p"/>
-              </m:rPr>
-              <w:rPr>
-                <w:rFonts w:ascii="Cambria Math" w:hAnsi="Cambria Math"/>
-                <w:color w:val="5B9BD5" w:themeColor="accent5"/>
-              </w:rPr>
-              <m:t>P</m:t>
-            </m:r>
-          </m:e>
-          <m:sub>
-            <m:r>
-              <m:rPr>
-                <m:sty m:val="p"/>
-              </m:rPr>
-              <w:rPr>
-                <w:rFonts w:ascii="Cambria Math" w:hAnsi="Cambria Math"/>
-                <w:color w:val="5B9BD5" w:themeColor="accent5"/>
-              </w:rPr>
-              <m:t>1</m:t>
-            </m:r>
-            <m:r>
-              <m:rPr>
-                <m:lit/>
-                <m:sty m:val="p"/>
-              </m:rPr>
-              <w:rPr>
-                <w:rFonts w:ascii="Cambria Math" w:hAnsi="Cambria Math"/>
-                <w:color w:val="5B9BD5" w:themeColor="accent5"/>
-              </w:rPr>
-              <m:t>/</m:t>
-            </m:r>
-            <m:r>
-              <m:rPr>
-                <m:sty m:val="p"/>
-              </m:rPr>
-              <w:rPr>
-                <w:rFonts w:ascii="Cambria Math" w:hAnsi="Cambria Math"/>
-                <w:color w:val="5B9BD5" w:themeColor="accent5"/>
-              </w:rPr>
-              <m:t>H</m:t>
-            </m:r>
-          </m:sub>
-        </m:sSub>
-      </m:oMath>
-      <w:r>
-        <w:rPr>
-          <w:color w:val="5B9BD5" w:themeColor="accent5"/>
-        </w:rPr>
-        <w:t xml:space="preserve">. The high mortality of </w:t>
-      </w:r>
-      <m:oMath>
-        <m:sSub>
-          <m:sSubPr>
-            <m:ctrlPr>
-              <w:rPr>
-                <w:rFonts w:ascii="Cambria Math" w:hAnsi="Cambria Math"/>
-                <w:color w:val="5B9BD5" w:themeColor="accent5"/>
-              </w:rPr>
-            </m:ctrlPr>
-          </m:sSubPr>
-          <m:e>
-            <m:r>
-              <m:rPr>
-                <m:sty m:val="p"/>
-              </m:rPr>
-              <w:rPr>
-                <w:rFonts w:ascii="Cambria Math" w:hAnsi="Cambria Math"/>
-                <w:color w:val="5B9BD5" w:themeColor="accent5"/>
-              </w:rPr>
-              <m:t>P</m:t>
-            </m:r>
-          </m:e>
-          <m:sub>
-            <m:r>
-              <m:rPr>
-                <m:sty m:val="p"/>
-              </m:rPr>
-              <w:rPr>
-                <w:rFonts w:ascii="Cambria Math" w:hAnsi="Cambria Math"/>
-                <w:color w:val="5B9BD5" w:themeColor="accent5"/>
-              </w:rPr>
-              <m:t>1</m:t>
-            </m:r>
-            <m:r>
-              <m:rPr>
-                <m:lit/>
-                <m:sty m:val="p"/>
-              </m:rPr>
-              <w:rPr>
-                <w:rFonts w:ascii="Cambria Math" w:hAnsi="Cambria Math"/>
-                <w:color w:val="5B9BD5" w:themeColor="accent5"/>
-              </w:rPr>
-              <m:t>/</m:t>
-            </m:r>
-            <m:r>
-              <m:rPr>
-                <m:sty m:val="p"/>
-              </m:rPr>
-              <w:rPr>
-                <w:rFonts w:ascii="Cambria Math" w:hAnsi="Cambria Math"/>
-                <w:color w:val="5B9BD5" w:themeColor="accent5"/>
-              </w:rPr>
-              <m:t>H</m:t>
-            </m:r>
-          </m:sub>
-        </m:sSub>
-      </m:oMath>
-      <w:r>
-        <w:rPr>
-          <w:rFonts w:hint="eastAsia"/>
-          <w:color w:val="5B9BD5" w:themeColor="accent5"/>
-        </w:rPr>
-        <w:t xml:space="preserve"> </w:t>
-      </w:r>
-      <w:r>
-        <w:rPr>
-          <w:color w:val="5B9BD5" w:themeColor="accent5"/>
-        </w:rPr>
-        <w:t>and abundant H</w:t>
-      </w:r>
-      <w:r>
-        <w:rPr>
-          <w:rFonts w:hint="eastAsia"/>
-          <w:color w:val="5B9BD5" w:themeColor="accent5"/>
-        </w:rPr>
-        <w:t xml:space="preserve"> </w:t>
-      </w:r>
-      <w:r>
-        <w:rPr>
-          <w:color w:val="5B9BD5" w:themeColor="accent5"/>
-        </w:rPr>
-        <w:t xml:space="preserve">will make </w:t>
-      </w:r>
-      <m:oMath>
-        <m:sSub>
-          <m:sSubPr>
-            <m:ctrlPr>
-              <w:rPr>
-                <w:rFonts w:ascii="Cambria Math" w:hAnsi="Cambria Math"/>
-                <w:color w:val="5B9BD5" w:themeColor="accent5"/>
-              </w:rPr>
-            </m:ctrlPr>
-          </m:sSubPr>
-          <m:e>
-            <m:r>
-              <m:rPr>
-                <m:sty m:val="p"/>
-              </m:rPr>
-              <w:rPr>
-                <w:rFonts w:ascii="Cambria Math" w:hAnsi="Cambria Math"/>
-                <w:color w:val="5B9BD5" w:themeColor="accent5"/>
-              </w:rPr>
-              <m:t>P</m:t>
-            </m:r>
-          </m:e>
-          <m:sub>
-            <m:r>
-              <m:rPr>
-                <m:sty m:val="p"/>
-              </m:rPr>
-              <w:rPr>
-                <w:rFonts w:ascii="Cambria Math" w:hAnsi="Cambria Math"/>
-                <w:color w:val="5B9BD5" w:themeColor="accent5"/>
-              </w:rPr>
-              <m:t>1</m:t>
-            </m:r>
-            <m:r>
-              <m:rPr>
-                <m:lit/>
-                <m:sty m:val="p"/>
-              </m:rPr>
-              <w:rPr>
-                <w:rFonts w:ascii="Cambria Math" w:hAnsi="Cambria Math"/>
-                <w:color w:val="5B9BD5" w:themeColor="accent5"/>
-              </w:rPr>
-              <m:t>/</m:t>
-            </m:r>
-            <m:r>
-              <m:rPr>
-                <m:sty m:val="p"/>
-              </m:rPr>
-              <w:rPr>
-                <w:rFonts w:ascii="Cambria Math" w:hAnsi="Cambria Math"/>
-                <w:color w:val="5B9BD5" w:themeColor="accent5"/>
-              </w:rPr>
-              <m:t>H</m:t>
-            </m:r>
-          </m:sub>
-        </m:sSub>
-      </m:oMath>
-      <w:r>
-        <w:rPr>
-          <w:color w:val="5B9BD5" w:themeColor="accent5"/>
-        </w:rPr>
-        <w:t xml:space="preserve"> soon die of hyperparasite infection</w:t>
-      </w:r>
-      <w:r>
-        <w:rPr>
-          <w:rFonts w:hint="eastAsia"/>
-          <w:color w:val="5B9BD5" w:themeColor="accent5"/>
-        </w:rPr>
-        <w:t xml:space="preserve"> </w:t>
-      </w:r>
-      <w:r>
-        <w:rPr>
-          <w:color w:val="5B9BD5" w:themeColor="accent5"/>
-        </w:rPr>
-        <w:t>or die of natural mortality.</w:t>
-      </w:r>
-    </w:p>
-    <w:p>
-      <w:pPr>
-        <w:rPr>
-          <w:color w:val="5B9BD5" w:themeColor="accent5"/>
-        </w:rPr>
-      </w:pPr>
-      <w:r>
-        <w:rPr>
-          <w:color w:val="5B9BD5" w:themeColor="accent5"/>
-        </w:rPr>
-        <w:t xml:space="preserve">The reason why </w:t>
-      </w:r>
-      <m:oMath>
-        <m:sSub>
-          <m:sSubPr>
-            <m:ctrlPr>
-              <w:rPr>
-                <w:rFonts w:ascii="Cambria Math" w:hAnsi="Cambria Math"/>
-                <w:color w:val="5B9BD5" w:themeColor="accent5"/>
-              </w:rPr>
-            </m:ctrlPr>
-          </m:sSubPr>
-          <m:e>
-            <m:r>
-              <m:rPr>
-                <m:sty m:val="p"/>
-              </m:rPr>
-              <w:rPr>
-                <w:rFonts w:ascii="Cambria Math" w:hAnsi="Cambria Math"/>
-                <w:color w:val="5B9BD5" w:themeColor="accent5"/>
-              </w:rPr>
-              <m:t>E</m:t>
-            </m:r>
-          </m:e>
-          <m:sub>
-            <m:r>
-              <m:rPr>
-                <m:sty m:val="p"/>
-              </m:rPr>
-              <w:rPr>
-                <w:rFonts w:ascii="Cambria Math" w:hAnsi="Cambria Math"/>
-                <w:color w:val="5B9BD5" w:themeColor="accent5"/>
-              </w:rPr>
-              <m:t>2H</m:t>
-            </m:r>
-          </m:sub>
-        </m:sSub>
-      </m:oMath>
-      <w:r>
-        <w:rPr>
-          <w:rFonts w:hint="eastAsia"/>
-          <w:color w:val="5B9BD5" w:themeColor="accent5"/>
-        </w:rPr>
-        <w:t xml:space="preserve"> </w:t>
-      </w:r>
-      <w:r>
-        <w:rPr>
-          <w:color w:val="5B9BD5" w:themeColor="accent5"/>
-        </w:rPr>
-        <w:t xml:space="preserve">would have more </w:t>
-      </w:r>
-      <m:oMath>
-        <m:r>
-          <m:rPr>
-            <m:sty m:val="p"/>
-          </m:rPr>
-          <w:rPr>
-            <w:rFonts w:ascii="Cambria Math" w:hAnsi="Cambria Math"/>
-            <w:color w:val="5B9BD5" w:themeColor="accent5"/>
-          </w:rPr>
-          <m:t>H</m:t>
-        </m:r>
-      </m:oMath>
-      <w:r>
-        <w:rPr>
-          <w:rFonts w:hint="eastAsia"/>
-          <w:color w:val="5B9BD5" w:themeColor="accent5"/>
-        </w:rPr>
-        <w:t xml:space="preserve"> </w:t>
-      </w:r>
-      <w:r>
-        <w:rPr>
-          <w:color w:val="5B9BD5" w:themeColor="accent5"/>
-        </w:rPr>
-        <w:t>is that</w:t>
-      </w:r>
-      <w:r>
-        <w:rPr>
-          <w:color w:val="5B9BD5" w:themeColor="accent5"/>
-        </w:rPr>
-        <w:t xml:space="preserve"> </w:t>
-      </w:r>
-      <m:oMath>
-        <m:sSub>
-          <m:sSubPr>
-            <m:ctrlPr>
-              <w:rPr>
-                <w:rFonts w:ascii="Cambria Math" w:hAnsi="Cambria Math"/>
-                <w:color w:val="5B9BD5" w:themeColor="accent5"/>
-              </w:rPr>
-            </m:ctrlPr>
-          </m:sSubPr>
-          <m:e>
-            <m:r>
-              <m:rPr>
-                <m:sty m:val="p"/>
-              </m:rPr>
-              <w:rPr>
-                <w:rFonts w:ascii="Cambria Math" w:hAnsi="Cambria Math"/>
-                <w:color w:val="5B9BD5" w:themeColor="accent5"/>
-              </w:rPr>
-              <m:t>P</m:t>
-            </m:r>
-          </m:e>
-          <m:sub>
-            <m:r>
-              <m:rPr>
-                <m:sty m:val="p"/>
-              </m:rPr>
-              <w:rPr>
-                <w:rFonts w:ascii="Cambria Math" w:hAnsi="Cambria Math"/>
-                <w:color w:val="5B9BD5" w:themeColor="accent5"/>
-              </w:rPr>
-              <m:t>2</m:t>
-            </m:r>
-          </m:sub>
-        </m:sSub>
-      </m:oMath>
-      <w:r>
-        <w:rPr>
-          <w:rFonts w:hint="eastAsia"/>
-          <w:color w:val="5B9BD5" w:themeColor="accent5"/>
-        </w:rPr>
-        <w:t xml:space="preserve"> </w:t>
-      </w:r>
-      <w:r>
-        <w:rPr>
-          <w:color w:val="5B9BD5" w:themeColor="accent5"/>
-        </w:rPr>
-        <w:t>alone</w:t>
-      </w:r>
-      <w:r>
-        <w:rPr>
-          <w:color w:val="5B9BD5" w:themeColor="accent5"/>
-        </w:rPr>
-        <w:t xml:space="preserve"> can </w:t>
-      </w:r>
-      <w:r>
-        <w:rPr>
-          <w:color w:val="5B9BD5" w:themeColor="accent5"/>
-        </w:rPr>
-        <w:t xml:space="preserve">contribute more </w:t>
-      </w:r>
-      <m:oMath>
-        <m:r>
-          <m:rPr>
-            <m:sty m:val="p"/>
-          </m:rPr>
-          <w:rPr>
-            <w:rFonts w:ascii="Cambria Math" w:hAnsi="Cambria Math"/>
-            <w:color w:val="5B9BD5" w:themeColor="accent5"/>
-          </w:rPr>
-          <m:t>H</m:t>
-        </m:r>
-      </m:oMath>
-      <w:r>
-        <w:rPr>
-          <w:rFonts w:hint="eastAsia"/>
-          <w:color w:val="5B9BD5" w:themeColor="accent5"/>
-        </w:rPr>
-        <w:t xml:space="preserve"> </w:t>
-      </w:r>
-      <w:r>
-        <w:rPr>
-          <w:color w:val="5B9BD5" w:themeColor="accent5"/>
-        </w:rPr>
-        <w:t>in the system compared to the situation that two strains coexist.</w:t>
-      </w:r>
-    </w:p>
-    <w:p>
-      <w:pPr>
-        <w:rPr>
-          <w:color w:val="5B9BD5" w:themeColor="accent5"/>
-        </w:rPr>
-      </w:pPr>
-    </w:p>
-    <w:p>
-      <w:pPr>
-        <w:rPr>
-          <w:color w:val="5B9BD5" w:themeColor="accent5"/>
-        </w:rPr>
-      </w:pPr>
-      <w:r>
-        <w:rPr>
-          <w:rFonts w:hint="eastAsia"/>
-          <w:color w:val="5B9BD5" w:themeColor="accent5"/>
-        </w:rPr>
-        <w:t>W</w:t>
-      </w:r>
-      <w:r>
-        <w:rPr>
-          <w:color w:val="5B9BD5" w:themeColor="accent5"/>
-        </w:rPr>
-        <w:t xml:space="preserve">hen </w:t>
-      </w:r>
-      <m:oMath>
-        <m:sSub>
-          <m:sSubPr>
-            <m:ctrlPr>
-              <w:rPr>
-                <w:rFonts w:ascii="Cambria Math" w:hAnsi="Cambria Math"/>
-                <w:color w:val="5B9BD5" w:themeColor="accent5"/>
-              </w:rPr>
-            </m:ctrlPr>
-          </m:sSubPr>
-          <m:e>
-            <m:r>
-              <w:rPr>
-                <w:rFonts w:ascii="Cambria Math" w:hAnsi="Cambria Math"/>
-                <w:color w:val="5B9BD5" w:themeColor="accent5"/>
-              </w:rPr>
-              <m:t>P</m:t>
-            </m:r>
-          </m:e>
-          <m:sub>
-            <m:r>
-              <m:rPr>
-                <m:sty m:val="p"/>
-              </m:rPr>
-              <w:rPr>
-                <w:rFonts w:ascii="Cambria Math" w:hAnsi="Cambria Math"/>
-                <w:color w:val="5B9BD5" w:themeColor="accent5"/>
-              </w:rPr>
-              <m:t>2</m:t>
-            </m:r>
-          </m:sub>
-        </m:sSub>
-        <m:r>
-          <m:rPr>
-            <m:sty m:val="p"/>
-          </m:rPr>
-          <w:rPr>
-            <w:rFonts w:ascii="Cambria Math" w:hAnsi="Cambria Math"/>
-            <w:color w:val="5B9BD5" w:themeColor="accent5"/>
-          </w:rPr>
-          <m:t>+</m:t>
-        </m:r>
-        <m:sSub>
-          <m:sSubPr>
-            <m:ctrlPr>
-              <w:rPr>
-                <w:rFonts w:ascii="Cambria Math" w:hAnsi="Cambria Math"/>
-                <w:color w:val="5B9BD5" w:themeColor="accent5"/>
-              </w:rPr>
-            </m:ctrlPr>
-          </m:sSubPr>
-          <m:e>
-            <m:r>
-              <w:rPr>
-                <w:rFonts w:ascii="Cambria Math" w:hAnsi="Cambria Math"/>
-                <w:color w:val="5B9BD5" w:themeColor="accent5"/>
-              </w:rPr>
-              <m:t>P</m:t>
-            </m:r>
-          </m:e>
-          <m:sub>
-            <m:r>
-              <m:rPr>
-                <m:sty m:val="p"/>
-              </m:rPr>
-              <w:rPr>
-                <w:rFonts w:ascii="Cambria Math" w:hAnsi="Cambria Math"/>
-                <w:color w:val="5B9BD5" w:themeColor="accent5"/>
-              </w:rPr>
-              <m:t>2</m:t>
-            </m:r>
-            <m:r>
-              <m:rPr>
-                <m:lit/>
-                <m:sty m:val="p"/>
-              </m:rPr>
-              <w:rPr>
-                <w:rFonts w:ascii="Cambria Math" w:hAnsi="Cambria Math"/>
-                <w:color w:val="5B9BD5" w:themeColor="accent5"/>
-              </w:rPr>
-              <m:t>/</m:t>
-            </m:r>
-            <m:r>
-              <w:rPr>
-                <w:rFonts w:ascii="Cambria Math" w:hAnsi="Cambria Math"/>
-                <w:color w:val="5B9BD5" w:themeColor="accent5"/>
-              </w:rPr>
-              <m:t>H</m:t>
-            </m:r>
-          </m:sub>
-        </m:sSub>
-      </m:oMath>
-      <w:r>
-        <w:rPr>
-          <w:rFonts w:hint="eastAsia"/>
-          <w:color w:val="5B9BD5" w:themeColor="accent5"/>
-        </w:rPr>
-        <w:t xml:space="preserve"> </w:t>
-      </w:r>
-      <w:r>
-        <w:rPr>
-          <w:color w:val="5B9BD5" w:themeColor="accent5"/>
-        </w:rPr>
-        <w:t>win,</w:t>
-      </w:r>
-    </w:p>
-    <w:p>
-      <w:pPr>
-        <w:rPr>
-          <w:rFonts w:hint="eastAsia"/>
-          <w:color w:val="5B9BD5" w:themeColor="accent5"/>
-        </w:rPr>
-      </w:pPr>
-      <w:r>
-        <w:rPr>
-          <w:color w:val="5B9BD5" w:themeColor="accent5"/>
-        </w:rPr>
-        <w:t>H = 2.0989911, P2H = 0.8868977, P2 = 0.7605634, S = 1.7626948.</w:t>
-      </w:r>
-      <w:r>
-        <w:rPr>
-          <w:rFonts w:hint="eastAsia"/>
-          <w:color w:val="5B9BD5" w:themeColor="accent5"/>
-        </w:rPr>
-        <w:t xml:space="preserve"> </w:t>
-      </w:r>
-      <m:oMath>
-        <m:r>
-          <m:rPr>
-            <m:sty m:val="p"/>
-          </m:rPr>
-          <w:rPr>
-            <w:rFonts w:ascii="Cambria Math" w:hAnsi="Cambria Math"/>
-            <w:color w:val="5B9BD5" w:themeColor="accent5"/>
-          </w:rPr>
-          <m:t>λ</m:t>
-        </m:r>
-        <m:r>
-          <m:rPr>
-            <m:sty m:val="p"/>
-          </m:rPr>
-          <w:rPr>
-            <w:rFonts w:ascii="Cambria Math" w:hAnsi="Cambria Math"/>
-            <w:color w:val="5B9BD5" w:themeColor="accent5"/>
-          </w:rPr>
-          <m:t xml:space="preserve">= </m:t>
-        </m:r>
-        <m:r>
-          <m:rPr>
-            <m:sty m:val="p"/>
-          </m:rPr>
-          <w:rPr>
-            <w:rFonts w:ascii="Cambria Math" w:hAnsi="Cambria Math"/>
-            <w:color w:val="5B9BD5" w:themeColor="accent5"/>
-          </w:rPr>
-          <m:t>-0.007603502</m:t>
-        </m:r>
-      </m:oMath>
-    </w:p>
-    <w:p>
-      <w:r>
-        <w:rPr>
           <w:noProof/>
+          <w:color w:val="5B9BD5" w:themeColor="accent5"/>
         </w:rPr>
         <w:drawing>
-          <wp:inline distT="0" distB="0" distL="0" distR="0" wp14:anchorId="62CFDEFB">
+          <wp:inline distT="0" distB="0" distL="0" distR="0" wp14:anchorId="4B7E3DFC">
             <wp:extent cx="3064186" cy="2520000"/>
             <wp:effectExtent l="0" t="0" r="3175" b="0"/>
-            <wp:docPr id="18" name="圖片 18"/>
+            <wp:docPr id="16" name="圖片 16"/>
             <wp:cNvGraphicFramePr>
               <a:graphicFrameLocks xmlns:a="http://schemas.openxmlformats.org/drawingml/2006/main" noChangeAspect="1"/>
             </wp:cNvGraphicFramePr>
@@ -4566,7 +3838,7 @@
               <a:graphicData uri="http://schemas.openxmlformats.org/drawingml/2006/picture">
                 <pic:pic xmlns:pic="http://schemas.openxmlformats.org/drawingml/2006/picture">
                   <pic:nvPicPr>
-                    <pic:cNvPr id="0" name="Picture 7"/>
+                    <pic:cNvPr id="0" name="Picture 5"/>
                     <pic:cNvPicPr>
                       <a:picLocks noChangeAspect="1" noChangeArrowheads="1"/>
                     </pic:cNvPicPr>
@@ -4603,12 +3875,13 @@
       <w:r>
         <w:rPr>
           <w:noProof/>
+          <w:color w:val="5B9BD5" w:themeColor="accent5"/>
         </w:rPr>
         <w:drawing>
-          <wp:inline distT="0" distB="0" distL="0" distR="0" wp14:anchorId="0519E0B5">
+          <wp:inline distT="0" distB="0" distL="0" distR="0" wp14:anchorId="3B105CED">
             <wp:extent cx="3064186" cy="2520000"/>
             <wp:effectExtent l="0" t="0" r="3175" b="0"/>
-            <wp:docPr id="19" name="圖片 19"/>
+            <wp:docPr id="17" name="圖片 17"/>
             <wp:cNvGraphicFramePr>
               <a:graphicFrameLocks xmlns:a="http://schemas.openxmlformats.org/drawingml/2006/main" noChangeAspect="1"/>
             </wp:cNvGraphicFramePr>
@@ -4616,7 +3889,7 @@
               <a:graphicData uri="http://schemas.openxmlformats.org/drawingml/2006/picture">
                 <pic:pic xmlns:pic="http://schemas.openxmlformats.org/drawingml/2006/picture">
                   <pic:nvPicPr>
-                    <pic:cNvPr id="0" name="Picture 8"/>
+                    <pic:cNvPr id="0" name="Picture 6"/>
                     <pic:cNvPicPr>
                       <a:picLocks noChangeAspect="1" noChangeArrowheads="1"/>
                     </pic:cNvPicPr>
@@ -4652,16 +3925,788 @@
       </w:r>
     </w:p>
     <w:p>
+      <w:pPr>
+        <w:rPr>
+          <w:color w:val="FF0000"/>
+        </w:rPr>
+      </w:pPr>
+      <w:r>
+        <w:rPr>
+          <w:rFonts w:hint="eastAsia"/>
+          <w:color w:val="FF0000"/>
+        </w:rPr>
+        <w:t>Wh</w:t>
+      </w:r>
+      <w:r>
+        <w:rPr>
+          <w:color w:val="FF0000"/>
+        </w:rPr>
+        <w:t xml:space="preserve">y adding H can make </w:t>
+      </w:r>
+      <w:r>
+        <w:rPr>
+          <w:color w:val="FF0000"/>
+        </w:rPr>
+        <w:t>virulent strain wins?</w:t>
+      </w:r>
+    </w:p>
+    <w:p>
+      <w:pPr>
+        <w:rPr>
+          <w:color w:val="5B9BD5" w:themeColor="accent5"/>
+        </w:rPr>
+      </w:pPr>
+      <w:r>
+        <w:rPr>
+          <w:rFonts w:hint="eastAsia"/>
+          <w:color w:val="5B9BD5" w:themeColor="accent5"/>
+        </w:rPr>
+        <w:t>B</w:t>
+      </w:r>
+      <w:r>
+        <w:rPr>
+          <w:color w:val="5B9BD5" w:themeColor="accent5"/>
+        </w:rPr>
+        <w:t xml:space="preserve">ecause now </w:t>
+      </w:r>
+      <m:oMath>
+        <m:sSub>
+          <m:sSubPr>
+            <m:ctrlPr>
+              <w:rPr>
+                <w:rFonts w:ascii="Cambria Math" w:hAnsi="Cambria Math"/>
+                <w:color w:val="5B9BD5" w:themeColor="accent5"/>
+              </w:rPr>
+            </m:ctrlPr>
+          </m:sSubPr>
+          <m:e>
+            <m:r>
+              <m:rPr>
+                <m:sty m:val="p"/>
+              </m:rPr>
+              <w:rPr>
+                <w:rFonts w:ascii="Cambria Math" w:hAnsi="Cambria Math"/>
+                <w:color w:val="5B9BD5" w:themeColor="accent5"/>
+              </w:rPr>
+              <m:t>P</m:t>
+            </m:r>
+          </m:e>
+          <m:sub>
+            <m:r>
+              <m:rPr>
+                <m:sty m:val="p"/>
+              </m:rPr>
+              <w:rPr>
+                <w:rFonts w:ascii="Cambria Math" w:hAnsi="Cambria Math"/>
+                <w:color w:val="5B9BD5" w:themeColor="accent5"/>
+              </w:rPr>
+              <m:t>1</m:t>
+            </m:r>
+          </m:sub>
+        </m:sSub>
+      </m:oMath>
+      <w:r>
+        <w:rPr>
+          <w:rFonts w:hint="eastAsia"/>
+          <w:color w:val="5B9BD5" w:themeColor="accent5"/>
+        </w:rPr>
+        <w:t xml:space="preserve"> </w:t>
+      </w:r>
+      <w:r>
+        <w:rPr>
+          <w:color w:val="5B9BD5" w:themeColor="accent5"/>
+        </w:rPr>
+        <w:t xml:space="preserve">has higher mortality rate, and there are many </w:t>
+      </w:r>
+      <m:oMath>
+        <m:r>
+          <m:rPr>
+            <m:sty m:val="p"/>
+          </m:rPr>
+          <w:rPr>
+            <w:rFonts w:ascii="Cambria Math" w:hAnsi="Cambria Math"/>
+            <w:color w:val="5B9BD5" w:themeColor="accent5"/>
+          </w:rPr>
+          <m:t>H</m:t>
+        </m:r>
+      </m:oMath>
+      <w:r>
+        <w:rPr>
+          <w:rFonts w:hint="eastAsia"/>
+          <w:color w:val="5B9BD5" w:themeColor="accent5"/>
+        </w:rPr>
+        <w:t xml:space="preserve"> </w:t>
+      </w:r>
+      <w:r>
+        <w:rPr>
+          <w:color w:val="5B9BD5" w:themeColor="accent5"/>
+        </w:rPr>
+        <w:t xml:space="preserve">in the system, most of the </w:t>
+      </w:r>
+      <m:oMath>
+        <m:sSub>
+          <m:sSubPr>
+            <m:ctrlPr>
+              <w:rPr>
+                <w:rFonts w:ascii="Cambria Math" w:hAnsi="Cambria Math"/>
+                <w:color w:val="5B9BD5" w:themeColor="accent5"/>
+              </w:rPr>
+            </m:ctrlPr>
+          </m:sSubPr>
+          <m:e>
+            <m:r>
+              <m:rPr>
+                <m:sty m:val="p"/>
+              </m:rPr>
+              <w:rPr>
+                <w:rFonts w:ascii="Cambria Math" w:hAnsi="Cambria Math"/>
+                <w:color w:val="5B9BD5" w:themeColor="accent5"/>
+              </w:rPr>
+              <m:t>P</m:t>
+            </m:r>
+          </m:e>
+          <m:sub>
+            <m:r>
+              <m:rPr>
+                <m:sty m:val="p"/>
+              </m:rPr>
+              <w:rPr>
+                <w:rFonts w:ascii="Cambria Math" w:hAnsi="Cambria Math"/>
+                <w:color w:val="5B9BD5" w:themeColor="accent5"/>
+              </w:rPr>
+              <m:t>1</m:t>
+            </m:r>
+          </m:sub>
+        </m:sSub>
+      </m:oMath>
+      <w:r>
+        <w:rPr>
+          <w:rFonts w:hint="eastAsia"/>
+          <w:color w:val="5B9BD5" w:themeColor="accent5"/>
+        </w:rPr>
+        <w:t xml:space="preserve"> </w:t>
+      </w:r>
+      <w:r>
+        <w:rPr>
+          <w:color w:val="5B9BD5" w:themeColor="accent5"/>
+        </w:rPr>
+        <w:t xml:space="preserve">will become </w:t>
+      </w:r>
+      <m:oMath>
+        <m:sSub>
+          <m:sSubPr>
+            <m:ctrlPr>
+              <w:rPr>
+                <w:rFonts w:ascii="Cambria Math" w:hAnsi="Cambria Math"/>
+                <w:color w:val="5B9BD5" w:themeColor="accent5"/>
+              </w:rPr>
+            </m:ctrlPr>
+          </m:sSubPr>
+          <m:e>
+            <m:r>
+              <m:rPr>
+                <m:sty m:val="p"/>
+              </m:rPr>
+              <w:rPr>
+                <w:rFonts w:ascii="Cambria Math" w:hAnsi="Cambria Math"/>
+                <w:color w:val="5B9BD5" w:themeColor="accent5"/>
+              </w:rPr>
+              <m:t>P</m:t>
+            </m:r>
+          </m:e>
+          <m:sub>
+            <m:r>
+              <m:rPr>
+                <m:sty m:val="p"/>
+              </m:rPr>
+              <w:rPr>
+                <w:rFonts w:ascii="Cambria Math" w:hAnsi="Cambria Math"/>
+                <w:color w:val="5B9BD5" w:themeColor="accent5"/>
+              </w:rPr>
+              <m:t>1</m:t>
+            </m:r>
+            <m:r>
+              <m:rPr>
+                <m:lit/>
+                <m:sty m:val="p"/>
+              </m:rPr>
+              <w:rPr>
+                <w:rFonts w:ascii="Cambria Math" w:hAnsi="Cambria Math"/>
+                <w:color w:val="5B9BD5" w:themeColor="accent5"/>
+              </w:rPr>
+              <m:t>/</m:t>
+            </m:r>
+            <m:r>
+              <m:rPr>
+                <m:sty m:val="p"/>
+              </m:rPr>
+              <w:rPr>
+                <w:rFonts w:ascii="Cambria Math" w:hAnsi="Cambria Math"/>
+                <w:color w:val="5B9BD5" w:themeColor="accent5"/>
+              </w:rPr>
+              <m:t>H</m:t>
+            </m:r>
+          </m:sub>
+        </m:sSub>
+      </m:oMath>
+      <w:r>
+        <w:rPr>
+          <w:color w:val="5B9BD5" w:themeColor="accent5"/>
+        </w:rPr>
+        <w:t xml:space="preserve">. The high mortality of </w:t>
+      </w:r>
+      <m:oMath>
+        <m:sSub>
+          <m:sSubPr>
+            <m:ctrlPr>
+              <w:rPr>
+                <w:rFonts w:ascii="Cambria Math" w:hAnsi="Cambria Math"/>
+                <w:color w:val="5B9BD5" w:themeColor="accent5"/>
+              </w:rPr>
+            </m:ctrlPr>
+          </m:sSubPr>
+          <m:e>
+            <m:r>
+              <m:rPr>
+                <m:sty m:val="p"/>
+              </m:rPr>
+              <w:rPr>
+                <w:rFonts w:ascii="Cambria Math" w:hAnsi="Cambria Math"/>
+                <w:color w:val="5B9BD5" w:themeColor="accent5"/>
+              </w:rPr>
+              <m:t>P</m:t>
+            </m:r>
+          </m:e>
+          <m:sub>
+            <m:r>
+              <m:rPr>
+                <m:sty m:val="p"/>
+              </m:rPr>
+              <w:rPr>
+                <w:rFonts w:ascii="Cambria Math" w:hAnsi="Cambria Math"/>
+                <w:color w:val="5B9BD5" w:themeColor="accent5"/>
+              </w:rPr>
+              <m:t>1</m:t>
+            </m:r>
+            <m:r>
+              <m:rPr>
+                <m:lit/>
+                <m:sty m:val="p"/>
+              </m:rPr>
+              <w:rPr>
+                <w:rFonts w:ascii="Cambria Math" w:hAnsi="Cambria Math"/>
+                <w:color w:val="5B9BD5" w:themeColor="accent5"/>
+              </w:rPr>
+              <m:t>/</m:t>
+            </m:r>
+            <m:r>
+              <m:rPr>
+                <m:sty m:val="p"/>
+              </m:rPr>
+              <w:rPr>
+                <w:rFonts w:ascii="Cambria Math" w:hAnsi="Cambria Math"/>
+                <w:color w:val="5B9BD5" w:themeColor="accent5"/>
+              </w:rPr>
+              <m:t>H</m:t>
+            </m:r>
+          </m:sub>
+        </m:sSub>
+      </m:oMath>
+      <w:r>
+        <w:rPr>
+          <w:rFonts w:hint="eastAsia"/>
+          <w:color w:val="5B9BD5" w:themeColor="accent5"/>
+        </w:rPr>
+        <w:t xml:space="preserve"> </w:t>
+      </w:r>
+      <w:r>
+        <w:rPr>
+          <w:color w:val="5B9BD5" w:themeColor="accent5"/>
+        </w:rPr>
+        <w:t>and abundant H</w:t>
+      </w:r>
+      <w:r>
+        <w:rPr>
+          <w:rFonts w:hint="eastAsia"/>
+          <w:color w:val="5B9BD5" w:themeColor="accent5"/>
+        </w:rPr>
+        <w:t xml:space="preserve"> </w:t>
+      </w:r>
+      <w:r>
+        <w:rPr>
+          <w:color w:val="5B9BD5" w:themeColor="accent5"/>
+        </w:rPr>
+        <w:t xml:space="preserve">will make </w:t>
+      </w:r>
+      <m:oMath>
+        <m:sSub>
+          <m:sSubPr>
+            <m:ctrlPr>
+              <w:rPr>
+                <w:rFonts w:ascii="Cambria Math" w:hAnsi="Cambria Math"/>
+                <w:color w:val="5B9BD5" w:themeColor="accent5"/>
+              </w:rPr>
+            </m:ctrlPr>
+          </m:sSubPr>
+          <m:e>
+            <m:r>
+              <m:rPr>
+                <m:sty m:val="p"/>
+              </m:rPr>
+              <w:rPr>
+                <w:rFonts w:ascii="Cambria Math" w:hAnsi="Cambria Math"/>
+                <w:color w:val="5B9BD5" w:themeColor="accent5"/>
+              </w:rPr>
+              <m:t>P</m:t>
+            </m:r>
+          </m:e>
+          <m:sub>
+            <m:r>
+              <m:rPr>
+                <m:sty m:val="p"/>
+              </m:rPr>
+              <w:rPr>
+                <w:rFonts w:ascii="Cambria Math" w:hAnsi="Cambria Math"/>
+                <w:color w:val="5B9BD5" w:themeColor="accent5"/>
+              </w:rPr>
+              <m:t>1</m:t>
+            </m:r>
+            <m:r>
+              <m:rPr>
+                <m:lit/>
+                <m:sty m:val="p"/>
+              </m:rPr>
+              <w:rPr>
+                <w:rFonts w:ascii="Cambria Math" w:hAnsi="Cambria Math"/>
+                <w:color w:val="5B9BD5" w:themeColor="accent5"/>
+              </w:rPr>
+              <m:t>/</m:t>
+            </m:r>
+            <m:r>
+              <m:rPr>
+                <m:sty m:val="p"/>
+              </m:rPr>
+              <w:rPr>
+                <w:rFonts w:ascii="Cambria Math" w:hAnsi="Cambria Math"/>
+                <w:color w:val="5B9BD5" w:themeColor="accent5"/>
+              </w:rPr>
+              <m:t>H</m:t>
+            </m:r>
+          </m:sub>
+        </m:sSub>
+      </m:oMath>
+      <w:r>
+        <w:rPr>
+          <w:color w:val="5B9BD5" w:themeColor="accent5"/>
+        </w:rPr>
+        <w:t xml:space="preserve"> soon die of hyperparasite infection</w:t>
+      </w:r>
+      <w:r>
+        <w:rPr>
+          <w:rFonts w:hint="eastAsia"/>
+          <w:color w:val="5B9BD5" w:themeColor="accent5"/>
+        </w:rPr>
+        <w:t xml:space="preserve"> </w:t>
+      </w:r>
+      <w:r>
+        <w:rPr>
+          <w:color w:val="5B9BD5" w:themeColor="accent5"/>
+        </w:rPr>
+        <w:t>or die of natural mortality.</w:t>
+      </w:r>
+    </w:p>
+    <w:p>
+      <w:pPr>
+        <w:rPr>
+          <w:color w:val="5B9BD5" w:themeColor="accent5"/>
+        </w:rPr>
+      </w:pPr>
+      <w:r>
+        <w:rPr>
+          <w:color w:val="5B9BD5" w:themeColor="accent5"/>
+        </w:rPr>
+        <w:t xml:space="preserve">The reason why </w:t>
+      </w:r>
+      <m:oMath>
+        <m:sSub>
+          <m:sSubPr>
+            <m:ctrlPr>
+              <w:rPr>
+                <w:rFonts w:ascii="Cambria Math" w:hAnsi="Cambria Math"/>
+                <w:color w:val="5B9BD5" w:themeColor="accent5"/>
+              </w:rPr>
+            </m:ctrlPr>
+          </m:sSubPr>
+          <m:e>
+            <m:r>
+              <m:rPr>
+                <m:sty m:val="p"/>
+              </m:rPr>
+              <w:rPr>
+                <w:rFonts w:ascii="Cambria Math" w:hAnsi="Cambria Math"/>
+                <w:color w:val="5B9BD5" w:themeColor="accent5"/>
+              </w:rPr>
+              <m:t>E</m:t>
+            </m:r>
+          </m:e>
+          <m:sub>
+            <m:r>
+              <m:rPr>
+                <m:sty m:val="p"/>
+              </m:rPr>
+              <w:rPr>
+                <w:rFonts w:ascii="Cambria Math" w:hAnsi="Cambria Math"/>
+                <w:color w:val="5B9BD5" w:themeColor="accent5"/>
+              </w:rPr>
+              <m:t>2H</m:t>
+            </m:r>
+          </m:sub>
+        </m:sSub>
+      </m:oMath>
+      <w:r>
+        <w:rPr>
+          <w:rFonts w:hint="eastAsia"/>
+          <w:color w:val="5B9BD5" w:themeColor="accent5"/>
+        </w:rPr>
+        <w:t xml:space="preserve"> </w:t>
+      </w:r>
+      <w:r>
+        <w:rPr>
+          <w:color w:val="5B9BD5" w:themeColor="accent5"/>
+        </w:rPr>
+        <w:t xml:space="preserve">would have more </w:t>
+      </w:r>
+      <m:oMath>
+        <m:r>
+          <m:rPr>
+            <m:sty m:val="p"/>
+          </m:rPr>
+          <w:rPr>
+            <w:rFonts w:ascii="Cambria Math" w:hAnsi="Cambria Math"/>
+            <w:color w:val="5B9BD5" w:themeColor="accent5"/>
+          </w:rPr>
+          <m:t>H</m:t>
+        </m:r>
+      </m:oMath>
+      <w:r>
+        <w:rPr>
+          <w:rFonts w:hint="eastAsia"/>
+          <w:color w:val="5B9BD5" w:themeColor="accent5"/>
+        </w:rPr>
+        <w:t xml:space="preserve"> </w:t>
+      </w:r>
+      <w:r>
+        <w:rPr>
+          <w:color w:val="5B9BD5" w:themeColor="accent5"/>
+        </w:rPr>
+        <w:t>is that</w:t>
+      </w:r>
+      <w:r>
+        <w:rPr>
+          <w:color w:val="5B9BD5" w:themeColor="accent5"/>
+        </w:rPr>
+        <w:t xml:space="preserve"> </w:t>
+      </w:r>
+      <m:oMath>
+        <m:sSub>
+          <m:sSubPr>
+            <m:ctrlPr>
+              <w:rPr>
+                <w:rFonts w:ascii="Cambria Math" w:hAnsi="Cambria Math"/>
+                <w:color w:val="5B9BD5" w:themeColor="accent5"/>
+              </w:rPr>
+            </m:ctrlPr>
+          </m:sSubPr>
+          <m:e>
+            <m:r>
+              <m:rPr>
+                <m:sty m:val="p"/>
+              </m:rPr>
+              <w:rPr>
+                <w:rFonts w:ascii="Cambria Math" w:hAnsi="Cambria Math"/>
+                <w:color w:val="5B9BD5" w:themeColor="accent5"/>
+              </w:rPr>
+              <m:t>P</m:t>
+            </m:r>
+          </m:e>
+          <m:sub>
+            <m:r>
+              <m:rPr>
+                <m:sty m:val="p"/>
+              </m:rPr>
+              <w:rPr>
+                <w:rFonts w:ascii="Cambria Math" w:hAnsi="Cambria Math"/>
+                <w:color w:val="5B9BD5" w:themeColor="accent5"/>
+              </w:rPr>
+              <m:t>2</m:t>
+            </m:r>
+          </m:sub>
+        </m:sSub>
+      </m:oMath>
+      <w:r>
+        <w:rPr>
+          <w:rFonts w:hint="eastAsia"/>
+          <w:color w:val="5B9BD5" w:themeColor="accent5"/>
+        </w:rPr>
+        <w:t xml:space="preserve"> </w:t>
+      </w:r>
+      <w:r>
+        <w:rPr>
+          <w:color w:val="5B9BD5" w:themeColor="accent5"/>
+        </w:rPr>
+        <w:t>alone</w:t>
+      </w:r>
+      <w:r>
+        <w:rPr>
+          <w:color w:val="5B9BD5" w:themeColor="accent5"/>
+        </w:rPr>
+        <w:t xml:space="preserve"> can </w:t>
+      </w:r>
+      <w:r>
+        <w:rPr>
+          <w:color w:val="5B9BD5" w:themeColor="accent5"/>
+        </w:rPr>
+        <w:t xml:space="preserve">contribute more </w:t>
+      </w:r>
+      <m:oMath>
+        <m:r>
+          <m:rPr>
+            <m:sty m:val="p"/>
+          </m:rPr>
+          <w:rPr>
+            <w:rFonts w:ascii="Cambria Math" w:hAnsi="Cambria Math"/>
+            <w:color w:val="5B9BD5" w:themeColor="accent5"/>
+          </w:rPr>
+          <m:t>H</m:t>
+        </m:r>
+      </m:oMath>
+      <w:r>
+        <w:rPr>
+          <w:rFonts w:hint="eastAsia"/>
+          <w:color w:val="5B9BD5" w:themeColor="accent5"/>
+        </w:rPr>
+        <w:t xml:space="preserve"> </w:t>
+      </w:r>
+      <w:r>
+        <w:rPr>
+          <w:color w:val="5B9BD5" w:themeColor="accent5"/>
+        </w:rPr>
+        <w:t xml:space="preserve">in the system compared to the situation </w:t>
+      </w:r>
+      <w:r>
+        <w:rPr>
+          <w:color w:val="5B9BD5" w:themeColor="accent5"/>
+        </w:rPr>
+        <w:t>where</w:t>
+      </w:r>
+      <w:r>
+        <w:rPr>
+          <w:color w:val="5B9BD5" w:themeColor="accent5"/>
+        </w:rPr>
+        <w:t xml:space="preserve"> two strains coexist.</w:t>
+      </w:r>
+    </w:p>
+    <w:p>
+      <w:pPr>
+        <w:rPr>
+          <w:color w:val="5B9BD5" w:themeColor="accent5"/>
+        </w:rPr>
+      </w:pPr>
+    </w:p>
+    <w:p>
+      <w:r>
+        <w:rPr>
+          <w:rFonts w:hint="eastAsia"/>
+        </w:rPr>
+        <w:t>Si</w:t>
+      </w:r>
+      <w:r>
+        <w:t xml:space="preserve">mulation result of how many H is needed to switch the equilibrium from </w:t>
+      </w:r>
+      <m:oMath>
+        <m:sSub>
+          <m:sSubPr>
+            <m:ctrlPr>
+              <w:rPr>
+                <w:rFonts w:ascii="Cambria Math" w:hAnsi="Cambria Math"/>
+              </w:rPr>
+            </m:ctrlPr>
+          </m:sSubPr>
+          <m:e>
+            <m:r>
+              <m:rPr>
+                <m:sty m:val="p"/>
+              </m:rPr>
+              <w:rPr>
+                <w:rFonts w:ascii="Cambria Math" w:hAnsi="Cambria Math"/>
+              </w:rPr>
+              <m:t>E</m:t>
+            </m:r>
+          </m:e>
+          <m:sub>
+            <m:r>
+              <m:rPr>
+                <m:sty m:val="p"/>
+              </m:rPr>
+              <w:rPr>
+                <w:rFonts w:ascii="Cambria Math" w:hAnsi="Cambria Math"/>
+              </w:rPr>
+              <m:t>C</m:t>
+            </m:r>
+          </m:sub>
+        </m:sSub>
+      </m:oMath>
+      <w:r>
+        <w:rPr>
+          <w:rFonts w:hint="eastAsia"/>
+        </w:rPr>
+        <w:t xml:space="preserve"> </w:t>
+      </w:r>
+      <w:r>
+        <w:t xml:space="preserve">to </w:t>
+      </w:r>
+      <m:oMath>
+        <m:sSub>
+          <m:sSubPr>
+            <m:ctrlPr>
+              <w:rPr>
+                <w:rFonts w:ascii="Cambria Math" w:hAnsi="Cambria Math"/>
+              </w:rPr>
+            </m:ctrlPr>
+          </m:sSubPr>
+          <m:e>
+            <m:r>
+              <m:rPr>
+                <m:sty m:val="p"/>
+              </m:rPr>
+              <w:rPr>
+                <w:rFonts w:ascii="Cambria Math" w:hAnsi="Cambria Math"/>
+              </w:rPr>
+              <m:t>E</m:t>
+            </m:r>
+          </m:e>
+          <m:sub>
+            <m:r>
+              <m:rPr>
+                <m:sty m:val="p"/>
+              </m:rPr>
+              <w:rPr>
+                <w:rFonts w:ascii="Cambria Math" w:hAnsi="Cambria Math"/>
+              </w:rPr>
+              <m:t>2H</m:t>
+            </m:r>
+          </m:sub>
+        </m:sSub>
+      </m:oMath>
+      <w:r>
+        <w:rPr>
+          <w:rFonts w:hint="eastAsia"/>
+        </w:rPr>
+        <w:t>.</w:t>
+      </w:r>
+    </w:p>
+    <w:p>
+      <w:pPr>
+        <w:rPr>
+          <w:sz w:val="20"/>
+        </w:rPr>
+      </w:pPr>
+      <w:r>
+        <w:rPr>
+          <w:rFonts w:hint="eastAsia"/>
+          <w:sz w:val="20"/>
+        </w:rPr>
+        <w:t>(</w:t>
+      </w:r>
+      <w:r>
+        <w:rPr>
+          <w:sz w:val="20"/>
+        </w:rPr>
+        <w:t xml:space="preserve">File: H to change the </w:t>
+      </w:r>
+      <w:r>
+        <w:rPr>
+          <w:sz w:val="20"/>
+        </w:rPr>
+        <w:t>equilibrium</w:t>
+      </w:r>
+      <w:r>
+        <w:rPr>
+          <w:sz w:val="20"/>
+        </w:rPr>
+        <w:t xml:space="preserve"> from Pre4A1 Press001</w:t>
+      </w:r>
+      <w:r>
+        <w:rPr>
+          <w:sz w:val="20"/>
+        </w:rPr>
+        <w:t xml:space="preserve">, </w:t>
+      </w:r>
+    </w:p>
+    <w:p>
+      <w:pPr>
+        <w:rPr>
+          <w:sz w:val="20"/>
+        </w:rPr>
+      </w:pPr>
+      <w:r>
+        <w:rPr>
+          <w:sz w:val="20"/>
+        </w:rPr>
+        <w:t xml:space="preserve">H to change the </w:t>
+      </w:r>
+      <w:proofErr w:type="spellStart"/>
+      <w:r>
+        <w:rPr>
+          <w:sz w:val="20"/>
+        </w:rPr>
+        <w:t>equilibirum</w:t>
+      </w:r>
+      <w:proofErr w:type="spellEnd"/>
+      <w:r>
+        <w:rPr>
+          <w:sz w:val="20"/>
+        </w:rPr>
+        <w:t xml:space="preserve"> from Pre4A1 </w:t>
+      </w:r>
+      <w:proofErr w:type="spellStart"/>
+      <w:r>
+        <w:rPr>
+          <w:sz w:val="20"/>
+        </w:rPr>
+        <w:t>bisec</w:t>
+      </w:r>
+      <w:proofErr w:type="spellEnd"/>
+      <w:r>
+        <w:rPr>
+          <w:sz w:val="20"/>
+        </w:rPr>
+        <w:t xml:space="preserve"> 2</w:t>
+      </w:r>
+      <w:r>
+        <w:rPr>
+          <w:sz w:val="20"/>
+        </w:rPr>
+        <w:t>)</w:t>
+      </w:r>
+    </w:p>
+    <w:p>
+      <w:pPr>
+        <w:rPr>
+          <w:color w:val="5B9BD5" w:themeColor="accent5"/>
+        </w:rPr>
+      </w:pPr>
       <w:r>
         <w:rPr>
           <w:noProof/>
+          <w:color w:val="5B9BD5" w:themeColor="accent5"/>
         </w:rPr>
         <w:lastRenderedPageBreak/>
         <w:drawing>
-          <wp:inline distT="0" distB="0" distL="0" distR="0" wp14:anchorId="30B9ACBB">
-            <wp:extent cx="3064186" cy="2520000"/>
-            <wp:effectExtent l="0" t="0" r="3175" b="0"/>
-            <wp:docPr id="23" name="圖片 23"/>
+          <wp:inline distT="0" distB="0" distL="0" distR="0" wp14:anchorId="6014F5EB">
+            <wp:extent cx="3084779" cy="2145933"/>
+            <wp:effectExtent l="0" t="0" r="1905" b="6985"/>
+            <wp:docPr id="34" name="圖片 34"/>
             <wp:cNvGraphicFramePr>
               <a:graphicFrameLocks xmlns:a="http://schemas.openxmlformats.org/drawingml/2006/main" noChangeAspect="1"/>
             </wp:cNvGraphicFramePr>
@@ -4669,13 +4714,776 @@
               <a:graphicData uri="http://schemas.openxmlformats.org/drawingml/2006/picture">
                 <pic:pic xmlns:pic="http://schemas.openxmlformats.org/drawingml/2006/picture">
                   <pic:nvPicPr>
-                    <pic:cNvPr id="0" name="Picture 10"/>
+                    <pic:cNvPr id="0" name="Picture 3"/>
                     <pic:cNvPicPr>
                       <a:picLocks noChangeAspect="1" noChangeArrowheads="1"/>
                     </pic:cNvPicPr>
                   </pic:nvPicPr>
                   <pic:blipFill>
                     <a:blip r:embed="rId29">
+                      <a:extLst>
+                        <a:ext uri="{28A0092B-C50C-407E-A947-70E740481C1C}">
+                          <a14:useLocalDpi xmlns:a14="http://schemas.microsoft.com/office/drawing/2010/main" val="0"/>
+                        </a:ext>
+                      </a:extLst>
+                    </a:blip>
+                    <a:srcRect/>
+                    <a:stretch>
+                      <a:fillRect/>
+                    </a:stretch>
+                  </pic:blipFill>
+                  <pic:spPr bwMode="auto">
+                    <a:xfrm>
+                      <a:off x="0" y="0"/>
+                      <a:ext cx="3105041" cy="2160028"/>
+                    </a:xfrm>
+                    <a:prstGeom prst="rect">
+                      <a:avLst/>
+                    </a:prstGeom>
+                    <a:noFill/>
+                  </pic:spPr>
+                </pic:pic>
+              </a:graphicData>
+            </a:graphic>
+          </wp:inline>
+        </w:drawing>
+      </w:r>
+      <w:r>
+        <w:rPr>
+          <w:noProof/>
+          <w:color w:val="5B9BD5" w:themeColor="accent5"/>
+        </w:rPr>
+        <w:drawing>
+          <wp:inline distT="0" distB="0" distL="0" distR="0" wp14:anchorId="215773B9">
+            <wp:extent cx="2511657" cy="2023653"/>
+            <wp:effectExtent l="0" t="0" r="3175" b="0"/>
+            <wp:docPr id="46" name="圖片 46"/>
+            <wp:cNvGraphicFramePr>
+              <a:graphicFrameLocks xmlns:a="http://schemas.openxmlformats.org/drawingml/2006/main" noChangeAspect="1"/>
+            </wp:cNvGraphicFramePr>
+            <a:graphic xmlns:a="http://schemas.openxmlformats.org/drawingml/2006/main">
+              <a:graphicData uri="http://schemas.openxmlformats.org/drawingml/2006/picture">
+                <pic:pic xmlns:pic="http://schemas.openxmlformats.org/drawingml/2006/picture">
+                  <pic:nvPicPr>
+                    <pic:cNvPr id="0" name="Picture 5"/>
+                    <pic:cNvPicPr>
+                      <a:picLocks noChangeAspect="1" noChangeArrowheads="1"/>
+                    </pic:cNvPicPr>
+                  </pic:nvPicPr>
+                  <pic:blipFill>
+                    <a:blip r:embed="rId30">
+                      <a:extLst>
+                        <a:ext uri="{28A0092B-C50C-407E-A947-70E740481C1C}">
+                          <a14:useLocalDpi xmlns:a14="http://schemas.microsoft.com/office/drawing/2010/main" val="0"/>
+                        </a:ext>
+                      </a:extLst>
+                    </a:blip>
+                    <a:srcRect/>
+                    <a:stretch>
+                      <a:fillRect/>
+                    </a:stretch>
+                  </pic:blipFill>
+                  <pic:spPr bwMode="auto">
+                    <a:xfrm>
+                      <a:off x="0" y="0"/>
+                      <a:ext cx="2528343" cy="2037097"/>
+                    </a:xfrm>
+                    <a:prstGeom prst="rect">
+                      <a:avLst/>
+                    </a:prstGeom>
+                    <a:noFill/>
+                  </pic:spPr>
+                </pic:pic>
+              </a:graphicData>
+            </a:graphic>
+          </wp:inline>
+        </w:drawing>
+      </w:r>
+    </w:p>
+    <w:p>
+      <w:r>
+        <w:rPr>
+          <w:rFonts w:hint="eastAsia"/>
+        </w:rPr>
+        <w:t>F</w:t>
+      </w:r>
+      <w:r>
+        <w:t xml:space="preserve">ix </w:t>
+      </w:r>
+      <m:oMath>
+        <m:sSub>
+          <m:sSubPr>
+            <m:ctrlPr>
+              <w:rPr>
+                <w:rFonts w:ascii="Cambria Math" w:hAnsi="Cambria Math"/>
+              </w:rPr>
+            </m:ctrlPr>
+          </m:sSubPr>
+          <m:e>
+            <m:r>
+              <m:rPr>
+                <m:sty m:val="p"/>
+              </m:rPr>
+              <w:rPr>
+                <w:rFonts w:ascii="Cambria Math" w:hAnsi="Cambria Math"/>
+              </w:rPr>
+              <m:t>m</m:t>
+            </m:r>
+          </m:e>
+          <m:sub>
+            <m:r>
+              <m:rPr>
+                <m:sty m:val="p"/>
+              </m:rPr>
+              <w:rPr>
+                <w:rFonts w:ascii="Cambria Math" w:hAnsi="Cambria Math"/>
+              </w:rPr>
+              <m:t>1</m:t>
+            </m:r>
+          </m:sub>
+        </m:sSub>
+        <m:r>
+          <w:rPr>
+            <w:rFonts w:ascii="Cambria Math" w:hAnsi="Cambria Math"/>
+          </w:rPr>
+          <m:t xml:space="preserve"> = 0.05</m:t>
+        </m:r>
+      </m:oMath>
+    </w:p>
+    <w:p>
+      <m:oMath>
+        <m:r>
+          <m:rPr>
+            <m:sty m:val="p"/>
+          </m:rPr>
+          <w:rPr>
+            <w:rFonts w:ascii="Cambria Math" w:hAnsi="Cambria Math" w:hint="eastAsia"/>
+          </w:rPr>
+          <m:t>Δ</m:t>
+        </m:r>
+        <m:r>
+          <m:rPr>
+            <m:sty m:val="p"/>
+          </m:rPr>
+          <w:rPr>
+            <w:rFonts w:ascii="Cambria Math" w:hAnsi="Cambria Math"/>
+          </w:rPr>
+          <m:t>H</m:t>
+        </m:r>
+      </m:oMath>
+      <w:r>
+        <w:rPr>
+          <w:rFonts w:hint="eastAsia"/>
+        </w:rPr>
+        <w:t xml:space="preserve"> </w:t>
+      </w:r>
+      <w:r>
+        <w:t>represents the additional H beyond the equilibrium density of H.</w:t>
+      </w:r>
+    </w:p>
+    <w:p/>
+    <w:p>
+      <w:pPr>
+        <w:rPr>
+          <w:color w:val="5B9BD5" w:themeColor="accent5"/>
+        </w:rPr>
+      </w:pPr>
+      <w:r>
+        <w:rPr>
+          <w:color w:val="5B9BD5" w:themeColor="accent5"/>
+        </w:rPr>
+        <w:t xml:space="preserve">It is expected that increasing </w:t>
+      </w:r>
+      <m:oMath>
+        <m:sSub>
+          <m:sSubPr>
+            <m:ctrlPr>
+              <w:rPr>
+                <w:rFonts w:ascii="Cambria Math" w:hAnsi="Cambria Math"/>
+                <w:color w:val="5B9BD5" w:themeColor="accent5"/>
+              </w:rPr>
+            </m:ctrlPr>
+          </m:sSubPr>
+          <m:e>
+            <m:r>
+              <m:rPr>
+                <m:sty m:val="p"/>
+              </m:rPr>
+              <w:rPr>
+                <w:rFonts w:ascii="Cambria Math" w:hAnsi="Cambria Math"/>
+                <w:color w:val="5B9BD5" w:themeColor="accent5"/>
+              </w:rPr>
+              <m:t>m</m:t>
+            </m:r>
+          </m:e>
+          <m:sub>
+            <m:r>
+              <m:rPr>
+                <m:sty m:val="p"/>
+              </m:rPr>
+              <w:rPr>
+                <w:rFonts w:ascii="Cambria Math" w:hAnsi="Cambria Math"/>
+                <w:color w:val="5B9BD5" w:themeColor="accent5"/>
+              </w:rPr>
+              <m:t>2</m:t>
+            </m:r>
+          </m:sub>
+        </m:sSub>
+      </m:oMath>
+      <w:r>
+        <w:rPr>
+          <w:rFonts w:hint="eastAsia"/>
+          <w:color w:val="5B9BD5" w:themeColor="accent5"/>
+        </w:rPr>
+        <w:t xml:space="preserve"> </w:t>
+      </w:r>
+      <w:r>
+        <w:rPr>
+          <w:color w:val="5B9BD5" w:themeColor="accent5"/>
+        </w:rPr>
+        <w:t xml:space="preserve">will </w:t>
+      </w:r>
+      <w:r>
+        <w:rPr>
+          <w:color w:val="5B9BD5" w:themeColor="accent5"/>
+        </w:rPr>
+        <w:t>increase</w:t>
+      </w:r>
+      <w:r>
+        <w:rPr>
+          <w:color w:val="5B9BD5" w:themeColor="accent5"/>
+        </w:rPr>
+        <w:t xml:space="preserve"> the critical value of additional H, because </w:t>
+      </w:r>
+      <w:r>
+        <w:rPr>
+          <w:color w:val="5B9BD5" w:themeColor="accent5"/>
+        </w:rPr>
+        <w:t xml:space="preserve">the mortality of </w:t>
+      </w:r>
+      <m:oMath>
+        <m:sSub>
+          <m:sSubPr>
+            <m:ctrlPr>
+              <w:rPr>
+                <w:rFonts w:ascii="Cambria Math" w:hAnsi="Cambria Math"/>
+                <w:color w:val="5B9BD5" w:themeColor="accent5"/>
+              </w:rPr>
+            </m:ctrlPr>
+          </m:sSubPr>
+          <m:e>
+            <m:r>
+              <m:rPr>
+                <m:sty m:val="p"/>
+              </m:rPr>
+              <w:rPr>
+                <w:rFonts w:ascii="Cambria Math" w:hAnsi="Cambria Math"/>
+                <w:color w:val="5B9BD5" w:themeColor="accent5"/>
+              </w:rPr>
+              <m:t>P</m:t>
+            </m:r>
+          </m:e>
+          <m:sub>
+            <m:r>
+              <m:rPr>
+                <m:sty m:val="p"/>
+              </m:rPr>
+              <w:rPr>
+                <w:rFonts w:ascii="Cambria Math" w:hAnsi="Cambria Math"/>
+                <w:color w:val="5B9BD5" w:themeColor="accent5"/>
+              </w:rPr>
+              <m:t>2</m:t>
+            </m:r>
+          </m:sub>
+        </m:sSub>
+      </m:oMath>
+      <w:r>
+        <w:rPr>
+          <w:rFonts w:hint="eastAsia"/>
+          <w:color w:val="5B9BD5" w:themeColor="accent5"/>
+        </w:rPr>
+        <w:t xml:space="preserve"> </w:t>
+      </w:r>
+      <w:r>
+        <w:rPr>
+          <w:color w:val="5B9BD5" w:themeColor="accent5"/>
+        </w:rPr>
+        <w:t>is expected to be harmful for it.</w:t>
+      </w:r>
+      <w:r>
+        <w:rPr>
+          <w:rFonts w:hint="eastAsia"/>
+          <w:color w:val="5B9BD5" w:themeColor="accent5"/>
+        </w:rPr>
+        <w:t xml:space="preserve"> </w:t>
+      </w:r>
+      <w:r>
+        <w:rPr>
+          <w:color w:val="5B9BD5" w:themeColor="accent5"/>
+        </w:rPr>
+        <w:t>As anticipated</w:t>
+      </w:r>
+      <w:r>
+        <w:rPr>
+          <w:color w:val="5B9BD5" w:themeColor="accent5"/>
+        </w:rPr>
+        <w:t>,</w:t>
+      </w:r>
+      <w:r>
+        <w:rPr>
+          <w:rFonts w:hint="eastAsia"/>
+          <w:color w:val="5B9BD5" w:themeColor="accent5"/>
+        </w:rPr>
+        <w:t xml:space="preserve"> </w:t>
+      </w:r>
+      <w:r>
+        <w:rPr>
+          <w:color w:val="5B9BD5" w:themeColor="accent5"/>
+        </w:rPr>
+        <w:t>b</w:t>
+      </w:r>
+      <w:r>
+        <w:rPr>
+          <w:color w:val="5B9BD5" w:themeColor="accent5"/>
+        </w:rPr>
+        <w:t xml:space="preserve">y increasing </w:t>
+      </w:r>
+      <m:oMath>
+        <m:sSub>
+          <m:sSubPr>
+            <m:ctrlPr>
+              <w:rPr>
+                <w:rFonts w:ascii="Cambria Math" w:hAnsi="Cambria Math"/>
+                <w:color w:val="5B9BD5" w:themeColor="accent5"/>
+              </w:rPr>
+            </m:ctrlPr>
+          </m:sSubPr>
+          <m:e>
+            <m:r>
+              <m:rPr>
+                <m:sty m:val="p"/>
+              </m:rPr>
+              <w:rPr>
+                <w:rFonts w:ascii="Cambria Math" w:hAnsi="Cambria Math"/>
+                <w:color w:val="5B9BD5" w:themeColor="accent5"/>
+              </w:rPr>
+              <m:t>m</m:t>
+            </m:r>
+          </m:e>
+          <m:sub>
+            <m:r>
+              <m:rPr>
+                <m:sty m:val="p"/>
+              </m:rPr>
+              <w:rPr>
+                <w:rFonts w:ascii="Cambria Math" w:hAnsi="Cambria Math"/>
+                <w:color w:val="5B9BD5" w:themeColor="accent5"/>
+              </w:rPr>
+              <m:t>2</m:t>
+            </m:r>
+          </m:sub>
+        </m:sSub>
+      </m:oMath>
+      <w:r>
+        <w:rPr>
+          <w:color w:val="5B9BD5" w:themeColor="accent5"/>
+        </w:rPr>
+        <w:t xml:space="preserve">, more H is needed to perturbate the original equilibrium </w:t>
+      </w:r>
+      <w:proofErr w:type="gramStart"/>
+      <w:r>
+        <w:rPr>
+          <w:color w:val="5B9BD5" w:themeColor="accent5"/>
+        </w:rPr>
+        <w:t>point</w:t>
+      </w:r>
+      <w:proofErr w:type="gramEnd"/>
+      <w:r>
+        <w:rPr>
+          <w:color w:val="5B9BD5" w:themeColor="accent5"/>
+        </w:rPr>
+        <w:t xml:space="preserve"> from</w:t>
+      </w:r>
+      <w:r>
+        <w:rPr>
+          <w:color w:val="5B9BD5" w:themeColor="accent5"/>
+        </w:rPr>
+        <w:t xml:space="preserve"> </w:t>
+      </w:r>
+      <m:oMath>
+        <m:sSub>
+          <m:sSubPr>
+            <m:ctrlPr>
+              <w:rPr>
+                <w:rFonts w:ascii="Cambria Math" w:hAnsi="Cambria Math"/>
+                <w:color w:val="5B9BD5" w:themeColor="accent5"/>
+              </w:rPr>
+            </m:ctrlPr>
+          </m:sSubPr>
+          <m:e>
+            <m:r>
+              <m:rPr>
+                <m:sty m:val="p"/>
+              </m:rPr>
+              <w:rPr>
+                <w:rFonts w:ascii="Cambria Math" w:hAnsi="Cambria Math"/>
+                <w:color w:val="5B9BD5" w:themeColor="accent5"/>
+              </w:rPr>
+              <m:t>E</m:t>
+            </m:r>
+          </m:e>
+          <m:sub>
+            <m:r>
+              <m:rPr>
+                <m:sty m:val="p"/>
+              </m:rPr>
+              <w:rPr>
+                <w:rFonts w:ascii="Cambria Math" w:hAnsi="Cambria Math"/>
+                <w:color w:val="5B9BD5" w:themeColor="accent5"/>
+              </w:rPr>
+              <m:t>C</m:t>
+            </m:r>
+          </m:sub>
+        </m:sSub>
+      </m:oMath>
+      <w:r>
+        <w:rPr>
+          <w:rFonts w:hint="eastAsia"/>
+          <w:color w:val="5B9BD5" w:themeColor="accent5"/>
+        </w:rPr>
+        <w:t>.</w:t>
+      </w:r>
+      <w:r>
+        <w:rPr>
+          <w:color w:val="5B9BD5" w:themeColor="accent5"/>
+        </w:rPr>
+        <w:t xml:space="preserve"> Plus,</w:t>
+      </w:r>
+      <w:r>
+        <w:rPr>
+          <w:color w:val="5B9BD5" w:themeColor="accent5"/>
+        </w:rPr>
+        <w:t xml:space="preserve"> there </w:t>
+      </w:r>
+      <w:r>
+        <w:rPr>
+          <w:color w:val="5B9BD5" w:themeColor="accent5"/>
+        </w:rPr>
+        <w:t>seems to be no</w:t>
+      </w:r>
+      <w:r>
+        <w:rPr>
+          <w:color w:val="5B9BD5" w:themeColor="accent5"/>
+        </w:rPr>
+        <w:t xml:space="preserve"> hydra effect</w:t>
+      </w:r>
+      <w:r>
+        <w:rPr>
+          <w:color w:val="5B9BD5" w:themeColor="accent5"/>
+        </w:rPr>
+        <w:t xml:space="preserve"> on P</w:t>
+      </w:r>
+      <w:r>
+        <w:rPr>
+          <w:color w:val="5B9BD5" w:themeColor="accent5"/>
+          <w:vertAlign w:val="subscript"/>
+        </w:rPr>
+        <w:t>2</w:t>
+      </w:r>
+      <w:r>
+        <w:rPr>
+          <w:color w:val="5B9BD5" w:themeColor="accent5"/>
+        </w:rPr>
+        <w:t>.</w:t>
+      </w:r>
+    </w:p>
+    <w:p>
+      <w:pPr>
+        <w:rPr>
+          <w:color w:val="5B9BD5" w:themeColor="accent5"/>
+        </w:rPr>
+      </w:pPr>
+      <w:r>
+        <w:rPr>
+          <w:color w:val="5B9BD5" w:themeColor="accent5"/>
+        </w:rPr>
+        <w:t>#Examine t</w:t>
+      </w:r>
+      <w:r>
+        <w:rPr>
+          <w:color w:val="5B9BD5" w:themeColor="accent5"/>
+        </w:rPr>
+        <w:t>he</w:t>
+      </w:r>
+      <w:r>
+        <w:rPr>
+          <w:color w:val="5B9BD5" w:themeColor="accent5"/>
+        </w:rPr>
+        <w:t xml:space="preserve"> hydra effect</w:t>
+      </w:r>
+      <w:r>
+        <w:rPr>
+          <w:color w:val="5B9BD5" w:themeColor="accent5"/>
+        </w:rPr>
+        <w:t xml:space="preserve"> (</w:t>
+      </w:r>
+      <w:proofErr w:type="spellStart"/>
+      <w:r>
+        <w:rPr>
+          <w:color w:val="5B9BD5" w:themeColor="accent5"/>
+        </w:rPr>
+        <w:t>dP</w:t>
+      </w:r>
+      <w:proofErr w:type="spellEnd"/>
+      <w:r>
+        <w:rPr>
+          <w:color w:val="5B9BD5" w:themeColor="accent5"/>
+        </w:rPr>
+        <w:t>*/</w:t>
+      </w:r>
+      <w:proofErr w:type="gramStart"/>
+      <w:r>
+        <w:rPr>
+          <w:color w:val="5B9BD5" w:themeColor="accent5"/>
+        </w:rPr>
+        <w:t>dm)</w:t>
+      </w:r>
+      <w:r>
+        <w:rPr>
+          <w:rFonts w:hint="eastAsia"/>
+          <w:color w:val="5B9BD5" w:themeColor="accent5"/>
+        </w:rPr>
+        <w:t>----</w:t>
+      </w:r>
+      <w:proofErr w:type="gramEnd"/>
+    </w:p>
+    <w:p>
+      <w:pPr>
+        <w:rPr>
+          <w:color w:val="5B9BD5" w:themeColor="accent5"/>
+        </w:rPr>
+      </w:pPr>
+    </w:p>
+    <w:p>
+      <w:pPr>
+        <w:rPr>
+          <w:color w:val="5B9BD5" w:themeColor="accent5"/>
+        </w:rPr>
+      </w:pPr>
+      <w:r>
+        <w:rPr>
+          <w:rFonts w:hint="eastAsia"/>
+          <w:color w:val="5B9BD5" w:themeColor="accent5"/>
+        </w:rPr>
+        <w:t>W</w:t>
+      </w:r>
+      <w:r>
+        <w:rPr>
+          <w:color w:val="5B9BD5" w:themeColor="accent5"/>
+        </w:rPr>
+        <w:t xml:space="preserve">hen </w:t>
+      </w:r>
+      <m:oMath>
+        <m:sSub>
+          <m:sSubPr>
+            <m:ctrlPr>
+              <w:rPr>
+                <w:rFonts w:ascii="Cambria Math" w:hAnsi="Cambria Math"/>
+                <w:color w:val="5B9BD5" w:themeColor="accent5"/>
+              </w:rPr>
+            </m:ctrlPr>
+          </m:sSubPr>
+          <m:e>
+            <m:r>
+              <w:rPr>
+                <w:rFonts w:ascii="Cambria Math" w:hAnsi="Cambria Math"/>
+                <w:color w:val="5B9BD5" w:themeColor="accent5"/>
+              </w:rPr>
+              <m:t>P</m:t>
+            </m:r>
+          </m:e>
+          <m:sub>
+            <m:r>
+              <m:rPr>
+                <m:sty m:val="p"/>
+              </m:rPr>
+              <w:rPr>
+                <w:rFonts w:ascii="Cambria Math" w:hAnsi="Cambria Math"/>
+                <w:color w:val="5B9BD5" w:themeColor="accent5"/>
+              </w:rPr>
+              <m:t>2</m:t>
+            </m:r>
+          </m:sub>
+        </m:sSub>
+        <m:r>
+          <m:rPr>
+            <m:sty m:val="p"/>
+          </m:rPr>
+          <w:rPr>
+            <w:rFonts w:ascii="Cambria Math" w:hAnsi="Cambria Math"/>
+            <w:color w:val="5B9BD5" w:themeColor="accent5"/>
+          </w:rPr>
+          <m:t>+</m:t>
+        </m:r>
+        <m:sSub>
+          <m:sSubPr>
+            <m:ctrlPr>
+              <w:rPr>
+                <w:rFonts w:ascii="Cambria Math" w:hAnsi="Cambria Math"/>
+                <w:color w:val="5B9BD5" w:themeColor="accent5"/>
+              </w:rPr>
+            </m:ctrlPr>
+          </m:sSubPr>
+          <m:e>
+            <m:r>
+              <w:rPr>
+                <w:rFonts w:ascii="Cambria Math" w:hAnsi="Cambria Math"/>
+                <w:color w:val="5B9BD5" w:themeColor="accent5"/>
+              </w:rPr>
+              <m:t>P</m:t>
+            </m:r>
+          </m:e>
+          <m:sub>
+            <m:r>
+              <m:rPr>
+                <m:sty m:val="p"/>
+              </m:rPr>
+              <w:rPr>
+                <w:rFonts w:ascii="Cambria Math" w:hAnsi="Cambria Math"/>
+                <w:color w:val="5B9BD5" w:themeColor="accent5"/>
+              </w:rPr>
+              <m:t>2</m:t>
+            </m:r>
+            <m:r>
+              <m:rPr>
+                <m:lit/>
+                <m:sty m:val="p"/>
+              </m:rPr>
+              <w:rPr>
+                <w:rFonts w:ascii="Cambria Math" w:hAnsi="Cambria Math"/>
+                <w:color w:val="5B9BD5" w:themeColor="accent5"/>
+              </w:rPr>
+              <m:t>/</m:t>
+            </m:r>
+            <m:r>
+              <w:rPr>
+                <w:rFonts w:ascii="Cambria Math" w:hAnsi="Cambria Math"/>
+                <w:color w:val="5B9BD5" w:themeColor="accent5"/>
+              </w:rPr>
+              <m:t>H</m:t>
+            </m:r>
+          </m:sub>
+        </m:sSub>
+      </m:oMath>
+      <w:r>
+        <w:rPr>
+          <w:rFonts w:hint="eastAsia"/>
+          <w:color w:val="5B9BD5" w:themeColor="accent5"/>
+        </w:rPr>
+        <w:t xml:space="preserve"> </w:t>
+      </w:r>
+      <w:r>
+        <w:rPr>
+          <w:color w:val="5B9BD5" w:themeColor="accent5"/>
+        </w:rPr>
+        <w:t>win,</w:t>
+      </w:r>
+      <w:r>
+        <w:rPr>
+          <w:rFonts w:hint="eastAsia"/>
+          <w:color w:val="5B9BD5" w:themeColor="accent5"/>
+        </w:rPr>
+        <w:t xml:space="preserve"> (P</w:t>
+      </w:r>
+      <w:r>
+        <w:rPr>
+          <w:color w:val="5B9BD5" w:themeColor="accent5"/>
+        </w:rPr>
+        <w:t xml:space="preserve"> </w:t>
+      </w:r>
+      <w:r>
+        <w:rPr>
+          <w:rFonts w:hint="eastAsia"/>
+          <w:color w:val="5B9BD5" w:themeColor="accent5"/>
+        </w:rPr>
+        <w:t>t</w:t>
+      </w:r>
+      <w:r>
+        <w:rPr>
+          <w:color w:val="5B9BD5" w:themeColor="accent5"/>
+        </w:rPr>
+        <w:t xml:space="preserve">otal = </w:t>
+      </w:r>
+      <w:r>
+        <w:rPr>
+          <w:color w:val="5B9BD5" w:themeColor="accent5"/>
+        </w:rPr>
+        <w:t>1.6474611</w:t>
+      </w:r>
+      <w:r>
+        <w:rPr>
+          <w:rFonts w:hint="eastAsia"/>
+          <w:color w:val="5B9BD5" w:themeColor="accent5"/>
+        </w:rPr>
+        <w:t>)</w:t>
+      </w:r>
+    </w:p>
+    <w:p>
+      <w:pPr>
+        <w:rPr>
+          <w:color w:val="5B9BD5" w:themeColor="accent5"/>
+        </w:rPr>
+      </w:pPr>
+      <w:r>
+        <w:rPr>
+          <w:color w:val="5B9BD5" w:themeColor="accent5"/>
+        </w:rPr>
+        <w:t>H = 2.0989911, P2H = 0.8868977, P2 = 0.7605634, S = 1.7626948.</w:t>
+      </w:r>
+      <w:r>
+        <w:rPr>
+          <w:rFonts w:hint="eastAsia"/>
+          <w:color w:val="5B9BD5" w:themeColor="accent5"/>
+        </w:rPr>
+        <w:t xml:space="preserve"> </w:t>
+      </w:r>
+      <m:oMath>
+        <m:r>
+          <m:rPr>
+            <m:sty m:val="p"/>
+          </m:rPr>
+          <w:rPr>
+            <w:rFonts w:ascii="Cambria Math" w:hAnsi="Cambria Math"/>
+            <w:color w:val="5B9BD5" w:themeColor="accent5"/>
+          </w:rPr>
+          <m:t>λ= -0.007603502</m:t>
+        </m:r>
+      </m:oMath>
+    </w:p>
+    <w:p>
+      <w:r>
+        <w:rPr>
+          <w:noProof/>
+        </w:rPr>
+        <w:drawing>
+          <wp:inline distT="0" distB="0" distL="0" distR="0" wp14:anchorId="62CFDEFB">
+            <wp:extent cx="3064186" cy="2520000"/>
+            <wp:effectExtent l="0" t="0" r="3175" b="0"/>
+            <wp:docPr id="18" name="圖片 18"/>
+            <wp:cNvGraphicFramePr>
+              <a:graphicFrameLocks xmlns:a="http://schemas.openxmlformats.org/drawingml/2006/main" noChangeAspect="1"/>
+            </wp:cNvGraphicFramePr>
+            <a:graphic xmlns:a="http://schemas.openxmlformats.org/drawingml/2006/main">
+              <a:graphicData uri="http://schemas.openxmlformats.org/drawingml/2006/picture">
+                <pic:pic xmlns:pic="http://schemas.openxmlformats.org/drawingml/2006/picture">
+                  <pic:nvPicPr>
+                    <pic:cNvPr id="0" name="Picture 7"/>
+                    <pic:cNvPicPr>
+                      <a:picLocks noChangeAspect="1" noChangeArrowheads="1"/>
+                    </pic:cNvPicPr>
+                  </pic:nvPicPr>
+                  <pic:blipFill>
+                    <a:blip r:embed="rId31">
                       <a:extLst>
                         <a:ext uri="{28A0092B-C50C-407E-A947-70E740481C1C}">
                           <a14:useLocalDpi xmlns:a14="http://schemas.microsoft.com/office/drawing/2010/main" val="0"/>
@@ -4703,6 +5511,108 @@
           </wp:inline>
         </w:drawing>
       </w:r>
+      <w:r>
+        <w:rPr>
+          <w:noProof/>
+        </w:rPr>
+        <w:drawing>
+          <wp:inline distT="0" distB="0" distL="0" distR="0" wp14:anchorId="0519E0B5">
+            <wp:extent cx="3064186" cy="2520000"/>
+            <wp:effectExtent l="0" t="0" r="3175" b="0"/>
+            <wp:docPr id="19" name="圖片 19"/>
+            <wp:cNvGraphicFramePr>
+              <a:graphicFrameLocks xmlns:a="http://schemas.openxmlformats.org/drawingml/2006/main" noChangeAspect="1"/>
+            </wp:cNvGraphicFramePr>
+            <a:graphic xmlns:a="http://schemas.openxmlformats.org/drawingml/2006/main">
+              <a:graphicData uri="http://schemas.openxmlformats.org/drawingml/2006/picture">
+                <pic:pic xmlns:pic="http://schemas.openxmlformats.org/drawingml/2006/picture">
+                  <pic:nvPicPr>
+                    <pic:cNvPr id="0" name="Picture 8"/>
+                    <pic:cNvPicPr>
+                      <a:picLocks noChangeAspect="1" noChangeArrowheads="1"/>
+                    </pic:cNvPicPr>
+                  </pic:nvPicPr>
+                  <pic:blipFill>
+                    <a:blip r:embed="rId32">
+                      <a:extLst>
+                        <a:ext uri="{28A0092B-C50C-407E-A947-70E740481C1C}">
+                          <a14:useLocalDpi xmlns:a14="http://schemas.microsoft.com/office/drawing/2010/main" val="0"/>
+                        </a:ext>
+                      </a:extLst>
+                    </a:blip>
+                    <a:srcRect/>
+                    <a:stretch>
+                      <a:fillRect/>
+                    </a:stretch>
+                  </pic:blipFill>
+                  <pic:spPr bwMode="auto">
+                    <a:xfrm>
+                      <a:off x="0" y="0"/>
+                      <a:ext cx="3064186" cy="2520000"/>
+                    </a:xfrm>
+                    <a:prstGeom prst="rect">
+                      <a:avLst/>
+                    </a:prstGeom>
+                    <a:noFill/>
+                  </pic:spPr>
+                </pic:pic>
+              </a:graphicData>
+            </a:graphic>
+          </wp:inline>
+        </w:drawing>
+      </w:r>
+    </w:p>
+    <w:p>
+      <w:r>
+        <w:rPr>
+          <w:noProof/>
+        </w:rPr>
+        <w:drawing>
+          <wp:inline distT="0" distB="0" distL="0" distR="0" wp14:anchorId="30B9ACBB">
+            <wp:extent cx="3064186" cy="2520000"/>
+            <wp:effectExtent l="0" t="0" r="3175" b="0"/>
+            <wp:docPr id="23" name="圖片 23"/>
+            <wp:cNvGraphicFramePr>
+              <a:graphicFrameLocks xmlns:a="http://schemas.openxmlformats.org/drawingml/2006/main" noChangeAspect="1"/>
+            </wp:cNvGraphicFramePr>
+            <a:graphic xmlns:a="http://schemas.openxmlformats.org/drawingml/2006/main">
+              <a:graphicData uri="http://schemas.openxmlformats.org/drawingml/2006/picture">
+                <pic:pic xmlns:pic="http://schemas.openxmlformats.org/drawingml/2006/picture">
+                  <pic:nvPicPr>
+                    <pic:cNvPr id="0" name="Picture 10"/>
+                    <pic:cNvPicPr>
+                      <a:picLocks noChangeAspect="1" noChangeArrowheads="1"/>
+                    </pic:cNvPicPr>
+                  </pic:nvPicPr>
+                  <pic:blipFill>
+                    <a:blip r:embed="rId33">
+                      <a:extLst>
+                        <a:ext uri="{28A0092B-C50C-407E-A947-70E740481C1C}">
+                          <a14:useLocalDpi xmlns:a14="http://schemas.microsoft.com/office/drawing/2010/main" val="0"/>
+                        </a:ext>
+                      </a:extLst>
+                    </a:blip>
+                    <a:srcRect/>
+                    <a:stretch>
+                      <a:fillRect/>
+                    </a:stretch>
+                  </pic:blipFill>
+                  <pic:spPr bwMode="auto">
+                    <a:xfrm>
+                      <a:off x="0" y="0"/>
+                      <a:ext cx="3064186" cy="2520000"/>
+                    </a:xfrm>
+                    <a:prstGeom prst="rect">
+                      <a:avLst/>
+                    </a:prstGeom>
+                    <a:noFill/>
+                  </pic:spPr>
+                </pic:pic>
+              </a:graphicData>
+            </a:graphic>
+          </wp:inline>
+        </w:drawing>
+      </w:r>
     </w:p>
     <w:p/>
     <w:p/>
@@ -5040,6 +5950,8 @@
         </m:sSub>
       </m:oMath>
     </w:p>
+    <w:p/>
+    <w:p/>
     <w:p/>
     <w:p>
       <w:pPr>
@@ -5144,7 +6056,7 @@
                     </pic:cNvPicPr>
                   </pic:nvPicPr>
                   <pic:blipFill>
-                    <a:blip r:embed="rId30">
+                    <a:blip r:embed="rId34">
                       <a:extLst>
                         <a:ext uri="{28A0092B-C50C-407E-A947-70E740481C1C}">
                           <a14:useLocalDpi xmlns:a14="http://schemas.microsoft.com/office/drawing/2010/main" val="0"/>
@@ -5708,7 +6620,7 @@
                     </pic:cNvPicPr>
                   </pic:nvPicPr>
                   <pic:blipFill>
-                    <a:blip r:embed="rId31" cstate="print">
+                    <a:blip r:embed="rId35" cstate="print">
                       <a:extLst>
                         <a:ext uri="{28A0092B-C50C-407E-A947-70E740481C1C}">
                           <a14:useLocalDpi xmlns:a14="http://schemas.microsoft.com/office/drawing/2010/main" val="0"/>
@@ -5759,7 +6671,7 @@
                     </pic:cNvPicPr>
                   </pic:nvPicPr>
                   <pic:blipFill>
-                    <a:blip r:embed="rId32" cstate="print">
+                    <a:blip r:embed="rId36" cstate="print">
                       <a:extLst>
                         <a:ext uri="{28A0092B-C50C-407E-A947-70E740481C1C}">
                           <a14:useLocalDpi xmlns:a14="http://schemas.microsoft.com/office/drawing/2010/main" val="0"/>
@@ -5810,7 +6722,7 @@
                     </pic:cNvPicPr>
                   </pic:nvPicPr>
                   <pic:blipFill>
-                    <a:blip r:embed="rId33" cstate="print">
+                    <a:blip r:embed="rId37" cstate="print">
                       <a:extLst>
                         <a:ext uri="{28A0092B-C50C-407E-A947-70E740481C1C}">
                           <a14:useLocalDpi xmlns:a14="http://schemas.microsoft.com/office/drawing/2010/main" val="0"/>
@@ -5861,7 +6773,7 @@
                     </pic:cNvPicPr>
                   </pic:nvPicPr>
                   <pic:blipFill>
-                    <a:blip r:embed="rId34">
+                    <a:blip r:embed="rId38">
                       <a:extLst>
                         <a:ext uri="{28A0092B-C50C-407E-A947-70E740481C1C}">
                           <a14:useLocalDpi xmlns:a14="http://schemas.microsoft.com/office/drawing/2010/main" val="0"/>
@@ -5920,7 +6832,7 @@
                     </pic:cNvPicPr>
                   </pic:nvPicPr>
                   <pic:blipFill>
-                    <a:blip r:embed="rId34" cstate="print">
+                    <a:blip r:embed="rId38" cstate="print">
                       <a:extLst>
                         <a:ext uri="{28A0092B-C50C-407E-A947-70E740481C1C}">
                           <a14:useLocalDpi xmlns:a14="http://schemas.microsoft.com/office/drawing/2010/main" val="0"/>
@@ -6225,7 +7137,7 @@
                     </pic:cNvPicPr>
                   </pic:nvPicPr>
                   <pic:blipFill>
-                    <a:blip r:embed="rId35" cstate="print">
+                    <a:blip r:embed="rId39" cstate="print">
                       <a:extLst>
                         <a:ext uri="{28A0092B-C50C-407E-A947-70E740481C1C}">
                           <a14:useLocalDpi xmlns:a14="http://schemas.microsoft.com/office/drawing/2010/main" val="0"/>

</xml_diff>

<commit_message>
20251229 Critical invasion time update
</commit_message>
<xml_diff>
--- a/Analysis/alternative stable state (已自動回復).docx
+++ b/Analysis/alternative stable state (已自動回復).docx
@@ -3662,15 +3662,7 @@
         <w:rPr>
           <w:color w:val="5B9BD5" w:themeColor="accent5"/>
         </w:rPr>
-        <w:t>H = 0.6716297, P1H = 0.2333761, P2H = 0.1687427, P1</w:t>
-      </w:r>
-      <w:bookmarkStart w:id="0" w:name="_GoBack"/>
-      <w:bookmarkEnd w:id="0"/>
-      <w:r>
-        <w:rPr>
-          <w:color w:val="5B9BD5" w:themeColor="accent5"/>
-        </w:rPr>
-        <w:t xml:space="preserve"> = 1.4767783, P2 = 0.4522385, S = 0.9095539.</w:t>
+        <w:t>H = 0.6716297, P1H = 0.2333761, P2H = 0.1687427, P1 = 1.4767783, P2 = 0.4522385, S = 0.9095539.</w:t>
       </w:r>
     </w:p>
     <w:p>
@@ -5951,8 +5943,1529 @@
       </m:oMath>
     </w:p>
     <w:p/>
-    <w:p/>
-    <w:p/>
+    <w:p>
+      <w:pPr>
+        <w:rPr>
+          <w:rFonts w:hint="eastAsia"/>
+        </w:rPr>
+      </w:pPr>
+    </w:p>
+    <w:p>
+      <w:pPr>
+        <w:rPr>
+          <w:rFonts w:eastAsia="Yu Mincho"/>
+          <w:lang w:eastAsia="ja-JP"/>
+        </w:rPr>
+      </w:pPr>
+      <w:r>
+        <w:t>Will the time of hyperparasite i</w:t>
+      </w:r>
+      <w:r>
+        <w:rPr>
+          <w:rFonts w:hint="eastAsia"/>
+        </w:rPr>
+        <w:t>n</w:t>
+      </w:r>
+      <w:r>
+        <w:t>vasion affect the competition outcome?</w:t>
+      </w:r>
+    </w:p>
+    <w:p>
+      <w:pPr>
+        <w:rPr>
+          <w:rFonts w:eastAsiaTheme="minorEastAsia"/>
+        </w:rPr>
+      </w:pPr>
+      <w:r>
+        <w:rPr>
+          <w:rFonts w:eastAsiaTheme="minorEastAsia" w:hint="eastAsia"/>
+        </w:rPr>
+        <w:t>Ye</w:t>
+      </w:r>
+      <w:r>
+        <w:rPr>
+          <w:rFonts w:eastAsiaTheme="minorEastAsia"/>
+        </w:rPr>
+        <w:t>s.</w:t>
+      </w:r>
+    </w:p>
+    <w:p>
+      <w:pPr>
+        <w:rPr>
+          <w:rFonts w:eastAsiaTheme="minorEastAsia"/>
+        </w:rPr>
+      </w:pPr>
+    </w:p>
+    <w:p>
+      <w:pPr>
+        <w:rPr>
+          <w:rFonts w:hint="eastAsia"/>
+        </w:rPr>
+      </w:pPr>
+      <w:r>
+        <w:rPr>
+          <w:noProof/>
+        </w:rPr>
+        <mc:AlternateContent>
+          <mc:Choice Requires="wps">
+            <w:drawing>
+              <wp:anchor distT="0" distB="0" distL="114300" distR="114300" simplePos="0" relativeHeight="251665408" behindDoc="0" locked="0" layoutInCell="1" allowOverlap="1" wp14:anchorId="4EC4C1AD" wp14:editId="6D46FB5D">
+                <wp:simplePos x="0" y="0"/>
+                <wp:positionH relativeFrom="column">
+                  <wp:posOffset>1410970</wp:posOffset>
+                </wp:positionH>
+                <wp:positionV relativeFrom="paragraph">
+                  <wp:posOffset>1582420</wp:posOffset>
+                </wp:positionV>
+                <wp:extent cx="376957" cy="302312"/>
+                <wp:effectExtent l="19050" t="19050" r="23495" b="40640"/>
+                <wp:wrapNone/>
+                <wp:docPr id="48" name="箭號: 向右 48"/>
+                <wp:cNvGraphicFramePr/>
+                <a:graphic xmlns:a="http://schemas.openxmlformats.org/drawingml/2006/main">
+                  <a:graphicData uri="http://schemas.microsoft.com/office/word/2010/wordprocessingShape">
+                    <wps:wsp>
+                      <wps:cNvSpPr/>
+                      <wps:spPr>
+                        <a:xfrm rot="10800000">
+                          <a:off x="0" y="0"/>
+                          <a:ext cx="376957" cy="302312"/>
+                        </a:xfrm>
+                        <a:prstGeom prst="rightArrow">
+                          <a:avLst/>
+                        </a:prstGeom>
+                        <a:solidFill>
+                          <a:srgbClr val="C00000"/>
+                        </a:solidFill>
+                      </wps:spPr>
+                      <wps:style>
+                        <a:lnRef idx="2">
+                          <a:schemeClr val="dk1">
+                            <a:shade val="50000"/>
+                          </a:schemeClr>
+                        </a:lnRef>
+                        <a:fillRef idx="1">
+                          <a:schemeClr val="dk1"/>
+                        </a:fillRef>
+                        <a:effectRef idx="0">
+                          <a:schemeClr val="dk1"/>
+                        </a:effectRef>
+                        <a:fontRef idx="minor">
+                          <a:schemeClr val="lt1"/>
+                        </a:fontRef>
+                      </wps:style>
+                      <wps:bodyPr rot="0" spcFirstLastPara="0" vertOverflow="overflow" horzOverflow="overflow" vert="horz" wrap="square" lIns="91440" tIns="45720" rIns="91440" bIns="45720" numCol="1" spcCol="0" rtlCol="0" fromWordArt="0" anchor="ctr" anchorCtr="0" forceAA="0" compatLnSpc="1">
+                        <a:prstTxWarp prst="textNoShape">
+                          <a:avLst/>
+                        </a:prstTxWarp>
+                        <a:noAutofit/>
+                      </wps:bodyPr>
+                    </wps:wsp>
+                  </a:graphicData>
+                </a:graphic>
+              </wp:anchor>
+            </w:drawing>
+          </mc:Choice>
+          <mc:Fallback>
+            <w:pict>
+              <v:shapetype w14:anchorId="1E70973B" id="_x0000_t13" coordsize="21600,21600" o:spt="13" adj="16200,5400" path="m@0,l@0@1,0@1,0@2@0@2@0,21600,21600,10800xe">
+                <v:stroke joinstyle="miter"/>
+                <v:formulas>
+                  <v:f eqn="val #0"/>
+                  <v:f eqn="val #1"/>
+                  <v:f eqn="sum height 0 #1"/>
+                  <v:f eqn="sum 10800 0 #1"/>
+                  <v:f eqn="sum width 0 #0"/>
+                  <v:f eqn="prod @4 @3 10800"/>
+                  <v:f eqn="sum width 0 @5"/>
+                </v:formulas>
+                <v:path o:connecttype="custom" o:connectlocs="@0,0;0,10800;@0,21600;21600,10800" o:connectangles="270,180,90,0" textboxrect="0,@1,@6,@2"/>
+                <v:handles>
+                  <v:h position="#0,#1" xrange="0,21600" yrange="0,10800"/>
+                </v:handles>
+              </v:shapetype>
+              <v:shape id="箭號: 向右 48" o:spid="_x0000_s1026" type="#_x0000_t13" style="position:absolute;margin-left:111.1pt;margin-top:124.6pt;width:29.7pt;height:23.8pt;rotation:180;z-index:251665408;visibility:visible;mso-wrap-style:square;mso-wrap-distance-left:9pt;mso-wrap-distance-top:0;mso-wrap-distance-right:9pt;mso-wrap-distance-bottom:0;mso-position-horizontal:absolute;mso-position-horizontal-relative:text;mso-position-vertical:absolute;mso-position-vertical-relative:text;v-text-anchor:middle" o:gfxdata="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" adj="12939" fillcolor="#c00000" strokecolor="black [1600]" strokeweight="1pt"/>
+            </w:pict>
+          </mc:Fallback>
+        </mc:AlternateContent>
+      </w:r>
+      <w:r>
+        <w:rPr>
+          <w:noProof/>
+        </w:rPr>
+        <w:drawing>
+          <wp:inline distT="0" distB="0" distL="0" distR="0" wp14:anchorId="5725FFBE" wp14:editId="67D0F7A9">
+            <wp:extent cx="2197100" cy="2075841"/>
+            <wp:effectExtent l="0" t="0" r="0" b="635"/>
+            <wp:docPr id="49" name="圖片 49"/>
+            <wp:cNvGraphicFramePr>
+              <a:graphicFrameLocks xmlns:a="http://schemas.openxmlformats.org/drawingml/2006/main" noChangeAspect="1"/>
+            </wp:cNvGraphicFramePr>
+            <a:graphic xmlns:a="http://schemas.openxmlformats.org/drawingml/2006/main">
+              <a:graphicData uri="http://schemas.openxmlformats.org/drawingml/2006/picture">
+                <pic:pic xmlns:pic="http://schemas.openxmlformats.org/drawingml/2006/picture">
+                  <pic:nvPicPr>
+                    <pic:cNvPr id="0" name="Picture 2"/>
+                    <pic:cNvPicPr>
+                      <a:picLocks noChangeAspect="1" noChangeArrowheads="1"/>
+                    </pic:cNvPicPr>
+                  </pic:nvPicPr>
+                  <pic:blipFill rotWithShape="1">
+                    <a:blip r:embed="rId12" cstate="print">
+                      <a:extLst>
+                        <a:ext uri="{28A0092B-C50C-407E-A947-70E740481C1C}">
+                          <a14:useLocalDpi xmlns:a14="http://schemas.microsoft.com/office/drawing/2010/main" val="0"/>
+                        </a:ext>
+                      </a:extLst>
+                    </a:blip>
+                    <a:srcRect l="1181" t="11265" r="30696" b="5018"/>
+                    <a:stretch/>
+                  </pic:blipFill>
+                  <pic:spPr bwMode="auto">
+                    <a:xfrm>
+                      <a:off x="0" y="0"/>
+                      <a:ext cx="2204372" cy="2082712"/>
+                    </a:xfrm>
+                    <a:prstGeom prst="rect">
+                      <a:avLst/>
+                    </a:prstGeom>
+                    <a:noFill/>
+                    <a:ln>
+                      <a:noFill/>
+                    </a:ln>
+                    <a:extLst>
+                      <a:ext uri="{53640926-AAD7-44D8-BBD7-CCE9431645EC}">
+                        <a14:shadowObscured xmlns:a14="http://schemas.microsoft.com/office/drawing/2010/main"/>
+                      </a:ext>
+                    </a:extLst>
+                  </pic:spPr>
+                </pic:pic>
+              </a:graphicData>
+            </a:graphic>
+          </wp:inline>
+        </w:drawing>
+      </w:r>
+    </w:p>
+    <w:p>
+      <w:pPr>
+        <w:rPr>
+          <w:rFonts w:eastAsiaTheme="minorEastAsia"/>
+        </w:rPr>
+      </w:pPr>
+      <w:r>
+        <w:rPr>
+          <w:rFonts w:eastAsiaTheme="minorEastAsia" w:hint="eastAsia"/>
+        </w:rPr>
+        <w:t>I</w:t>
+      </w:r>
+      <w:r>
+        <w:rPr>
+          <w:rFonts w:eastAsiaTheme="minorEastAsia"/>
+        </w:rPr>
+        <w:t>n the parameter space which leads to EC and E2H:</w:t>
+      </w:r>
+    </w:p>
+    <w:p>
+      <w:pPr>
+        <w:rPr>
+          <w:rFonts w:eastAsiaTheme="minorEastAsia" w:hint="eastAsia"/>
+        </w:rPr>
+      </w:pPr>
+      <w:r>
+        <w:rPr>
+          <w:rFonts w:eastAsiaTheme="minorEastAsia"/>
+        </w:rPr>
+        <w:t>m1 = 0.045, m2 = 0.001</w:t>
+      </w:r>
+    </w:p>
+    <w:p>
+      <w:pPr>
+        <w:rPr>
+          <w:rFonts w:eastAsiaTheme="minorEastAsia" w:hint="eastAsia"/>
+        </w:rPr>
+      </w:pPr>
+    </w:p>
+    <w:p>
+      <w:pPr>
+        <w:rPr>
+          <w:rFonts w:eastAsiaTheme="minorEastAsia"/>
+        </w:rPr>
+      </w:pPr>
+      <w:r>
+        <w:rPr>
+          <w:rFonts w:eastAsiaTheme="minorEastAsia" w:hint="eastAsia"/>
+          <w:noProof/>
+        </w:rPr>
+        <w:drawing>
+          <wp:inline distT="0" distB="0" distL="0" distR="0">
+            <wp:extent cx="2400300" cy="1650058"/>
+            <wp:effectExtent l="0" t="0" r="0" b="7620"/>
+            <wp:docPr id="43" name="圖片 43"/>
+            <wp:cNvGraphicFramePr>
+              <a:graphicFrameLocks xmlns:a="http://schemas.openxmlformats.org/drawingml/2006/main" noChangeAspect="1"/>
+            </wp:cNvGraphicFramePr>
+            <a:graphic xmlns:a="http://schemas.openxmlformats.org/drawingml/2006/main">
+              <a:graphicData uri="http://schemas.openxmlformats.org/drawingml/2006/picture">
+                <pic:pic xmlns:pic="http://schemas.openxmlformats.org/drawingml/2006/picture">
+                  <pic:nvPicPr>
+                    <pic:cNvPr id="43" name="ASS time series ini_High_H parms_EC_E2H Coexist.png"/>
+                    <pic:cNvPicPr/>
+                  </pic:nvPicPr>
+                  <pic:blipFill>
+                    <a:blip r:embed="rId34" cstate="print">
+                      <a:extLst>
+                        <a:ext uri="{28A0092B-C50C-407E-A947-70E740481C1C}">
+                          <a14:useLocalDpi xmlns:a14="http://schemas.microsoft.com/office/drawing/2010/main" val="0"/>
+                        </a:ext>
+                      </a:extLst>
+                    </a:blip>
+                    <a:stretch>
+                      <a:fillRect/>
+                    </a:stretch>
+                  </pic:blipFill>
+                  <pic:spPr>
+                    <a:xfrm>
+                      <a:off x="0" y="0"/>
+                      <a:ext cx="2407482" cy="1654995"/>
+                    </a:xfrm>
+                    <a:prstGeom prst="rect">
+                      <a:avLst/>
+                    </a:prstGeom>
+                  </pic:spPr>
+                </pic:pic>
+              </a:graphicData>
+            </a:graphic>
+          </wp:inline>
+        </w:drawing>
+      </w:r>
+      <w:r>
+        <w:rPr>
+          <w:rFonts w:eastAsiaTheme="minorEastAsia" w:hint="eastAsia"/>
+          <w:noProof/>
+        </w:rPr>
+        <w:drawing>
+          <wp:inline distT="0" distB="0" distL="0" distR="0" wp14:anchorId="0DB7DFE3" wp14:editId="6214BEC3">
+            <wp:extent cx="2447856" cy="1682750"/>
+            <wp:effectExtent l="0" t="0" r="0" b="0"/>
+            <wp:docPr id="50" name="圖片 50"/>
+            <wp:cNvGraphicFramePr>
+              <a:graphicFrameLocks xmlns:a="http://schemas.openxmlformats.org/drawingml/2006/main" noChangeAspect="1"/>
+            </wp:cNvGraphicFramePr>
+            <a:graphic xmlns:a="http://schemas.openxmlformats.org/drawingml/2006/main">
+              <a:graphicData uri="http://schemas.openxmlformats.org/drawingml/2006/picture">
+                <pic:pic xmlns:pic="http://schemas.openxmlformats.org/drawingml/2006/picture">
+                  <pic:nvPicPr>
+                    <pic:cNvPr id="50" name="ASS time series ini_Low_H parms_EC_E2H E2H.png"/>
+                    <pic:cNvPicPr/>
+                  </pic:nvPicPr>
+                  <pic:blipFill>
+                    <a:blip r:embed="rId35" cstate="print">
+                      <a:extLst>
+                        <a:ext uri="{28A0092B-C50C-407E-A947-70E740481C1C}">
+                          <a14:useLocalDpi xmlns:a14="http://schemas.microsoft.com/office/drawing/2010/main" val="0"/>
+                        </a:ext>
+                      </a:extLst>
+                    </a:blip>
+                    <a:stretch>
+                      <a:fillRect/>
+                    </a:stretch>
+                  </pic:blipFill>
+                  <pic:spPr>
+                    <a:xfrm>
+                      <a:off x="0" y="0"/>
+                      <a:ext cx="2451611" cy="1685331"/>
+                    </a:xfrm>
+                    <a:prstGeom prst="rect">
+                      <a:avLst/>
+                    </a:prstGeom>
+                  </pic:spPr>
+                </pic:pic>
+              </a:graphicData>
+            </a:graphic>
+          </wp:inline>
+        </w:drawing>
+      </w:r>
+    </w:p>
+    <w:p>
+      <w:pPr>
+        <w:rPr>
+          <w:rFonts w:eastAsiaTheme="minorEastAsia"/>
+        </w:rPr>
+      </w:pPr>
+      <w:r>
+        <w:rPr>
+          <w:rFonts w:eastAsiaTheme="minorEastAsia"/>
+        </w:rPr>
+        <w:t xml:space="preserve">Left: </w:t>
+      </w:r>
+      <w:proofErr w:type="spellStart"/>
+      <w:r>
+        <w:rPr>
+          <w:rFonts w:eastAsiaTheme="minorEastAsia"/>
+        </w:rPr>
+        <w:t>ini_High_H</w:t>
+      </w:r>
+      <w:proofErr w:type="spellEnd"/>
+      <w:r>
+        <w:rPr>
+          <w:rFonts w:eastAsiaTheme="minorEastAsia"/>
+        </w:rPr>
+        <w:t xml:space="preserve"> &lt;- </w:t>
+      </w:r>
+      <w:proofErr w:type="gramStart"/>
+      <w:r>
+        <w:rPr>
+          <w:rFonts w:eastAsiaTheme="minorEastAsia"/>
+        </w:rPr>
+        <w:t>c(</w:t>
+      </w:r>
+      <w:proofErr w:type="gramEnd"/>
+      <w:r>
+        <w:rPr>
+          <w:rFonts w:eastAsiaTheme="minorEastAsia"/>
+          <w:color w:val="0070C0"/>
+        </w:rPr>
+        <w:t>H = 0.5</w:t>
+      </w:r>
+      <w:r>
+        <w:rPr>
+          <w:rFonts w:eastAsiaTheme="minorEastAsia"/>
+        </w:rPr>
+        <w:t>, P1H = 0, P2H = 0, P1 = 0.01, P2 = 0.01, S = 0.5)</w:t>
+      </w:r>
+      <w:r>
+        <w:rPr>
+          <w:rFonts w:eastAsiaTheme="minorEastAsia"/>
+        </w:rPr>
+        <w:t xml:space="preserve"> #Coexist</w:t>
+      </w:r>
+    </w:p>
+    <w:p>
+      <w:pPr>
+        <w:rPr>
+          <w:rFonts w:eastAsiaTheme="minorEastAsia"/>
+        </w:rPr>
+      </w:pPr>
+      <w:r>
+        <w:rPr>
+          <w:rFonts w:eastAsiaTheme="minorEastAsia" w:hint="eastAsia"/>
+        </w:rPr>
+        <w:t>R</w:t>
+      </w:r>
+      <w:r>
+        <w:rPr>
+          <w:rFonts w:eastAsiaTheme="minorEastAsia"/>
+        </w:rPr>
+        <w:t xml:space="preserve">ight: </w:t>
+      </w:r>
+      <w:proofErr w:type="spellStart"/>
+      <w:r>
+        <w:rPr>
+          <w:rFonts w:eastAsiaTheme="minorEastAsia"/>
+        </w:rPr>
+        <w:t>ini_Low_H</w:t>
+      </w:r>
+      <w:proofErr w:type="spellEnd"/>
+      <w:r>
+        <w:rPr>
+          <w:rFonts w:eastAsiaTheme="minorEastAsia"/>
+        </w:rPr>
+        <w:t xml:space="preserve"> &lt;- </w:t>
+      </w:r>
+      <w:proofErr w:type="gramStart"/>
+      <w:r>
+        <w:rPr>
+          <w:rFonts w:eastAsiaTheme="minorEastAsia"/>
+        </w:rPr>
+        <w:t>c(</w:t>
+      </w:r>
+      <w:proofErr w:type="gramEnd"/>
+      <w:r>
+        <w:rPr>
+          <w:rFonts w:eastAsiaTheme="minorEastAsia"/>
+          <w:color w:val="0070C0"/>
+        </w:rPr>
+        <w:t>H = 0.01</w:t>
+      </w:r>
+      <w:r>
+        <w:rPr>
+          <w:rFonts w:eastAsiaTheme="minorEastAsia"/>
+        </w:rPr>
+        <w:t>, P1H = 0, P2H = 0, P1 = 0.01, P2 = 0.01, S = 0.5)</w:t>
+      </w:r>
+      <w:r>
+        <w:rPr>
+          <w:rFonts w:eastAsiaTheme="minorEastAsia"/>
+        </w:rPr>
+        <w:t xml:space="preserve"> #E2H</w:t>
+      </w:r>
+    </w:p>
+    <w:p>
+      <w:pPr>
+        <w:rPr>
+          <w:rFonts w:eastAsiaTheme="minorEastAsia"/>
+        </w:rPr>
+      </w:pPr>
+    </w:p>
+    <w:p>
+      <w:pPr>
+        <w:rPr>
+          <w:rFonts w:eastAsiaTheme="minorEastAsia"/>
+          <w:b/>
+        </w:rPr>
+      </w:pPr>
+      <w:r>
+        <w:rPr>
+          <w:rFonts w:eastAsiaTheme="minorEastAsia"/>
+          <w:b/>
+        </w:rPr>
+        <w:t>Now consider the invasion (addition) of H.</w:t>
+      </w:r>
+    </w:p>
+    <w:p>
+      <w:pPr>
+        <w:rPr>
+          <w:rFonts w:eastAsiaTheme="minorEastAsia"/>
+        </w:rPr>
+      </w:pPr>
+      <w:r>
+        <w:rPr>
+          <w:rFonts w:eastAsiaTheme="minorEastAsia"/>
+        </w:rPr>
+        <w:t xml:space="preserve">In the alternative stable states area, which consists of EC and E2H, at parameter sets that </w:t>
+      </w:r>
+      <w:r>
+        <w:rPr>
+          <w:rFonts w:eastAsiaTheme="minorEastAsia"/>
+        </w:rPr>
+        <w:t>lead to EC, i.e., high initial H.</w:t>
+      </w:r>
+    </w:p>
+    <w:p>
+      <w:pPr>
+        <w:rPr>
+          <w:rFonts w:eastAsiaTheme="minorEastAsia" w:hint="eastAsia"/>
+        </w:rPr>
+      </w:pPr>
+      <w:r>
+        <w:rPr>
+          <w:rFonts w:eastAsiaTheme="minorEastAsia" w:hint="eastAsia"/>
+        </w:rPr>
+        <w:t>I</w:t>
+      </w:r>
+      <w:r>
+        <w:rPr>
+          <w:rFonts w:eastAsiaTheme="minorEastAsia"/>
+        </w:rPr>
+        <w:t>nvade at the beginning:</w:t>
+      </w:r>
+    </w:p>
+    <w:p>
+      <w:pPr>
+        <w:rPr>
+          <w:rFonts w:eastAsiaTheme="minorEastAsia"/>
+        </w:rPr>
+      </w:pPr>
+      <w:r>
+        <w:rPr>
+          <w:rFonts w:eastAsiaTheme="minorEastAsia"/>
+        </w:rPr>
+        <w:t>Invade at time t = 100, H = H+2</w:t>
+      </w:r>
+    </w:p>
+    <w:p>
+      <w:pPr>
+        <w:rPr>
+          <w:rFonts w:eastAsiaTheme="minorEastAsia"/>
+        </w:rPr>
+      </w:pPr>
+      <w:r>
+        <w:rPr>
+          <w:rFonts w:eastAsiaTheme="minorEastAsia" w:hint="eastAsia"/>
+          <w:noProof/>
+        </w:rPr>
+        <w:lastRenderedPageBreak/>
+        <w:drawing>
+          <wp:inline distT="0" distB="0" distL="0" distR="0">
+            <wp:extent cx="2094734" cy="1440000"/>
+            <wp:effectExtent l="0" t="0" r="1270" b="8255"/>
+            <wp:docPr id="51" name="圖片 51"/>
+            <wp:cNvGraphicFramePr>
+              <a:graphicFrameLocks xmlns:a="http://schemas.openxmlformats.org/drawingml/2006/main" noChangeAspect="1"/>
+            </wp:cNvGraphicFramePr>
+            <a:graphic xmlns:a="http://schemas.openxmlformats.org/drawingml/2006/main">
+              <a:graphicData uri="http://schemas.openxmlformats.org/drawingml/2006/picture">
+                <pic:pic xmlns:pic="http://schemas.openxmlformats.org/drawingml/2006/picture">
+                  <pic:nvPicPr>
+                    <pic:cNvPr id="51" name="ASS time series ini_High_H parms_E1H_E2H Int100.png"/>
+                    <pic:cNvPicPr/>
+                  </pic:nvPicPr>
+                  <pic:blipFill>
+                    <a:blip r:embed="rId36" cstate="print">
+                      <a:extLst>
+                        <a:ext uri="{28A0092B-C50C-407E-A947-70E740481C1C}">
+                          <a14:useLocalDpi xmlns:a14="http://schemas.microsoft.com/office/drawing/2010/main" val="0"/>
+                        </a:ext>
+                      </a:extLst>
+                    </a:blip>
+                    <a:stretch>
+                      <a:fillRect/>
+                    </a:stretch>
+                  </pic:blipFill>
+                  <pic:spPr>
+                    <a:xfrm>
+                      <a:off x="0" y="0"/>
+                      <a:ext cx="2094734" cy="1440000"/>
+                    </a:xfrm>
+                    <a:prstGeom prst="rect">
+                      <a:avLst/>
+                    </a:prstGeom>
+                  </pic:spPr>
+                </pic:pic>
+              </a:graphicData>
+            </a:graphic>
+          </wp:inline>
+        </w:drawing>
+      </w:r>
+    </w:p>
+    <w:p>
+      <w:pPr>
+        <w:rPr>
+          <w:rFonts w:eastAsiaTheme="minorEastAsia"/>
+        </w:rPr>
+      </w:pPr>
+      <w:r>
+        <w:rPr>
+          <w:rFonts w:eastAsiaTheme="minorEastAsia"/>
+        </w:rPr>
+        <w:t>The addition of H does alter the final fate of the competition outcome (from EC to E2H).</w:t>
+      </w:r>
+    </w:p>
+    <w:p>
+      <w:pPr>
+        <w:rPr>
+          <w:rFonts w:eastAsiaTheme="minorEastAsia" w:hint="eastAsia"/>
+        </w:rPr>
+      </w:pPr>
+      <w:r>
+        <w:rPr>
+          <w:rFonts w:eastAsiaTheme="minorEastAsia" w:hint="eastAsia"/>
+        </w:rPr>
+        <w:t>I</w:t>
+      </w:r>
+      <w:r>
+        <w:rPr>
+          <w:rFonts w:eastAsiaTheme="minorEastAsia"/>
+        </w:rPr>
+        <w:t>nvade in the middle:</w:t>
+      </w:r>
+    </w:p>
+    <w:p>
+      <w:pPr>
+        <w:rPr>
+          <w:rFonts w:eastAsiaTheme="minorEastAsia"/>
+        </w:rPr>
+      </w:pPr>
+      <w:r>
+        <w:rPr>
+          <w:rFonts w:eastAsiaTheme="minorEastAsia" w:hint="eastAsia"/>
+          <w:noProof/>
+        </w:rPr>
+        <w:drawing>
+          <wp:inline distT="0" distB="0" distL="0" distR="0">
+            <wp:extent cx="2094734" cy="1440000"/>
+            <wp:effectExtent l="0" t="0" r="1270" b="8255"/>
+            <wp:docPr id="52" name="圖片 52"/>
+            <wp:cNvGraphicFramePr>
+              <a:graphicFrameLocks xmlns:a="http://schemas.openxmlformats.org/drawingml/2006/main" noChangeAspect="1"/>
+            </wp:cNvGraphicFramePr>
+            <a:graphic xmlns:a="http://schemas.openxmlformats.org/drawingml/2006/main">
+              <a:graphicData uri="http://schemas.openxmlformats.org/drawingml/2006/picture">
+                <pic:pic xmlns:pic="http://schemas.openxmlformats.org/drawingml/2006/picture">
+                  <pic:nvPicPr>
+                    <pic:cNvPr id="52" name="ASS time series ini_High_H parms_E1H_E2H Int2000.png"/>
+                    <pic:cNvPicPr/>
+                  </pic:nvPicPr>
+                  <pic:blipFill>
+                    <a:blip r:embed="rId37" cstate="print">
+                      <a:extLst>
+                        <a:ext uri="{28A0092B-C50C-407E-A947-70E740481C1C}">
+                          <a14:useLocalDpi xmlns:a14="http://schemas.microsoft.com/office/drawing/2010/main" val="0"/>
+                        </a:ext>
+                      </a:extLst>
+                    </a:blip>
+                    <a:stretch>
+                      <a:fillRect/>
+                    </a:stretch>
+                  </pic:blipFill>
+                  <pic:spPr>
+                    <a:xfrm>
+                      <a:off x="0" y="0"/>
+                      <a:ext cx="2094734" cy="1440000"/>
+                    </a:xfrm>
+                    <a:prstGeom prst="rect">
+                      <a:avLst/>
+                    </a:prstGeom>
+                  </pic:spPr>
+                </pic:pic>
+              </a:graphicData>
+            </a:graphic>
+          </wp:inline>
+        </w:drawing>
+      </w:r>
+    </w:p>
+    <w:p>
+      <w:pPr>
+        <w:rPr>
+          <w:rFonts w:eastAsiaTheme="minorEastAsia"/>
+        </w:rPr>
+      </w:pPr>
+      <w:r>
+        <w:rPr>
+          <w:rFonts w:eastAsiaTheme="minorEastAsia" w:hint="eastAsia"/>
+        </w:rPr>
+        <w:t>T</w:t>
+      </w:r>
+      <w:r>
+        <w:rPr>
+          <w:rFonts w:eastAsiaTheme="minorEastAsia"/>
+        </w:rPr>
+        <w:t xml:space="preserve">he disturbance </w:t>
+      </w:r>
+      <w:r>
+        <w:rPr>
+          <w:rFonts w:eastAsiaTheme="minorEastAsia"/>
+        </w:rPr>
+        <w:t>doesn’t</w:t>
+      </w:r>
+      <w:r>
+        <w:rPr>
+          <w:rFonts w:eastAsiaTheme="minorEastAsia"/>
+        </w:rPr>
+        <w:t xml:space="preserve"> change the competition outcome (remains </w:t>
+      </w:r>
+      <w:r>
+        <w:rPr>
+          <w:rFonts w:eastAsiaTheme="minorEastAsia"/>
+        </w:rPr>
+        <w:t>EC</w:t>
+      </w:r>
+      <w:r>
+        <w:rPr>
+          <w:rFonts w:eastAsiaTheme="minorEastAsia"/>
+        </w:rPr>
+        <w:t>).</w:t>
+      </w:r>
+    </w:p>
+    <w:p>
+      <w:pPr>
+        <w:pBdr>
+          <w:bottom w:val="single" w:sz="6" w:space="1" w:color="auto"/>
+        </w:pBdr>
+        <w:rPr>
+          <w:rFonts w:eastAsiaTheme="minorEastAsia"/>
+        </w:rPr>
+      </w:pPr>
+    </w:p>
+    <w:p>
+      <w:pPr>
+        <w:rPr>
+          <w:rFonts w:eastAsiaTheme="minorEastAsia" w:hint="eastAsia"/>
+        </w:rPr>
+      </w:pPr>
+    </w:p>
+    <w:p>
+      <w:pPr>
+        <w:rPr>
+          <w:rFonts w:eastAsiaTheme="minorEastAsia"/>
+        </w:rPr>
+      </w:pPr>
+      <w:r>
+        <w:rPr>
+          <w:rFonts w:eastAsiaTheme="minorEastAsia"/>
+        </w:rPr>
+        <w:t xml:space="preserve">At the parameter sets that lead to E2H, i.e., </w:t>
+      </w:r>
+      <w:r>
+        <w:rPr>
+          <w:rFonts w:eastAsiaTheme="minorEastAsia"/>
+        </w:rPr>
+        <w:t xml:space="preserve">those with a </w:t>
+      </w:r>
+      <w:r>
+        <w:rPr>
+          <w:rFonts w:eastAsiaTheme="minorEastAsia"/>
+        </w:rPr>
+        <w:t>low initial H.</w:t>
+      </w:r>
+    </w:p>
+    <w:p>
+      <w:pPr>
+        <w:rPr>
+          <w:rFonts w:eastAsiaTheme="minorEastAsia"/>
+        </w:rPr>
+      </w:pPr>
+      <w:r>
+        <w:rPr>
+          <w:rFonts w:eastAsiaTheme="minorEastAsia"/>
+        </w:rPr>
+        <w:t>Invade at time t = 10, H = H+2</w:t>
+      </w:r>
+    </w:p>
+    <w:p>
+      <w:pPr>
+        <w:rPr>
+          <w:rFonts w:eastAsiaTheme="minorEastAsia"/>
+        </w:rPr>
+      </w:pPr>
+      <w:r>
+        <w:rPr>
+          <w:rFonts w:eastAsiaTheme="minorEastAsia"/>
+          <w:noProof/>
+        </w:rPr>
+        <w:drawing>
+          <wp:inline distT="0" distB="0" distL="0" distR="0" wp14:anchorId="52FF43BE" wp14:editId="25D6B015">
+            <wp:extent cx="2094734" cy="1439999"/>
+            <wp:effectExtent l="0" t="0" r="1270" b="8255"/>
+            <wp:docPr id="55" name="圖片 55"/>
+            <wp:cNvGraphicFramePr>
+              <a:graphicFrameLocks xmlns:a="http://schemas.openxmlformats.org/drawingml/2006/main" noChangeAspect="1"/>
+            </wp:cNvGraphicFramePr>
+            <a:graphic xmlns:a="http://schemas.openxmlformats.org/drawingml/2006/main">
+              <a:graphicData uri="http://schemas.openxmlformats.org/drawingml/2006/picture">
+                <pic:pic xmlns:pic="http://schemas.openxmlformats.org/drawingml/2006/picture">
+                  <pic:nvPicPr>
+                    <pic:cNvPr id="54" name="ASS time series ini_Low_H parms_EC_E2H Int100.png"/>
+                    <pic:cNvPicPr/>
+                  </pic:nvPicPr>
+                  <pic:blipFill>
+                    <a:blip r:embed="rId38" cstate="print">
+                      <a:extLst>
+                        <a:ext uri="{28A0092B-C50C-407E-A947-70E740481C1C}">
+                          <a14:useLocalDpi xmlns:a14="http://schemas.microsoft.com/office/drawing/2010/main" val="0"/>
+                        </a:ext>
+                      </a:extLst>
+                    </a:blip>
+                    <a:stretch>
+                      <a:fillRect/>
+                    </a:stretch>
+                  </pic:blipFill>
+                  <pic:spPr>
+                    <a:xfrm>
+                      <a:off x="0" y="0"/>
+                      <a:ext cx="2094734" cy="1439999"/>
+                    </a:xfrm>
+                    <a:prstGeom prst="rect">
+                      <a:avLst/>
+                    </a:prstGeom>
+                  </pic:spPr>
+                </pic:pic>
+              </a:graphicData>
+            </a:graphic>
+          </wp:inline>
+        </w:drawing>
+      </w:r>
+    </w:p>
+    <w:p>
+      <w:pPr>
+        <w:rPr>
+          <w:rFonts w:eastAsiaTheme="minorEastAsia"/>
+        </w:rPr>
+      </w:pPr>
+      <w:r>
+        <w:rPr>
+          <w:rFonts w:eastAsiaTheme="minorEastAsia"/>
+        </w:rPr>
+        <w:t>The addition of H does alter the final fate of the competition outcome (from E2H to EC).</w:t>
+      </w:r>
+    </w:p>
+    <w:p>
+      <w:pPr>
+        <w:rPr>
+          <w:rFonts w:eastAsiaTheme="minorEastAsia" w:hint="eastAsia"/>
+        </w:rPr>
+      </w:pPr>
+    </w:p>
+    <w:p>
+      <w:pPr>
+        <w:rPr>
+          <w:rFonts w:eastAsiaTheme="minorEastAsia"/>
+        </w:rPr>
+      </w:pPr>
+      <w:r>
+        <w:rPr>
+          <w:rFonts w:eastAsiaTheme="minorEastAsia"/>
+        </w:rPr>
+        <w:t>Invade at time t = 1</w:t>
+      </w:r>
+      <w:r>
+        <w:rPr>
+          <w:rFonts w:eastAsiaTheme="minorEastAsia"/>
+        </w:rPr>
+        <w:t>0</w:t>
+      </w:r>
+      <w:r>
+        <w:rPr>
+          <w:rFonts w:eastAsiaTheme="minorEastAsia"/>
+        </w:rPr>
+        <w:t>0, H = H+2</w:t>
+      </w:r>
+    </w:p>
+    <w:p>
+      <w:pPr>
+        <w:rPr>
+          <w:rFonts w:eastAsiaTheme="minorEastAsia"/>
+        </w:rPr>
+      </w:pPr>
+      <w:r>
+        <w:rPr>
+          <w:rFonts w:eastAsiaTheme="minorEastAsia"/>
+          <w:noProof/>
+        </w:rPr>
+        <w:drawing>
+          <wp:inline distT="0" distB="0" distL="0" distR="0">
+            <wp:extent cx="2094734" cy="1440000"/>
+            <wp:effectExtent l="0" t="0" r="1270" b="8255"/>
+            <wp:docPr id="54" name="圖片 54"/>
+            <wp:cNvGraphicFramePr>
+              <a:graphicFrameLocks xmlns:a="http://schemas.openxmlformats.org/drawingml/2006/main" noChangeAspect="1"/>
+            </wp:cNvGraphicFramePr>
+            <a:graphic xmlns:a="http://schemas.openxmlformats.org/drawingml/2006/main">
+              <a:graphicData uri="http://schemas.openxmlformats.org/drawingml/2006/picture">
+                <pic:pic xmlns:pic="http://schemas.openxmlformats.org/drawingml/2006/picture">
+                  <pic:nvPicPr>
+                    <pic:cNvPr id="54" name="ASS time series ini_Low_H parms_EC_E2H Int100.png"/>
+                    <pic:cNvPicPr/>
+                  </pic:nvPicPr>
+                  <pic:blipFill>
+                    <a:blip r:embed="rId39" cstate="print">
+                      <a:extLst>
+                        <a:ext uri="{28A0092B-C50C-407E-A947-70E740481C1C}">
+                          <a14:useLocalDpi xmlns:a14="http://schemas.microsoft.com/office/drawing/2010/main" val="0"/>
+                        </a:ext>
+                      </a:extLst>
+                    </a:blip>
+                    <a:stretch>
+                      <a:fillRect/>
+                    </a:stretch>
+                  </pic:blipFill>
+                  <pic:spPr>
+                    <a:xfrm>
+                      <a:off x="0" y="0"/>
+                      <a:ext cx="2094734" cy="1440000"/>
+                    </a:xfrm>
+                    <a:prstGeom prst="rect">
+                      <a:avLst/>
+                    </a:prstGeom>
+                  </pic:spPr>
+                </pic:pic>
+              </a:graphicData>
+            </a:graphic>
+          </wp:inline>
+        </w:drawing>
+      </w:r>
+    </w:p>
+    <w:p>
+      <w:pPr>
+        <w:rPr>
+          <w:rFonts w:eastAsiaTheme="minorEastAsia"/>
+        </w:rPr>
+      </w:pPr>
+      <w:r>
+        <w:rPr>
+          <w:rFonts w:eastAsiaTheme="minorEastAsia" w:hint="eastAsia"/>
+        </w:rPr>
+        <w:t>T</w:t>
+      </w:r>
+      <w:r>
+        <w:rPr>
+          <w:rFonts w:eastAsiaTheme="minorEastAsia"/>
+        </w:rPr>
+        <w:t>he disturbance doesn’t change the competition outcome (remains E2H).</w:t>
+      </w:r>
+    </w:p>
+    <w:p>
+      <w:pPr>
+        <w:rPr>
+          <w:rFonts w:eastAsiaTheme="minorEastAsia"/>
+        </w:rPr>
+      </w:pPr>
+    </w:p>
+    <w:p>
+      <w:pPr>
+        <w:rPr>
+          <w:rFonts w:eastAsiaTheme="minorEastAsia"/>
+        </w:rPr>
+      </w:pPr>
+      <w:r>
+        <w:rPr>
+          <w:rFonts w:eastAsiaTheme="minorEastAsia"/>
+        </w:rPr>
+        <w:t>Invade at time t = 2000, H = H+2</w:t>
+      </w:r>
+    </w:p>
+    <w:p>
+      <w:pPr>
+        <w:pBdr>
+          <w:bottom w:val="single" w:sz="6" w:space="1" w:color="auto"/>
+        </w:pBdr>
+        <w:rPr>
+          <w:rFonts w:eastAsiaTheme="minorEastAsia"/>
+        </w:rPr>
+      </w:pPr>
+      <w:r>
+        <w:rPr>
+          <w:rFonts w:eastAsiaTheme="minorEastAsia"/>
+          <w:noProof/>
+        </w:rPr>
+        <w:lastRenderedPageBreak/>
+        <w:drawing>
+          <wp:inline distT="0" distB="0" distL="0" distR="0">
+            <wp:extent cx="2094734" cy="1440000"/>
+            <wp:effectExtent l="0" t="0" r="1270" b="8255"/>
+            <wp:docPr id="56" name="圖片 56"/>
+            <wp:cNvGraphicFramePr>
+              <a:graphicFrameLocks xmlns:a="http://schemas.openxmlformats.org/drawingml/2006/main" noChangeAspect="1"/>
+            </wp:cNvGraphicFramePr>
+            <a:graphic xmlns:a="http://schemas.openxmlformats.org/drawingml/2006/main">
+              <a:graphicData uri="http://schemas.openxmlformats.org/drawingml/2006/picture">
+                <pic:pic xmlns:pic="http://schemas.openxmlformats.org/drawingml/2006/picture">
+                  <pic:nvPicPr>
+                    <pic:cNvPr id="56" name="ASS time series ini_High_H parms_EC_E2H Int2000.png"/>
+                    <pic:cNvPicPr/>
+                  </pic:nvPicPr>
+                  <pic:blipFill>
+                    <a:blip r:embed="rId37" cstate="print">
+                      <a:extLst>
+                        <a:ext uri="{28A0092B-C50C-407E-A947-70E740481C1C}">
+                          <a14:useLocalDpi xmlns:a14="http://schemas.microsoft.com/office/drawing/2010/main" val="0"/>
+                        </a:ext>
+                      </a:extLst>
+                    </a:blip>
+                    <a:stretch>
+                      <a:fillRect/>
+                    </a:stretch>
+                  </pic:blipFill>
+                  <pic:spPr>
+                    <a:xfrm>
+                      <a:off x="0" y="0"/>
+                      <a:ext cx="2094734" cy="1440000"/>
+                    </a:xfrm>
+                    <a:prstGeom prst="rect">
+                      <a:avLst/>
+                    </a:prstGeom>
+                  </pic:spPr>
+                </pic:pic>
+              </a:graphicData>
+            </a:graphic>
+          </wp:inline>
+        </w:drawing>
+      </w:r>
+    </w:p>
+    <w:p>
+      <w:pPr>
+        <w:rPr>
+          <w:rFonts w:eastAsiaTheme="minorEastAsia"/>
+        </w:rPr>
+      </w:pPr>
+      <w:r>
+        <w:rPr>
+          <w:rFonts w:eastAsiaTheme="minorEastAsia"/>
+        </w:rPr>
+        <w:t>In the alternative stable states area, which consists of E1H and E2H, at parameter sets that lead to E1H, i.e., high initial H.</w:t>
+      </w:r>
+    </w:p>
+    <w:p>
+      <w:pPr>
+        <w:rPr>
+          <w:rFonts w:eastAsiaTheme="minorEastAsia"/>
+        </w:rPr>
+      </w:pPr>
+    </w:p>
+    <w:p>
+      <w:pPr>
+        <w:rPr>
+          <w:rFonts w:eastAsiaTheme="minorEastAsia" w:hint="eastAsia"/>
+        </w:rPr>
+      </w:pPr>
+      <w:r>
+        <w:rPr>
+          <w:rFonts w:eastAsiaTheme="minorEastAsia"/>
+        </w:rPr>
+        <w:t>Invade at time t = 100, H = H+5</w:t>
+      </w:r>
+    </w:p>
+    <w:p>
+      <w:pPr>
+        <w:rPr>
+          <w:rFonts w:eastAsiaTheme="minorEastAsia"/>
+        </w:rPr>
+      </w:pPr>
+      <w:r>
+        <w:rPr>
+          <w:rFonts w:eastAsiaTheme="minorEastAsia" w:hint="eastAsia"/>
+          <w:noProof/>
+        </w:rPr>
+        <w:drawing>
+          <wp:inline distT="0" distB="0" distL="0" distR="0">
+            <wp:extent cx="2094734" cy="1440000"/>
+            <wp:effectExtent l="0" t="0" r="1270" b="8255"/>
+            <wp:docPr id="57" name="圖片 57"/>
+            <wp:cNvGraphicFramePr>
+              <a:graphicFrameLocks xmlns:a="http://schemas.openxmlformats.org/drawingml/2006/main" noChangeAspect="1"/>
+            </wp:cNvGraphicFramePr>
+            <a:graphic xmlns:a="http://schemas.openxmlformats.org/drawingml/2006/main">
+              <a:graphicData uri="http://schemas.openxmlformats.org/drawingml/2006/picture">
+                <pic:pic xmlns:pic="http://schemas.openxmlformats.org/drawingml/2006/picture">
+                  <pic:nvPicPr>
+                    <pic:cNvPr id="57" name="ASS time series ini_High_H parms_E1H_E2H Int100.png"/>
+                    <pic:cNvPicPr/>
+                  </pic:nvPicPr>
+                  <pic:blipFill>
+                    <a:blip r:embed="rId40" cstate="print">
+                      <a:extLst>
+                        <a:ext uri="{28A0092B-C50C-407E-A947-70E740481C1C}">
+                          <a14:useLocalDpi xmlns:a14="http://schemas.microsoft.com/office/drawing/2010/main" val="0"/>
+                        </a:ext>
+                      </a:extLst>
+                    </a:blip>
+                    <a:stretch>
+                      <a:fillRect/>
+                    </a:stretch>
+                  </pic:blipFill>
+                  <pic:spPr>
+                    <a:xfrm>
+                      <a:off x="0" y="0"/>
+                      <a:ext cx="2094734" cy="1440000"/>
+                    </a:xfrm>
+                    <a:prstGeom prst="rect">
+                      <a:avLst/>
+                    </a:prstGeom>
+                  </pic:spPr>
+                </pic:pic>
+              </a:graphicData>
+            </a:graphic>
+          </wp:inline>
+        </w:drawing>
+      </w:r>
+    </w:p>
+    <w:p>
+      <w:pPr>
+        <w:rPr>
+          <w:rFonts w:eastAsiaTheme="minorEastAsia"/>
+        </w:rPr>
+      </w:pPr>
+      <w:r>
+        <w:rPr>
+          <w:rFonts w:eastAsiaTheme="minorEastAsia"/>
+        </w:rPr>
+        <w:t>The addition of H alters the final fate of the competition outcome (from E1H to E2H).</w:t>
+      </w:r>
+    </w:p>
+    <w:p>
+      <w:pPr>
+        <w:rPr>
+          <w:rFonts w:eastAsiaTheme="minorEastAsia"/>
+        </w:rPr>
+      </w:pPr>
+    </w:p>
+    <w:p>
+      <w:pPr>
+        <w:rPr>
+          <w:rFonts w:eastAsiaTheme="minorEastAsia" w:hint="eastAsia"/>
+        </w:rPr>
+      </w:pPr>
+    </w:p>
+    <w:p>
+      <w:pPr>
+        <w:rPr>
+          <w:rFonts w:eastAsiaTheme="minorEastAsia" w:hint="eastAsia"/>
+        </w:rPr>
+      </w:pPr>
+      <w:r>
+        <w:rPr>
+          <w:rFonts w:eastAsiaTheme="minorEastAsia"/>
+        </w:rPr>
+        <w:t>Invade at time t = 2000, H = H+5</w:t>
+      </w:r>
+    </w:p>
+    <w:p>
+      <w:pPr>
+        <w:rPr>
+          <w:rFonts w:eastAsiaTheme="minorEastAsia"/>
+        </w:rPr>
+      </w:pPr>
+      <w:r>
+        <w:rPr>
+          <w:rFonts w:eastAsiaTheme="minorEastAsia"/>
+          <w:noProof/>
+        </w:rPr>
+        <w:drawing>
+          <wp:inline distT="0" distB="0" distL="0" distR="0">
+            <wp:extent cx="2094734" cy="1440000"/>
+            <wp:effectExtent l="0" t="0" r="1270" b="8255"/>
+            <wp:docPr id="58" name="圖片 58"/>
+            <wp:cNvGraphicFramePr>
+              <a:graphicFrameLocks xmlns:a="http://schemas.openxmlformats.org/drawingml/2006/main" noChangeAspect="1"/>
+            </wp:cNvGraphicFramePr>
+            <a:graphic xmlns:a="http://schemas.openxmlformats.org/drawingml/2006/main">
+              <a:graphicData uri="http://schemas.openxmlformats.org/drawingml/2006/picture">
+                <pic:pic xmlns:pic="http://schemas.openxmlformats.org/drawingml/2006/picture">
+                  <pic:nvPicPr>
+                    <pic:cNvPr id="58" name="ASS time series ini_High_H parms_E1H_E2H Int2000.png"/>
+                    <pic:cNvPicPr/>
+                  </pic:nvPicPr>
+                  <pic:blipFill>
+                    <a:blip r:embed="rId41" cstate="print">
+                      <a:extLst>
+                        <a:ext uri="{28A0092B-C50C-407E-A947-70E740481C1C}">
+                          <a14:useLocalDpi xmlns:a14="http://schemas.microsoft.com/office/drawing/2010/main" val="0"/>
+                        </a:ext>
+                      </a:extLst>
+                    </a:blip>
+                    <a:stretch>
+                      <a:fillRect/>
+                    </a:stretch>
+                  </pic:blipFill>
+                  <pic:spPr>
+                    <a:xfrm>
+                      <a:off x="0" y="0"/>
+                      <a:ext cx="2094734" cy="1440000"/>
+                    </a:xfrm>
+                    <a:prstGeom prst="rect">
+                      <a:avLst/>
+                    </a:prstGeom>
+                  </pic:spPr>
+                </pic:pic>
+              </a:graphicData>
+            </a:graphic>
+          </wp:inline>
+        </w:drawing>
+      </w:r>
+    </w:p>
+    <w:p>
+      <w:pPr>
+        <w:rPr>
+          <w:rFonts w:eastAsiaTheme="minorEastAsia" w:hint="eastAsia"/>
+        </w:rPr>
+      </w:pPr>
+      <w:r>
+        <w:rPr>
+          <w:rFonts w:eastAsiaTheme="minorEastAsia" w:hint="eastAsia"/>
+        </w:rPr>
+        <w:t>T</w:t>
+      </w:r>
+      <w:r>
+        <w:rPr>
+          <w:rFonts w:eastAsiaTheme="minorEastAsia"/>
+        </w:rPr>
+        <w:t>he disturbance doesn’t change the competition outcome (remains E1H).</w:t>
+      </w:r>
+    </w:p>
+    <w:p>
+      <w:pPr>
+        <w:pBdr>
+          <w:bottom w:val="single" w:sz="6" w:space="1" w:color="auto"/>
+        </w:pBdr>
+        <w:rPr>
+          <w:rFonts w:eastAsiaTheme="minorEastAsia" w:hint="eastAsia"/>
+        </w:rPr>
+      </w:pPr>
+    </w:p>
+    <w:p>
+      <w:pPr>
+        <w:rPr>
+          <w:rFonts w:eastAsiaTheme="minorEastAsia"/>
+        </w:rPr>
+      </w:pPr>
+      <w:r>
+        <w:rPr>
+          <w:rFonts w:eastAsiaTheme="minorEastAsia"/>
+        </w:rPr>
+        <w:t>At parameter sets that lead to E2H, i.e., low initial H.</w:t>
+      </w:r>
+    </w:p>
+    <w:p>
+      <w:pPr>
+        <w:rPr>
+          <w:rFonts w:eastAsiaTheme="minorEastAsia" w:hint="eastAsia"/>
+        </w:rPr>
+      </w:pPr>
+    </w:p>
+    <w:p>
+      <w:pPr>
+        <w:rPr>
+          <w:rFonts w:eastAsiaTheme="minorEastAsia" w:hint="eastAsia"/>
+        </w:rPr>
+      </w:pPr>
+      <w:r>
+        <w:rPr>
+          <w:rFonts w:eastAsiaTheme="minorEastAsia"/>
+        </w:rPr>
+        <w:t>Invade at time t = 100, H = H+5</w:t>
+      </w:r>
+    </w:p>
+    <w:p>
+      <w:pPr>
+        <w:rPr>
+          <w:rFonts w:eastAsiaTheme="minorEastAsia"/>
+        </w:rPr>
+      </w:pPr>
+      <w:r>
+        <w:rPr>
+          <w:rFonts w:eastAsiaTheme="minorEastAsia"/>
+          <w:noProof/>
+        </w:rPr>
+        <w:drawing>
+          <wp:inline distT="0" distB="0" distL="0" distR="0">
+            <wp:extent cx="2094734" cy="1440000"/>
+            <wp:effectExtent l="0" t="0" r="1270" b="8255"/>
+            <wp:docPr id="60" name="圖片 60"/>
+            <wp:cNvGraphicFramePr>
+              <a:graphicFrameLocks xmlns:a="http://schemas.openxmlformats.org/drawingml/2006/main" noChangeAspect="1"/>
+            </wp:cNvGraphicFramePr>
+            <a:graphic xmlns:a="http://schemas.openxmlformats.org/drawingml/2006/main">
+              <a:graphicData uri="http://schemas.openxmlformats.org/drawingml/2006/picture">
+                <pic:pic xmlns:pic="http://schemas.openxmlformats.org/drawingml/2006/picture">
+                  <pic:nvPicPr>
+                    <pic:cNvPr id="60" name="ASS time series ini_Low_H parms_E1H_E2H Int100.png"/>
+                    <pic:cNvPicPr/>
+                  </pic:nvPicPr>
+                  <pic:blipFill>
+                    <a:blip r:embed="rId42" cstate="print">
+                      <a:extLst>
+                        <a:ext uri="{28A0092B-C50C-407E-A947-70E740481C1C}">
+                          <a14:useLocalDpi xmlns:a14="http://schemas.microsoft.com/office/drawing/2010/main" val="0"/>
+                        </a:ext>
+                      </a:extLst>
+                    </a:blip>
+                    <a:stretch>
+                      <a:fillRect/>
+                    </a:stretch>
+                  </pic:blipFill>
+                  <pic:spPr>
+                    <a:xfrm>
+                      <a:off x="0" y="0"/>
+                      <a:ext cx="2094734" cy="1440000"/>
+                    </a:xfrm>
+                    <a:prstGeom prst="rect">
+                      <a:avLst/>
+                    </a:prstGeom>
+                  </pic:spPr>
+                </pic:pic>
+              </a:graphicData>
+            </a:graphic>
+          </wp:inline>
+        </w:drawing>
+      </w:r>
+    </w:p>
+    <w:p>
+      <w:pPr>
+        <w:rPr>
+          <w:rFonts w:eastAsiaTheme="minorEastAsia"/>
+        </w:rPr>
+      </w:pPr>
+      <w:r>
+        <w:rPr>
+          <w:rFonts w:eastAsiaTheme="minorEastAsia"/>
+        </w:rPr>
+        <w:t>The addition of H alters the final fate of the competition outcome (from E2H to E1H).</w:t>
+      </w:r>
+    </w:p>
+    <w:p>
+      <w:pPr>
+        <w:rPr>
+          <w:rFonts w:eastAsiaTheme="minorEastAsia"/>
+        </w:rPr>
+      </w:pPr>
+    </w:p>
+    <w:p>
+      <w:pPr>
+        <w:rPr>
+          <w:rFonts w:eastAsiaTheme="minorEastAsia" w:hint="eastAsia"/>
+        </w:rPr>
+      </w:pPr>
+    </w:p>
+    <w:p>
+      <w:pPr>
+        <w:rPr>
+          <w:rFonts w:eastAsiaTheme="minorEastAsia" w:hint="eastAsia"/>
+        </w:rPr>
+      </w:pPr>
+      <w:r>
+        <w:rPr>
+          <w:rFonts w:eastAsiaTheme="minorEastAsia"/>
+        </w:rPr>
+        <w:t>Invade at time t = 2000, H = H+5</w:t>
+      </w:r>
+    </w:p>
+    <w:p>
+      <w:pPr>
+        <w:rPr>
+          <w:rFonts w:eastAsiaTheme="minorEastAsia"/>
+        </w:rPr>
+      </w:pPr>
+      <w:r>
+        <w:rPr>
+          <w:rFonts w:eastAsiaTheme="minorEastAsia" w:hint="eastAsia"/>
+          <w:noProof/>
+        </w:rPr>
+        <w:drawing>
+          <wp:inline distT="0" distB="0" distL="0" distR="0">
+            <wp:extent cx="2094734" cy="1440000"/>
+            <wp:effectExtent l="0" t="0" r="1270" b="8255"/>
+            <wp:docPr id="61" name="圖片 61"/>
+            <wp:cNvGraphicFramePr>
+              <a:graphicFrameLocks xmlns:a="http://schemas.openxmlformats.org/drawingml/2006/main" noChangeAspect="1"/>
+            </wp:cNvGraphicFramePr>
+            <a:graphic xmlns:a="http://schemas.openxmlformats.org/drawingml/2006/main">
+              <a:graphicData uri="http://schemas.openxmlformats.org/drawingml/2006/picture">
+                <pic:pic xmlns:pic="http://schemas.openxmlformats.org/drawingml/2006/picture">
+                  <pic:nvPicPr>
+                    <pic:cNvPr id="61" name="ASS time series ini_Low_H parms_E1H_E2H Int2000.png"/>
+                    <pic:cNvPicPr/>
+                  </pic:nvPicPr>
+                  <pic:blipFill>
+                    <a:blip r:embed="rId43" cstate="print">
+                      <a:extLst>
+                        <a:ext uri="{28A0092B-C50C-407E-A947-70E740481C1C}">
+                          <a14:useLocalDpi xmlns:a14="http://schemas.microsoft.com/office/drawing/2010/main" val="0"/>
+                        </a:ext>
+                      </a:extLst>
+                    </a:blip>
+                    <a:stretch>
+                      <a:fillRect/>
+                    </a:stretch>
+                  </pic:blipFill>
+                  <pic:spPr>
+                    <a:xfrm>
+                      <a:off x="0" y="0"/>
+                      <a:ext cx="2094734" cy="1440000"/>
+                    </a:xfrm>
+                    <a:prstGeom prst="rect">
+                      <a:avLst/>
+                    </a:prstGeom>
+                  </pic:spPr>
+                </pic:pic>
+              </a:graphicData>
+            </a:graphic>
+          </wp:inline>
+        </w:drawing>
+      </w:r>
+    </w:p>
+    <w:p>
+      <w:pPr>
+        <w:rPr>
+          <w:rFonts w:eastAsiaTheme="minorEastAsia" w:hint="eastAsia"/>
+        </w:rPr>
+      </w:pPr>
+      <w:r>
+        <w:rPr>
+          <w:rFonts w:eastAsiaTheme="minorEastAsia" w:hint="eastAsia"/>
+        </w:rPr>
+        <w:t>T</w:t>
+      </w:r>
+      <w:r>
+        <w:rPr>
+          <w:rFonts w:eastAsiaTheme="minorEastAsia"/>
+        </w:rPr>
+        <w:t>he disturbance doesn’t change the competition outcome (remains E2H).</w:t>
+      </w:r>
+    </w:p>
+    <w:p>
+      <w:pPr>
+        <w:rPr>
+          <w:rFonts w:eastAsiaTheme="minorEastAsia" w:hint="eastAsia"/>
+        </w:rPr>
+      </w:pPr>
+    </w:p>
+    <w:p>
+      <w:pPr>
+        <w:rPr>
+          <w:rFonts w:eastAsiaTheme="minorEastAsia"/>
+        </w:rPr>
+      </w:pPr>
+      <w:r>
+        <w:rPr>
+          <w:rFonts w:eastAsiaTheme="minorEastAsia" w:hint="eastAsia"/>
+        </w:rPr>
+        <w:t>C</w:t>
+      </w:r>
+      <w:r>
+        <w:rPr>
+          <w:rFonts w:eastAsiaTheme="minorEastAsia"/>
+        </w:rPr>
+        <w:t xml:space="preserve">onclusion: </w:t>
+      </w:r>
+    </w:p>
+    <w:p>
+      <w:pPr>
+        <w:rPr>
+          <w:rFonts w:eastAsiaTheme="minorEastAsia"/>
+        </w:rPr>
+      </w:pPr>
+      <w:r>
+        <w:rPr>
+          <w:rFonts w:eastAsiaTheme="minorEastAsia" w:hint="eastAsia"/>
+        </w:rPr>
+        <w:t>T</w:t>
+      </w:r>
+      <w:r>
+        <w:rPr>
+          <w:rFonts w:eastAsiaTheme="minorEastAsia"/>
+        </w:rPr>
+        <w:t>he time of invasion matters!</w:t>
+      </w:r>
+      <w:bookmarkStart w:id="0" w:name="_GoBack"/>
+      <w:bookmarkEnd w:id="0"/>
+    </w:p>
+    <w:p>
+      <w:pPr>
+        <w:rPr>
+          <w:rFonts w:hint="eastAsia"/>
+        </w:rPr>
+      </w:pPr>
+      <w:r>
+        <w:rPr>
+          <w:rFonts w:hint="eastAsia"/>
+        </w:rPr>
+        <w:t>因為系統初期族群變動大，所以越早施用生物</w:t>
+      </w:r>
+      <w:proofErr w:type="gramStart"/>
+      <w:r>
+        <w:rPr>
+          <w:rFonts w:hint="eastAsia"/>
+        </w:rPr>
+        <w:t>製劑越有效</w:t>
+      </w:r>
+      <w:proofErr w:type="gramEnd"/>
+      <w:r>
+        <w:rPr>
+          <w:rFonts w:hint="eastAsia"/>
+        </w:rPr>
+        <w:t xml:space="preserve">? </w:t>
+      </w:r>
+      <w:r>
+        <w:rPr>
+          <w:rFonts w:hint="eastAsia"/>
+        </w:rPr>
+        <w:t>這也解釋了為什麼在實務管理上，無關乎生物製劑誘導植物抗病反應的機制，生物製劑總是越早施用效果越佳。</w:t>
+      </w:r>
+    </w:p>
+    <w:p>
+      <w:pPr>
+        <w:rPr>
+          <w:rFonts w:eastAsiaTheme="minorEastAsia" w:hint="eastAsia"/>
+        </w:rPr>
+      </w:pPr>
+    </w:p>
+    <w:p>
+      <w:pPr>
+        <w:rPr>
+          <w:rFonts w:eastAsiaTheme="minorEastAsia" w:hint="eastAsia"/>
+        </w:rPr>
+      </w:pPr>
+    </w:p>
     <w:p>
       <w:pPr>
         <w:widowControl/>
@@ -6056,7 +7569,7 @@
                     </pic:cNvPicPr>
                   </pic:nvPicPr>
                   <pic:blipFill>
-                    <a:blip r:embed="rId34">
+                    <a:blip r:embed="rId44">
                       <a:extLst>
                         <a:ext uri="{28A0092B-C50C-407E-A947-70E740481C1C}">
                           <a14:useLocalDpi xmlns:a14="http://schemas.microsoft.com/office/drawing/2010/main" val="0"/>
@@ -6620,7 +8133,7 @@
                     </pic:cNvPicPr>
                   </pic:nvPicPr>
                   <pic:blipFill>
-                    <a:blip r:embed="rId35" cstate="print">
+                    <a:blip r:embed="rId45" cstate="print">
                       <a:extLst>
                         <a:ext uri="{28A0092B-C50C-407E-A947-70E740481C1C}">
                           <a14:useLocalDpi xmlns:a14="http://schemas.microsoft.com/office/drawing/2010/main" val="0"/>
@@ -6671,7 +8184,7 @@
                     </pic:cNvPicPr>
                   </pic:nvPicPr>
                   <pic:blipFill>
-                    <a:blip r:embed="rId36" cstate="print">
+                    <a:blip r:embed="rId46" cstate="print">
                       <a:extLst>
                         <a:ext uri="{28A0092B-C50C-407E-A947-70E740481C1C}">
                           <a14:useLocalDpi xmlns:a14="http://schemas.microsoft.com/office/drawing/2010/main" val="0"/>
@@ -6722,7 +8235,7 @@
                     </pic:cNvPicPr>
                   </pic:nvPicPr>
                   <pic:blipFill>
-                    <a:blip r:embed="rId37" cstate="print">
+                    <a:blip r:embed="rId47" cstate="print">
                       <a:extLst>
                         <a:ext uri="{28A0092B-C50C-407E-A947-70E740481C1C}">
                           <a14:useLocalDpi xmlns:a14="http://schemas.microsoft.com/office/drawing/2010/main" val="0"/>
@@ -6773,7 +8286,7 @@
                     </pic:cNvPicPr>
                   </pic:nvPicPr>
                   <pic:blipFill>
-                    <a:blip r:embed="rId38">
+                    <a:blip r:embed="rId48">
                       <a:extLst>
                         <a:ext uri="{28A0092B-C50C-407E-A947-70E740481C1C}">
                           <a14:useLocalDpi xmlns:a14="http://schemas.microsoft.com/office/drawing/2010/main" val="0"/>
@@ -6832,7 +8345,7 @@
                     </pic:cNvPicPr>
                   </pic:nvPicPr>
                   <pic:blipFill>
-                    <a:blip r:embed="rId38" cstate="print">
+                    <a:blip r:embed="rId48" cstate="print">
                       <a:extLst>
                         <a:ext uri="{28A0092B-C50C-407E-A947-70E740481C1C}">
                           <a14:useLocalDpi xmlns:a14="http://schemas.microsoft.com/office/drawing/2010/main" val="0"/>
@@ -7137,7 +8650,7 @@
                     </pic:cNvPicPr>
                   </pic:nvPicPr>
                   <pic:blipFill>
-                    <a:blip r:embed="rId39" cstate="print">
+                    <a:blip r:embed="rId49" cstate="print">
                       <a:extLst>
                         <a:ext uri="{28A0092B-C50C-407E-A947-70E740481C1C}">
                           <a14:useLocalDpi xmlns:a14="http://schemas.microsoft.com/office/drawing/2010/main" val="0"/>
@@ -7649,7 +9162,7 @@
   <w:style w:type="paragraph" w:default="1" w:styleId="a">
     <w:name w:val="Normal"/>
     <w:qFormat/>
-    <w:rsid w:val="008F3FA0"/>
+    <w:rsid w:val="00D41935"/>
     <w:pPr>
       <w:widowControl w:val="0"/>
     </w:pPr>

</xml_diff>